<commit_message>
minor changes to resistor color code table
</commit_message>
<xml_diff>
--- a/StudentGuideModule2/appendices/resistor_code/resistor_table.docx
+++ b/StudentGuideModule2/appendices/resistor_code/resistor_table.docx
@@ -1,6 +1,6 @@
 
 <file path=word/document.xml><?xml version="1.0" encoding="utf-8"?>
-<w:document xmlns:wpc="http://schemas.microsoft.com/office/word/2010/wordprocessingCanvas" xmlns:cx="http://schemas.microsoft.com/office/drawing/2014/chartex" xmlns:cx1="http://schemas.microsoft.com/office/drawing/2015/9/8/chartex" xmlns:mc="http://schemas.openxmlformats.org/markup-compatibility/2006" xmlns:o="urn:schemas-microsoft-com:office:office" xmlns:r="http://schemas.openxmlformats.org/officeDocument/2006/relationships" xmlns:m="http://schemas.openxmlformats.org/officeDocument/2006/math" xmlns:v="urn:schemas-microsoft-com:vml" xmlns:wp14="http://schemas.microsoft.com/office/word/2010/wordprocessingDrawing" xmlns:wp="http://schemas.openxmlformats.org/drawingml/2006/wordprocessingDrawing" xmlns:w10="urn:schemas-microsoft-com:office:word" xmlns:w="http://schemas.openxmlformats.org/wordprocessingml/2006/main" xmlns:w14="http://schemas.microsoft.com/office/word/2010/wordml" xmlns:w15="http://schemas.microsoft.com/office/word/2012/wordml" xmlns:w16se="http://schemas.microsoft.com/office/word/2015/wordml/symex" xmlns:wpg="http://schemas.microsoft.com/office/word/2010/wordprocessingGroup" xmlns:wpi="http://schemas.microsoft.com/office/word/2010/wordprocessingInk" xmlns:wne="http://schemas.microsoft.com/office/word/2006/wordml" xmlns:wps="http://schemas.microsoft.com/office/word/2010/wordprocessingShape" mc:Ignorable="w14 w15 w16se wp14">
+<w:document xmlns:wpc="http://schemas.microsoft.com/office/word/2010/wordprocessingCanvas" xmlns:cx="http://schemas.microsoft.com/office/drawing/2014/chartex" xmlns:cx1="http://schemas.microsoft.com/office/drawing/2015/9/8/chartex" xmlns:cx2="http://schemas.microsoft.com/office/drawing/2015/10/21/chartex" xmlns:cx3="http://schemas.microsoft.com/office/drawing/2016/5/9/chartex" xmlns:cx4="http://schemas.microsoft.com/office/drawing/2016/5/10/chartex" xmlns:cx5="http://schemas.microsoft.com/office/drawing/2016/5/11/chartex" xmlns:cx6="http://schemas.microsoft.com/office/drawing/2016/5/12/chartex" xmlns:cx7="http://schemas.microsoft.com/office/drawing/2016/5/13/chartex" xmlns:cx8="http://schemas.microsoft.com/office/drawing/2016/5/14/chartex" xmlns:mc="http://schemas.openxmlformats.org/markup-compatibility/2006" xmlns:aink="http://schemas.microsoft.com/office/drawing/2016/ink" xmlns:am3d="http://schemas.microsoft.com/office/drawing/2017/model3d" xmlns:o="urn:schemas-microsoft-com:office:office" xmlns:oel="http://schemas.microsoft.com/office/2019/extlst" xmlns:r="http://schemas.openxmlformats.org/officeDocument/2006/relationships" xmlns:m="http://schemas.openxmlformats.org/officeDocument/2006/math" xmlns:v="urn:schemas-microsoft-com:vml" xmlns:wp14="http://schemas.microsoft.com/office/word/2010/wordprocessingDrawing" xmlns:wp="http://schemas.openxmlformats.org/drawingml/2006/wordprocessingDrawing" xmlns:w10="urn:schemas-microsoft-com:office:word" xmlns:w="http://schemas.openxmlformats.org/wordprocessingml/2006/main" xmlns:w14="http://schemas.microsoft.com/office/word/2010/wordml" xmlns:w15="http://schemas.microsoft.com/office/word/2012/wordml" xmlns:w16cex="http://schemas.microsoft.com/office/word/2018/wordml/cex" xmlns:w16cid="http://schemas.microsoft.com/office/word/2016/wordml/cid" xmlns:w16="http://schemas.microsoft.com/office/word/2018/wordml" xmlns:w16du="http://schemas.microsoft.com/office/word/2023/wordml/word16du" xmlns:w16sdtdh="http://schemas.microsoft.com/office/word/2020/wordml/sdtdatahash" xmlns:w16sdtfl="http://schemas.microsoft.com/office/word/2024/wordml/sdtformatlock" xmlns:w16se="http://schemas.microsoft.com/office/word/2015/wordml/symex" xmlns:wpg="http://schemas.microsoft.com/office/word/2010/wordprocessingGroup" xmlns:wpi="http://schemas.microsoft.com/office/word/2010/wordprocessingInk" xmlns:wne="http://schemas.microsoft.com/office/word/2006/wordml" xmlns:wps="http://schemas.microsoft.com/office/word/2010/wordprocessingShape" mc:Ignorable="w14 w15 w16se w16cid w16 w16cex w16sdtdh w16sdtfl w16du wp14">
   <w:body>
     <w:p>
       <w:pPr>
@@ -226,7 +226,7 @@
     <w:tbl>
       <w:tblPr>
         <w:tblStyle w:val="TableGrid"/>
-        <w:tblpPr w:leftFromText="187" w:rightFromText="187" w:vertAnchor="text" w:horzAnchor="margin" w:tblpXSpec="center" w:tblpY="1"/>
+        <w:tblpPr w:leftFromText="187" w:rightFromText="187" w:vertAnchor="text" w:tblpX="1254" w:tblpY="1"/>
         <w:tblOverlap w:val="never"/>
         <w:tblW w:w="0" w:type="auto"/>
         <w:tblLook w:val="04A0" w:firstRow="1" w:lastRow="0" w:firstColumn="1" w:lastColumn="0" w:noHBand="0" w:noVBand="1"/>
@@ -236,9 +236,9 @@
         <w:gridCol w:w="810"/>
         <w:gridCol w:w="810"/>
         <w:gridCol w:w="816"/>
-        <w:gridCol w:w="984"/>
-        <w:gridCol w:w="810"/>
-        <w:gridCol w:w="1350"/>
+        <w:gridCol w:w="893"/>
+        <w:gridCol w:w="648"/>
+        <w:gridCol w:w="1445"/>
       </w:tblGrid>
       <w:tr>
         <w:tc>
@@ -298,7 +298,7 @@
         </w:tc>
         <w:tc>
           <w:tcPr>
-            <w:tcW w:w="1794" w:type="dxa"/>
+            <w:tcW w:w="1541" w:type="dxa"/>
             <w:gridSpan w:val="2"/>
           </w:tcPr>
           <w:p>
@@ -326,7 +326,7 @@
         </w:tc>
         <w:tc>
           <w:tcPr>
-            <w:tcW w:w="1350" w:type="dxa"/>
+            <w:tcW w:w="1445" w:type="dxa"/>
           </w:tcPr>
           <w:p>
             <w:pPr>
@@ -465,7 +465,7 @@
         </w:tc>
         <w:tc>
           <w:tcPr>
-            <w:tcW w:w="984" w:type="dxa"/>
+            <w:tcW w:w="893" w:type="dxa"/>
             <w:tcBorders>
               <w:bottom w:val="single" w:sz="4" w:space="0" w:color="auto"/>
               <w:right w:val="nil"/>
@@ -505,7 +505,7 @@
         </w:tc>
         <w:tc>
           <w:tcPr>
-            <w:tcW w:w="810" w:type="dxa"/>
+            <w:tcW w:w="648" w:type="dxa"/>
             <w:tcBorders>
               <w:left w:val="nil"/>
               <w:bottom w:val="single" w:sz="4" w:space="0" w:color="auto"/>
@@ -554,7 +554,7 @@
         </w:tc>
         <w:tc>
           <w:tcPr>
-            <w:tcW w:w="1350" w:type="dxa"/>
+            <w:tcW w:w="1445" w:type="dxa"/>
             <w:tcBorders>
               <w:left w:val="nil"/>
               <w:bottom w:val="single" w:sz="4" w:space="0" w:color="auto"/>
@@ -678,7 +678,7 @@
         </w:tc>
         <w:tc>
           <w:tcPr>
-            <w:tcW w:w="984" w:type="dxa"/>
+            <w:tcW w:w="893" w:type="dxa"/>
             <w:tcBorders>
               <w:bottom w:val="double" w:sz="4" w:space="0" w:color="auto"/>
               <w:right w:val="nil"/>
@@ -718,7 +718,7 @@
         </w:tc>
         <w:tc>
           <w:tcPr>
-            <w:tcW w:w="810" w:type="dxa"/>
+            <w:tcW w:w="648" w:type="dxa"/>
             <w:tcBorders>
               <w:left w:val="nil"/>
               <w:bottom w:val="double" w:sz="4" w:space="0" w:color="auto"/>
@@ -767,7 +767,7 @@
         </w:tc>
         <w:tc>
           <w:tcPr>
-            <w:tcW w:w="1350" w:type="dxa"/>
+            <w:tcW w:w="1445" w:type="dxa"/>
             <w:tcBorders>
               <w:left w:val="nil"/>
               <w:bottom w:val="double" w:sz="4" w:space="0" w:color="auto"/>
@@ -918,7 +918,7 @@
         </w:tc>
         <w:tc>
           <w:tcPr>
-            <w:tcW w:w="984" w:type="dxa"/>
+            <w:tcW w:w="893" w:type="dxa"/>
             <w:tcBorders>
               <w:top w:val="double" w:sz="4" w:space="0" w:color="auto"/>
               <w:right w:val="nil"/>
@@ -958,7 +958,7 @@
         </w:tc>
         <w:tc>
           <w:tcPr>
-            <w:tcW w:w="810" w:type="dxa"/>
+            <w:tcW w:w="648" w:type="dxa"/>
             <w:tcBorders>
               <w:top w:val="double" w:sz="4" w:space="0" w:color="auto"/>
               <w:left w:val="nil"/>
@@ -1007,7 +1007,7 @@
         </w:tc>
         <w:tc>
           <w:tcPr>
-            <w:tcW w:w="1350" w:type="dxa"/>
+            <w:tcW w:w="1445" w:type="dxa"/>
             <w:tcBorders>
               <w:top w:val="double" w:sz="4" w:space="0" w:color="auto"/>
               <w:left w:val="nil"/>
@@ -1137,7 +1137,7 @@
         </w:tc>
         <w:tc>
           <w:tcPr>
-            <w:tcW w:w="984" w:type="dxa"/>
+            <w:tcW w:w="893" w:type="dxa"/>
             <w:tcBorders>
               <w:right w:val="nil"/>
             </w:tcBorders>
@@ -1176,7 +1176,7 @@
         </w:tc>
         <w:tc>
           <w:tcPr>
-            <w:tcW w:w="810" w:type="dxa"/>
+            <w:tcW w:w="648" w:type="dxa"/>
             <w:tcBorders>
               <w:left w:val="nil"/>
             </w:tcBorders>
@@ -1224,7 +1224,7 @@
         </w:tc>
         <w:tc>
           <w:tcPr>
-            <w:tcW w:w="1350" w:type="dxa"/>
+            <w:tcW w:w="1445" w:type="dxa"/>
             <w:tcBorders>
               <w:left w:val="nil"/>
             </w:tcBorders>
@@ -1362,7 +1362,7 @@
         </w:tc>
         <w:tc>
           <w:tcPr>
-            <w:tcW w:w="984" w:type="dxa"/>
+            <w:tcW w:w="893" w:type="dxa"/>
             <w:tcBorders>
               <w:right w:val="nil"/>
             </w:tcBorders>
@@ -1401,7 +1401,7 @@
         </w:tc>
         <w:tc>
           <w:tcPr>
-            <w:tcW w:w="810" w:type="dxa"/>
+            <w:tcW w:w="648" w:type="dxa"/>
             <w:tcBorders>
               <w:left w:val="nil"/>
             </w:tcBorders>
@@ -1449,7 +1449,7 @@
         </w:tc>
         <w:tc>
           <w:tcPr>
-            <w:tcW w:w="1350" w:type="dxa"/>
+            <w:tcW w:w="1445" w:type="dxa"/>
             <w:tcBorders>
               <w:left w:val="nil"/>
             </w:tcBorders>
@@ -1587,7 +1587,7 @@
         </w:tc>
         <w:tc>
           <w:tcPr>
-            <w:tcW w:w="984" w:type="dxa"/>
+            <w:tcW w:w="893" w:type="dxa"/>
             <w:tcBorders>
               <w:right w:val="nil"/>
             </w:tcBorders>
@@ -1626,7 +1626,7 @@
         </w:tc>
         <w:tc>
           <w:tcPr>
-            <w:tcW w:w="810" w:type="dxa"/>
+            <w:tcW w:w="648" w:type="dxa"/>
             <w:tcBorders>
               <w:left w:val="nil"/>
             </w:tcBorders>
@@ -1674,7 +1674,7 @@
         </w:tc>
         <w:tc>
           <w:tcPr>
-            <w:tcW w:w="1350" w:type="dxa"/>
+            <w:tcW w:w="1445" w:type="dxa"/>
             <w:tcBorders>
               <w:left w:val="nil"/>
             </w:tcBorders>
@@ -1712,7 +1712,6 @@
                 <w:szCs w:val="24"/>
               </w:rPr>
             </w:pPr>
-            <w:bookmarkStart w:id="0" w:name="_GoBack" w:colFirst="0" w:colLast="6"/>
             <w:r>
               <w:rPr>
                 <w:rFonts w:cstheme="minorHAnsi"/>
@@ -1804,7 +1803,7 @@
         </w:tc>
         <w:tc>
           <w:tcPr>
-            <w:tcW w:w="984" w:type="dxa"/>
+            <w:tcW w:w="893" w:type="dxa"/>
             <w:tcBorders>
               <w:right w:val="nil"/>
             </w:tcBorders>
@@ -1843,7 +1842,7 @@
         </w:tc>
         <w:tc>
           <w:tcPr>
-            <w:tcW w:w="810" w:type="dxa"/>
+            <w:tcW w:w="648" w:type="dxa"/>
             <w:tcBorders>
               <w:left w:val="nil"/>
             </w:tcBorders>
@@ -1891,7 +1890,7 @@
         </w:tc>
         <w:tc>
           <w:tcPr>
-            <w:tcW w:w="1350" w:type="dxa"/>
+            <w:tcW w:w="1445" w:type="dxa"/>
             <w:tcBorders>
               <w:left w:val="nil"/>
             </w:tcBorders>
@@ -1913,7 +1912,6 @@
           </w:p>
         </w:tc>
       </w:tr>
-      <w:bookmarkEnd w:id="0"/>
       <w:tr>
         <w:tc>
           <w:tcPr>
@@ -2021,7 +2019,7 @@
         </w:tc>
         <w:tc>
           <w:tcPr>
-            <w:tcW w:w="984" w:type="dxa"/>
+            <w:tcW w:w="893" w:type="dxa"/>
             <w:tcBorders>
               <w:right w:val="nil"/>
             </w:tcBorders>
@@ -2060,7 +2058,7 @@
         </w:tc>
         <w:tc>
           <w:tcPr>
-            <w:tcW w:w="810" w:type="dxa"/>
+            <w:tcW w:w="648" w:type="dxa"/>
             <w:tcBorders>
               <w:left w:val="nil"/>
             </w:tcBorders>
@@ -2108,7 +2106,7 @@
         </w:tc>
         <w:tc>
           <w:tcPr>
-            <w:tcW w:w="1350" w:type="dxa"/>
+            <w:tcW w:w="1445" w:type="dxa"/>
             <w:tcBorders>
               <w:left w:val="nil"/>
             </w:tcBorders>
@@ -2246,7 +2244,7 @@
         </w:tc>
         <w:tc>
           <w:tcPr>
-            <w:tcW w:w="984" w:type="dxa"/>
+            <w:tcW w:w="893" w:type="dxa"/>
             <w:tcBorders>
               <w:right w:val="nil"/>
             </w:tcBorders>
@@ -2285,7 +2283,7 @@
         </w:tc>
         <w:tc>
           <w:tcPr>
-            <w:tcW w:w="810" w:type="dxa"/>
+            <w:tcW w:w="648" w:type="dxa"/>
             <w:tcBorders>
               <w:left w:val="nil"/>
             </w:tcBorders>
@@ -2333,7 +2331,7 @@
         </w:tc>
         <w:tc>
           <w:tcPr>
-            <w:tcW w:w="1350" w:type="dxa"/>
+            <w:tcW w:w="1445" w:type="dxa"/>
             <w:tcBorders>
               <w:left w:val="nil"/>
             </w:tcBorders>
@@ -2471,7 +2469,7 @@
         </w:tc>
         <w:tc>
           <w:tcPr>
-            <w:tcW w:w="984" w:type="dxa"/>
+            <w:tcW w:w="893" w:type="dxa"/>
             <w:tcBorders>
               <w:right w:val="nil"/>
             </w:tcBorders>
@@ -2510,7 +2508,7 @@
         </w:tc>
         <w:tc>
           <w:tcPr>
-            <w:tcW w:w="810" w:type="dxa"/>
+            <w:tcW w:w="648" w:type="dxa"/>
             <w:tcBorders>
               <w:left w:val="nil"/>
             </w:tcBorders>
@@ -2558,7 +2556,7 @@
         </w:tc>
         <w:tc>
           <w:tcPr>
-            <w:tcW w:w="1350" w:type="dxa"/>
+            <w:tcW w:w="1445" w:type="dxa"/>
             <w:tcBorders>
               <w:left w:val="nil"/>
             </w:tcBorders>
@@ -2696,7 +2694,7 @@
         </w:tc>
         <w:tc>
           <w:tcPr>
-            <w:tcW w:w="984" w:type="dxa"/>
+            <w:tcW w:w="893" w:type="dxa"/>
             <w:tcBorders>
               <w:right w:val="nil"/>
             </w:tcBorders>
@@ -2735,7 +2733,7 @@
         </w:tc>
         <w:tc>
           <w:tcPr>
-            <w:tcW w:w="810" w:type="dxa"/>
+            <w:tcW w:w="648" w:type="dxa"/>
             <w:tcBorders>
               <w:left w:val="nil"/>
             </w:tcBorders>
@@ -2783,7 +2781,7 @@
         </w:tc>
         <w:tc>
           <w:tcPr>
-            <w:tcW w:w="1350" w:type="dxa"/>
+            <w:tcW w:w="1445" w:type="dxa"/>
             <w:tcBorders>
               <w:left w:val="nil"/>
             </w:tcBorders>
@@ -2908,7 +2906,7 @@
         </w:tc>
         <w:tc>
           <w:tcPr>
-            <w:tcW w:w="984" w:type="dxa"/>
+            <w:tcW w:w="893" w:type="dxa"/>
             <w:tcBorders>
               <w:right w:val="nil"/>
             </w:tcBorders>
@@ -2946,7 +2944,7 @@
         </w:tc>
         <w:tc>
           <w:tcPr>
-            <w:tcW w:w="810" w:type="dxa"/>
+            <w:tcW w:w="648" w:type="dxa"/>
             <w:tcBorders>
               <w:left w:val="nil"/>
             </w:tcBorders>
@@ -2993,7 +2991,7 @@
         </w:tc>
         <w:tc>
           <w:tcPr>
-            <w:tcW w:w="1350" w:type="dxa"/>
+            <w:tcW w:w="1445" w:type="dxa"/>
             <w:tcBorders>
               <w:left w:val="nil"/>
             </w:tcBorders>
@@ -3039,18 +3037,754 @@
           <w:szCs w:val="24"/>
         </w:rPr>
         <mc:AlternateContent>
+          <mc:Choice Requires="wps">
+            <w:drawing>
+              <wp:anchor distT="0" distB="0" distL="114300" distR="114300" simplePos="0" relativeHeight="251685888" behindDoc="0" locked="0" layoutInCell="1" allowOverlap="1" wp14:anchorId="67221F4D" wp14:editId="01EEB3FC">
+                <wp:simplePos x="0" y="0"/>
+                <wp:positionH relativeFrom="column">
+                  <wp:posOffset>3470275</wp:posOffset>
+                </wp:positionH>
+                <wp:positionV relativeFrom="paragraph">
+                  <wp:posOffset>3053353</wp:posOffset>
+                </wp:positionV>
+                <wp:extent cx="1225097" cy="400957"/>
+                <wp:effectExtent l="0" t="0" r="0" b="0"/>
+                <wp:wrapNone/>
+                <wp:docPr id="25" name="Text Box 25"/>
+                <wp:cNvGraphicFramePr/>
+                <a:graphic xmlns:a="http://schemas.openxmlformats.org/drawingml/2006/main">
+                  <a:graphicData uri="http://schemas.microsoft.com/office/word/2010/wordprocessingShape">
+                    <wps:wsp>
+                      <wps:cNvSpPr txBox="1"/>
+                      <wps:spPr>
+                        <a:xfrm>
+                          <a:off x="0" y="0"/>
+                          <a:ext cx="1225097" cy="400957"/>
+                        </a:xfrm>
+                        <a:prstGeom prst="rect">
+                          <a:avLst/>
+                        </a:prstGeom>
+                        <a:noFill/>
+                        <a:ln w="6350">
+                          <a:noFill/>
+                        </a:ln>
+                      </wps:spPr>
+                      <wps:txbx>
+                        <w:txbxContent>
+                          <w:p>
+                            <w:pPr>
+                              <w:spacing w:after="0" w:line="240" w:lineRule="auto"/>
+                              <w:jc w:val="right"/>
+                              <w:rPr>
+                                <w:rFonts w:eastAsiaTheme="minorEastAsia" w:cstheme="minorHAnsi"/>
+                                <w:color w:val="000000" w:themeColor="text1"/>
+                                <w:sz w:val="20"/>
+                                <w:szCs w:val="20"/>
+                              </w:rPr>
+                            </w:pPr>
+                            <w:r>
+                              <w:rPr>
+                                <w:rFonts w:eastAsiaTheme="minorEastAsia" w:cstheme="minorHAnsi"/>
+                                <w:color w:val="000000" w:themeColor="text1"/>
+                                <w:sz w:val="20"/>
+                                <w:szCs w:val="20"/>
+                              </w:rPr>
+                              <w:t>=</w:t>
+                            </w:r>
+                            <w:r>
+                              <w:rPr>
+                                <w:rFonts w:eastAsiaTheme="minorEastAsia" w:cstheme="minorHAnsi"/>
+                                <w:color w:val="000000" w:themeColor="text1"/>
+                                <w:sz w:val="20"/>
+                                <w:szCs w:val="20"/>
+                              </w:rPr>
+                              <w:t xml:space="preserve"> </w:t>
+                            </w:r>
+                            <w:r>
+                              <w:rPr>
+                                <w:rFonts w:eastAsiaTheme="minorEastAsia" w:cstheme="minorHAnsi"/>
+                                <w:color w:val="000000" w:themeColor="text1"/>
+                                <w:sz w:val="20"/>
+                                <w:szCs w:val="20"/>
+                              </w:rPr>
+                              <w:t>(</w:t>
+                            </w:r>
+                            <w:r>
+                              <w:rPr>
+                                <w:rFonts w:eastAsiaTheme="minorEastAsia" w:cstheme="minorHAnsi"/>
+                                <w:color w:val="000000" w:themeColor="text1"/>
+                                <w:sz w:val="20"/>
+                                <w:szCs w:val="20"/>
+                              </w:rPr>
+                              <w:t xml:space="preserve">10 </w:t>
+                            </w:r>
+                            <m:oMath>
+                              <m:r>
+                                <w:rPr>
+                                  <w:rFonts w:ascii="Cambria Math" w:eastAsiaTheme="minorEastAsia" w:hAnsi="Cambria Math" w:cstheme="minorHAnsi"/>
+                                  <w:color w:val="000000" w:themeColor="text1"/>
+                                  <w:sz w:val="20"/>
+                                  <w:szCs w:val="20"/>
+                                </w:rPr>
+                                <m:t>×</m:t>
+                              </m:r>
+                            </m:oMath>
+                            <w:r>
+                              <w:rPr>
+                                <w:rFonts w:eastAsiaTheme="minorEastAsia" w:cstheme="minorHAnsi"/>
+                                <w:color w:val="000000" w:themeColor="text1"/>
+                                <w:sz w:val="20"/>
+                                <w:szCs w:val="20"/>
+                              </w:rPr>
+                              <w:t xml:space="preserve"> 100) </w:t>
+                            </w:r>
+                            <w:r>
+                              <w:rPr>
+                                <w:rFonts w:eastAsiaTheme="minorEastAsia" w:cstheme="minorHAnsi"/>
+                                <w:color w:val="000000" w:themeColor="text1"/>
+                                <w:sz w:val="20"/>
+                                <w:szCs w:val="20"/>
+                              </w:rPr>
+                              <w:t>Ω ±</w:t>
+                            </w:r>
+                            <w:r>
+                              <w:rPr>
+                                <w:rFonts w:eastAsiaTheme="minorEastAsia" w:cstheme="minorHAnsi"/>
+                                <w:color w:val="000000" w:themeColor="text1"/>
+                                <w:sz w:val="20"/>
+                                <w:szCs w:val="20"/>
+                              </w:rPr>
+                              <w:t xml:space="preserve"> </w:t>
+                            </w:r>
+                            <w:r>
+                              <w:rPr>
+                                <w:rFonts w:eastAsiaTheme="minorEastAsia" w:cstheme="minorHAnsi"/>
+                                <w:color w:val="000000" w:themeColor="text1"/>
+                                <w:sz w:val="20"/>
+                                <w:szCs w:val="20"/>
+                              </w:rPr>
+                              <w:t xml:space="preserve">5% </w:t>
+                            </w:r>
+                          </w:p>
+                          <w:p>
+                            <w:pPr>
+                              <w:spacing w:after="0" w:line="240" w:lineRule="auto"/>
+                              <w:jc w:val="right"/>
+                              <w:rPr>
+                                <w:rFonts w:eastAsiaTheme="minorEastAsia" w:cstheme="minorHAnsi"/>
+                                <w:color w:val="000000" w:themeColor="text1"/>
+                                <w:sz w:val="20"/>
+                                <w:szCs w:val="20"/>
+                              </w:rPr>
+                            </w:pPr>
+                            <w:r>
+                              <w:rPr>
+                                <w:rFonts w:eastAsiaTheme="minorEastAsia" w:cstheme="minorHAnsi"/>
+                                <w:color w:val="000000" w:themeColor="text1"/>
+                                <w:sz w:val="20"/>
+                                <w:szCs w:val="20"/>
+                              </w:rPr>
+                              <w:t xml:space="preserve">= 1000 </w:t>
+                            </w:r>
+                            <w:r>
+                              <w:rPr>
+                                <w:rFonts w:eastAsiaTheme="minorEastAsia" w:cstheme="minorHAnsi"/>
+                                <w:color w:val="000000" w:themeColor="text1"/>
+                                <w:sz w:val="20"/>
+                                <w:szCs w:val="20"/>
+                              </w:rPr>
+                              <w:t>± 5</w:t>
+                            </w:r>
+                            <w:r>
+                              <w:rPr>
+                                <w:rFonts w:eastAsiaTheme="minorEastAsia" w:cstheme="minorHAnsi"/>
+                                <w:color w:val="000000" w:themeColor="text1"/>
+                                <w:sz w:val="20"/>
+                                <w:szCs w:val="20"/>
+                              </w:rPr>
+                              <w:t xml:space="preserve">0 </w:t>
+                            </w:r>
+                            <w:r>
+                              <w:rPr>
+                                <w:rFonts w:eastAsiaTheme="minorEastAsia" w:cstheme="minorHAnsi"/>
+                                <w:color w:val="000000" w:themeColor="text1"/>
+                                <w:sz w:val="20"/>
+                                <w:szCs w:val="20"/>
+                              </w:rPr>
+                              <w:t>Ω</w:t>
+                            </w:r>
+                          </w:p>
+                          <w:p>
+                            <w:pPr>
+                              <w:rPr>
+                                <w:color w:val="000000" w:themeColor="text1"/>
+                                <w:sz w:val="20"/>
+                                <w:szCs w:val="20"/>
+                              </w:rPr>
+                            </w:pPr>
+                          </w:p>
+                        </w:txbxContent>
+                      </wps:txbx>
+                      <wps:bodyPr rot="0" spcFirstLastPara="0" vertOverflow="overflow" horzOverflow="overflow" vert="horz" wrap="square" lIns="91440" tIns="45720" rIns="91440" bIns="45720" numCol="1" spcCol="0" rtlCol="0" fromWordArt="0" anchor="t" anchorCtr="0" forceAA="0" compatLnSpc="1">
+                        <a:prstTxWarp prst="textNoShape">
+                          <a:avLst/>
+                        </a:prstTxWarp>
+                        <a:noAutofit/>
+                      </wps:bodyPr>
+                    </wps:wsp>
+                  </a:graphicData>
+                </a:graphic>
+                <wp14:sizeRelH relativeFrom="margin">
+                  <wp14:pctWidth>0</wp14:pctWidth>
+                </wp14:sizeRelH>
+                <wp14:sizeRelV relativeFrom="margin">
+                  <wp14:pctHeight>0</wp14:pctHeight>
+                </wp14:sizeRelV>
+              </wp:anchor>
+            </w:drawing>
+          </mc:Choice>
+          <mc:Fallback>
+            <w:pict>
+              <v:shapetype w14:anchorId="67221F4D" id="_x0000_t202" coordsize="21600,21600" o:spt="202" path="m,l,21600r21600,l21600,xe">
+                <v:stroke joinstyle="miter"/>
+                <v:path gradientshapeok="t" o:connecttype="rect"/>
+              </v:shapetype>
+              <v:shape id="Text Box 25" o:spid="_x0000_s1026" type="#_x0000_t202" style="position:absolute;margin-left:273.25pt;margin-top:240.4pt;width:96.45pt;height:31.55pt;z-index:251685888;visibility:visible;mso-wrap-style:square;mso-width-percent:0;mso-height-percent:0;mso-wrap-distance-left:9pt;mso-wrap-distance-top:0;mso-wrap-distance-right:9pt;mso-wrap-distance-bottom:0;mso-position-horizontal:absolute;mso-position-horizontal-relative:text;mso-position-vertical:absolute;mso-position-vertical-relative:text;mso-width-percent:0;mso-height-percent:0;mso-width-relative:margin;mso-height-relative:margin;v-text-anchor:top" o:gfxdata="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" filled="f" stroked="f" strokeweight=".5pt">
+                <v:textbox>
+                  <w:txbxContent>
+                    <w:p>
+                      <w:pPr>
+                        <w:spacing w:after="0" w:line="240" w:lineRule="auto"/>
+                        <w:jc w:val="right"/>
+                        <w:rPr>
+                          <w:rFonts w:eastAsiaTheme="minorEastAsia" w:cstheme="minorHAnsi"/>
+                          <w:color w:val="000000" w:themeColor="text1"/>
+                          <w:sz w:val="20"/>
+                          <w:szCs w:val="20"/>
+                        </w:rPr>
+                      </w:pPr>
+                      <w:r>
+                        <w:rPr>
+                          <w:rFonts w:eastAsiaTheme="minorEastAsia" w:cstheme="minorHAnsi"/>
+                          <w:color w:val="000000" w:themeColor="text1"/>
+                          <w:sz w:val="20"/>
+                          <w:szCs w:val="20"/>
+                        </w:rPr>
+                        <w:t>=</w:t>
+                      </w:r>
+                      <w:r>
+                        <w:rPr>
+                          <w:rFonts w:eastAsiaTheme="minorEastAsia" w:cstheme="minorHAnsi"/>
+                          <w:color w:val="000000" w:themeColor="text1"/>
+                          <w:sz w:val="20"/>
+                          <w:szCs w:val="20"/>
+                        </w:rPr>
+                        <w:t xml:space="preserve"> </w:t>
+                      </w:r>
+                      <w:r>
+                        <w:rPr>
+                          <w:rFonts w:eastAsiaTheme="minorEastAsia" w:cstheme="minorHAnsi"/>
+                          <w:color w:val="000000" w:themeColor="text1"/>
+                          <w:sz w:val="20"/>
+                          <w:szCs w:val="20"/>
+                        </w:rPr>
+                        <w:t>(</w:t>
+                      </w:r>
+                      <w:r>
+                        <w:rPr>
+                          <w:rFonts w:eastAsiaTheme="minorEastAsia" w:cstheme="minorHAnsi"/>
+                          <w:color w:val="000000" w:themeColor="text1"/>
+                          <w:sz w:val="20"/>
+                          <w:szCs w:val="20"/>
+                        </w:rPr>
+                        <w:t xml:space="preserve">10 </w:t>
+                      </w:r>
+                      <m:oMath>
+                        <m:r>
+                          <w:rPr>
+                            <w:rFonts w:ascii="Cambria Math" w:eastAsiaTheme="minorEastAsia" w:hAnsi="Cambria Math" w:cstheme="minorHAnsi"/>
+                            <w:color w:val="000000" w:themeColor="text1"/>
+                            <w:sz w:val="20"/>
+                            <w:szCs w:val="20"/>
+                          </w:rPr>
+                          <m:t>×</m:t>
+                        </m:r>
+                      </m:oMath>
+                      <w:r>
+                        <w:rPr>
+                          <w:rFonts w:eastAsiaTheme="minorEastAsia" w:cstheme="minorHAnsi"/>
+                          <w:color w:val="000000" w:themeColor="text1"/>
+                          <w:sz w:val="20"/>
+                          <w:szCs w:val="20"/>
+                        </w:rPr>
+                        <w:t xml:space="preserve"> 100) </w:t>
+                      </w:r>
+                      <w:r>
+                        <w:rPr>
+                          <w:rFonts w:eastAsiaTheme="minorEastAsia" w:cstheme="minorHAnsi"/>
+                          <w:color w:val="000000" w:themeColor="text1"/>
+                          <w:sz w:val="20"/>
+                          <w:szCs w:val="20"/>
+                        </w:rPr>
+                        <w:t>Ω ±</w:t>
+                      </w:r>
+                      <w:r>
+                        <w:rPr>
+                          <w:rFonts w:eastAsiaTheme="minorEastAsia" w:cstheme="minorHAnsi"/>
+                          <w:color w:val="000000" w:themeColor="text1"/>
+                          <w:sz w:val="20"/>
+                          <w:szCs w:val="20"/>
+                        </w:rPr>
+                        <w:t xml:space="preserve"> </w:t>
+                      </w:r>
+                      <w:r>
+                        <w:rPr>
+                          <w:rFonts w:eastAsiaTheme="minorEastAsia" w:cstheme="minorHAnsi"/>
+                          <w:color w:val="000000" w:themeColor="text1"/>
+                          <w:sz w:val="20"/>
+                          <w:szCs w:val="20"/>
+                        </w:rPr>
+                        <w:t xml:space="preserve">5% </w:t>
+                      </w:r>
+                    </w:p>
+                    <w:p>
+                      <w:pPr>
+                        <w:spacing w:after="0" w:line="240" w:lineRule="auto"/>
+                        <w:jc w:val="right"/>
+                        <w:rPr>
+                          <w:rFonts w:eastAsiaTheme="minorEastAsia" w:cstheme="minorHAnsi"/>
+                          <w:color w:val="000000" w:themeColor="text1"/>
+                          <w:sz w:val="20"/>
+                          <w:szCs w:val="20"/>
+                        </w:rPr>
+                      </w:pPr>
+                      <w:r>
+                        <w:rPr>
+                          <w:rFonts w:eastAsiaTheme="minorEastAsia" w:cstheme="minorHAnsi"/>
+                          <w:color w:val="000000" w:themeColor="text1"/>
+                          <w:sz w:val="20"/>
+                          <w:szCs w:val="20"/>
+                        </w:rPr>
+                        <w:t xml:space="preserve">= 1000 </w:t>
+                      </w:r>
+                      <w:r>
+                        <w:rPr>
+                          <w:rFonts w:eastAsiaTheme="minorEastAsia" w:cstheme="minorHAnsi"/>
+                          <w:color w:val="000000" w:themeColor="text1"/>
+                          <w:sz w:val="20"/>
+                          <w:szCs w:val="20"/>
+                        </w:rPr>
+                        <w:t>± 5</w:t>
+                      </w:r>
+                      <w:r>
+                        <w:rPr>
+                          <w:rFonts w:eastAsiaTheme="minorEastAsia" w:cstheme="minorHAnsi"/>
+                          <w:color w:val="000000" w:themeColor="text1"/>
+                          <w:sz w:val="20"/>
+                          <w:szCs w:val="20"/>
+                        </w:rPr>
+                        <w:t xml:space="preserve">0 </w:t>
+                      </w:r>
+                      <w:r>
+                        <w:rPr>
+                          <w:rFonts w:eastAsiaTheme="minorEastAsia" w:cstheme="minorHAnsi"/>
+                          <w:color w:val="000000" w:themeColor="text1"/>
+                          <w:sz w:val="20"/>
+                          <w:szCs w:val="20"/>
+                        </w:rPr>
+                        <w:t>Ω</w:t>
+                      </w:r>
+                    </w:p>
+                    <w:p>
+                      <w:pPr>
+                        <w:rPr>
+                          <w:color w:val="000000" w:themeColor="text1"/>
+                          <w:sz w:val="20"/>
+                          <w:szCs w:val="20"/>
+                        </w:rPr>
+                      </w:pPr>
+                    </w:p>
+                  </w:txbxContent>
+                </v:textbox>
+              </v:shape>
+            </w:pict>
+          </mc:Fallback>
+        </mc:AlternateContent>
+      </w:r>
+      <w:r>
+        <w:rPr>
+          <w:rFonts w:ascii="Times New Roman" w:hAnsi="Times New Roman" w:cs="Times New Roman"/>
+          <w:noProof/>
+          <w:sz w:val="24"/>
+          <w:szCs w:val="24"/>
+        </w:rPr>
+        <mc:AlternateContent>
+          <mc:Choice Requires="wps">
+            <w:drawing>
+              <wp:anchor distT="0" distB="0" distL="114300" distR="114300" simplePos="0" relativeHeight="251681792" behindDoc="0" locked="0" layoutInCell="1" allowOverlap="1" wp14:anchorId="79924897" wp14:editId="48B608E7">
+                <wp:simplePos x="0" y="0"/>
+                <wp:positionH relativeFrom="column">
+                  <wp:posOffset>3461203</wp:posOffset>
+                </wp:positionH>
+                <wp:positionV relativeFrom="paragraph">
+                  <wp:posOffset>2385967</wp:posOffset>
+                </wp:positionV>
+                <wp:extent cx="1157332" cy="436880"/>
+                <wp:effectExtent l="0" t="0" r="0" b="1270"/>
+                <wp:wrapNone/>
+                <wp:docPr id="23" name="Text Box 23"/>
+                <wp:cNvGraphicFramePr/>
+                <a:graphic xmlns:a="http://schemas.openxmlformats.org/drawingml/2006/main">
+                  <a:graphicData uri="http://schemas.microsoft.com/office/word/2010/wordprocessingShape">
+                    <wps:wsp>
+                      <wps:cNvSpPr txBox="1"/>
+                      <wps:spPr>
+                        <a:xfrm>
+                          <a:off x="0" y="0"/>
+                          <a:ext cx="1157332" cy="436880"/>
+                        </a:xfrm>
+                        <a:prstGeom prst="rect">
+                          <a:avLst/>
+                        </a:prstGeom>
+                        <a:noFill/>
+                        <a:ln w="6350">
+                          <a:noFill/>
+                        </a:ln>
+                      </wps:spPr>
+                      <wps:txbx>
+                        <w:txbxContent>
+                          <w:p>
+                            <w:pPr>
+                              <w:jc w:val="right"/>
+                              <w:rPr>
+                                <w:rFonts w:eastAsiaTheme="minorEastAsia" w:cstheme="minorHAnsi"/>
+                                <w:color w:val="000000" w:themeColor="text1"/>
+                                <w:sz w:val="20"/>
+                                <w:szCs w:val="20"/>
+                              </w:rPr>
+                            </w:pPr>
+                            <w:r>
+                              <w:rPr>
+                                <w:rFonts w:eastAsiaTheme="minorEastAsia" w:cstheme="minorHAnsi"/>
+                                <w:color w:val="000000" w:themeColor="text1"/>
+                                <w:sz w:val="20"/>
+                                <w:szCs w:val="20"/>
+                              </w:rPr>
+                              <w:t xml:space="preserve">= </w:t>
+                            </w:r>
+                            <w:r>
+                              <w:rPr>
+                                <w:rFonts w:eastAsiaTheme="minorEastAsia" w:cstheme="minorHAnsi"/>
+                                <w:color w:val="000000" w:themeColor="text1"/>
+                                <w:sz w:val="20"/>
+                                <w:szCs w:val="20"/>
+                              </w:rPr>
+                              <w:t>(</w:t>
+                            </w:r>
+                            <w:r>
+                              <w:rPr>
+                                <w:rFonts w:eastAsiaTheme="minorEastAsia" w:cstheme="minorHAnsi"/>
+                                <w:color w:val="000000" w:themeColor="text1"/>
+                                <w:sz w:val="20"/>
+                                <w:szCs w:val="20"/>
+                              </w:rPr>
+                              <w:t>275</w:t>
+                            </w:r>
+                            <w:r>
+                              <w:rPr>
+                                <w:rFonts w:eastAsiaTheme="minorEastAsia" w:cstheme="minorHAnsi"/>
+                                <w:color w:val="000000" w:themeColor="text1"/>
+                                <w:sz w:val="20"/>
+                                <w:szCs w:val="20"/>
+                              </w:rPr>
+                              <w:t xml:space="preserve"> </w:t>
+                            </w:r>
+                            <m:oMath>
+                              <m:r>
+                                <w:rPr>
+                                  <w:rFonts w:ascii="Cambria Math" w:eastAsiaTheme="minorEastAsia" w:hAnsi="Cambria Math" w:cstheme="minorHAnsi"/>
+                                  <w:color w:val="000000" w:themeColor="text1"/>
+                                  <w:sz w:val="20"/>
+                                  <w:szCs w:val="20"/>
+                                </w:rPr>
+                                <m:t>×</m:t>
+                              </m:r>
+                            </m:oMath>
+                            <w:r>
+                              <w:rPr>
+                                <w:rFonts w:eastAsiaTheme="minorEastAsia" w:cstheme="minorHAnsi"/>
+                                <w:color w:val="000000" w:themeColor="text1"/>
+                                <w:sz w:val="20"/>
+                                <w:szCs w:val="20"/>
+                              </w:rPr>
+                              <w:t xml:space="preserve"> 1) </w:t>
+                            </w:r>
+                            <w:r>
+                              <w:rPr>
+                                <w:rFonts w:eastAsiaTheme="minorEastAsia" w:cstheme="minorHAnsi"/>
+                                <w:color w:val="000000" w:themeColor="text1"/>
+                                <w:sz w:val="20"/>
+                                <w:szCs w:val="20"/>
+                              </w:rPr>
+                              <w:t xml:space="preserve">Ω ± </w:t>
+                            </w:r>
+                            <w:r>
+                              <w:rPr>
+                                <w:rFonts w:eastAsiaTheme="minorEastAsia" w:cstheme="minorHAnsi"/>
+                                <w:color w:val="000000" w:themeColor="text1"/>
+                                <w:sz w:val="20"/>
+                                <w:szCs w:val="20"/>
+                              </w:rPr>
+                              <w:t>1</w:t>
+                            </w:r>
+                            <w:r>
+                              <w:rPr>
+                                <w:rFonts w:eastAsiaTheme="minorEastAsia" w:cstheme="minorHAnsi"/>
+                                <w:color w:val="000000" w:themeColor="text1"/>
+                                <w:sz w:val="20"/>
+                                <w:szCs w:val="20"/>
+                              </w:rPr>
+                              <w:t>%</w:t>
+                            </w:r>
+                            <w:r>
+                              <w:rPr>
+                                <w:rFonts w:eastAsiaTheme="minorEastAsia" w:cstheme="minorHAnsi"/>
+                                <w:color w:val="000000" w:themeColor="text1"/>
+                                <w:sz w:val="20"/>
+                                <w:szCs w:val="20"/>
+                              </w:rPr>
+                              <w:t xml:space="preserve"> = 275 </w:t>
+                            </w:r>
+                            <w:r>
+                              <w:rPr>
+                                <w:rFonts w:eastAsiaTheme="minorEastAsia" w:cstheme="minorHAnsi"/>
+                                <w:color w:val="000000" w:themeColor="text1"/>
+                                <w:sz w:val="20"/>
+                                <w:szCs w:val="20"/>
+                              </w:rPr>
+                              <w:t>±</w:t>
+                            </w:r>
+                            <w:r>
+                              <w:rPr>
+                                <w:rFonts w:eastAsiaTheme="minorEastAsia" w:cstheme="minorHAnsi"/>
+                                <w:color w:val="000000" w:themeColor="text1"/>
+                                <w:sz w:val="20"/>
+                                <w:szCs w:val="20"/>
+                              </w:rPr>
+                              <w:t xml:space="preserve"> 2.75 </w:t>
+                            </w:r>
+                            <w:r>
+                              <w:rPr>
+                                <w:rFonts w:eastAsiaTheme="minorEastAsia" w:cstheme="minorHAnsi"/>
+                                <w:color w:val="000000" w:themeColor="text1"/>
+                                <w:sz w:val="20"/>
+                                <w:szCs w:val="20"/>
+                              </w:rPr>
+                              <w:t>Ω</w:t>
+                            </w:r>
+                          </w:p>
+                          <w:p>
+                            <w:pPr>
+                              <w:jc w:val="center"/>
+                              <w:rPr>
+                                <w:color w:val="000000" w:themeColor="text1"/>
+                                <w:sz w:val="20"/>
+                                <w:szCs w:val="20"/>
+                              </w:rPr>
+                            </w:pPr>
+                          </w:p>
+                        </w:txbxContent>
+                      </wps:txbx>
+                      <wps:bodyPr rot="0" spcFirstLastPara="0" vertOverflow="overflow" horzOverflow="overflow" vert="horz" wrap="square" lIns="91440" tIns="45720" rIns="91440" bIns="45720" numCol="1" spcCol="0" rtlCol="0" fromWordArt="0" anchor="t" anchorCtr="0" forceAA="0" compatLnSpc="1">
+                        <a:prstTxWarp prst="textNoShape">
+                          <a:avLst/>
+                        </a:prstTxWarp>
+                        <a:noAutofit/>
+                      </wps:bodyPr>
+                    </wps:wsp>
+                  </a:graphicData>
+                </a:graphic>
+                <wp14:sizeRelH relativeFrom="margin">
+                  <wp14:pctWidth>0</wp14:pctWidth>
+                </wp14:sizeRelH>
+                <wp14:sizeRelV relativeFrom="margin">
+                  <wp14:pctHeight>0</wp14:pctHeight>
+                </wp14:sizeRelV>
+              </wp:anchor>
+            </w:drawing>
+          </mc:Choice>
+          <mc:Fallback>
+            <w:pict>
+              <v:shape w14:anchorId="79924897" id="Text Box 23" o:spid="_x0000_s1027" type="#_x0000_t202" style="position:absolute;margin-left:272.55pt;margin-top:187.85pt;width:91.15pt;height:34.4pt;z-index:251681792;visibility:visible;mso-wrap-style:square;mso-width-percent:0;mso-height-percent:0;mso-wrap-distance-left:9pt;mso-wrap-distance-top:0;mso-wrap-distance-right:9pt;mso-wrap-distance-bottom:0;mso-position-horizontal:absolute;mso-position-horizontal-relative:text;mso-position-vertical:absolute;mso-position-vertical-relative:text;mso-width-percent:0;mso-height-percent:0;mso-width-relative:margin;mso-height-relative:margin;v-text-anchor:top" o:gfxdata="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" filled="f" stroked="f" strokeweight=".5pt">
+                <v:textbox>
+                  <w:txbxContent>
+                    <w:p>
+                      <w:pPr>
+                        <w:jc w:val="right"/>
+                        <w:rPr>
+                          <w:rFonts w:eastAsiaTheme="minorEastAsia" w:cstheme="minorHAnsi"/>
+                          <w:color w:val="000000" w:themeColor="text1"/>
+                          <w:sz w:val="20"/>
+                          <w:szCs w:val="20"/>
+                        </w:rPr>
+                      </w:pPr>
+                      <w:r>
+                        <w:rPr>
+                          <w:rFonts w:eastAsiaTheme="minorEastAsia" w:cstheme="minorHAnsi"/>
+                          <w:color w:val="000000" w:themeColor="text1"/>
+                          <w:sz w:val="20"/>
+                          <w:szCs w:val="20"/>
+                        </w:rPr>
+                        <w:t xml:space="preserve">= </w:t>
+                      </w:r>
+                      <w:r>
+                        <w:rPr>
+                          <w:rFonts w:eastAsiaTheme="minorEastAsia" w:cstheme="minorHAnsi"/>
+                          <w:color w:val="000000" w:themeColor="text1"/>
+                          <w:sz w:val="20"/>
+                          <w:szCs w:val="20"/>
+                        </w:rPr>
+                        <w:t>(</w:t>
+                      </w:r>
+                      <w:r>
+                        <w:rPr>
+                          <w:rFonts w:eastAsiaTheme="minorEastAsia" w:cstheme="minorHAnsi"/>
+                          <w:color w:val="000000" w:themeColor="text1"/>
+                          <w:sz w:val="20"/>
+                          <w:szCs w:val="20"/>
+                        </w:rPr>
+                        <w:t>275</w:t>
+                      </w:r>
+                      <w:r>
+                        <w:rPr>
+                          <w:rFonts w:eastAsiaTheme="minorEastAsia" w:cstheme="minorHAnsi"/>
+                          <w:color w:val="000000" w:themeColor="text1"/>
+                          <w:sz w:val="20"/>
+                          <w:szCs w:val="20"/>
+                        </w:rPr>
+                        <w:t xml:space="preserve"> </w:t>
+                      </w:r>
+                      <m:oMath>
+                        <m:r>
+                          <w:rPr>
+                            <w:rFonts w:ascii="Cambria Math" w:eastAsiaTheme="minorEastAsia" w:hAnsi="Cambria Math" w:cstheme="minorHAnsi"/>
+                            <w:color w:val="000000" w:themeColor="text1"/>
+                            <w:sz w:val="20"/>
+                            <w:szCs w:val="20"/>
+                          </w:rPr>
+                          <m:t>×</m:t>
+                        </m:r>
+                      </m:oMath>
+                      <w:r>
+                        <w:rPr>
+                          <w:rFonts w:eastAsiaTheme="minorEastAsia" w:cstheme="minorHAnsi"/>
+                          <w:color w:val="000000" w:themeColor="text1"/>
+                          <w:sz w:val="20"/>
+                          <w:szCs w:val="20"/>
+                        </w:rPr>
+                        <w:t xml:space="preserve"> 1) </w:t>
+                      </w:r>
+                      <w:r>
+                        <w:rPr>
+                          <w:rFonts w:eastAsiaTheme="minorEastAsia" w:cstheme="minorHAnsi"/>
+                          <w:color w:val="000000" w:themeColor="text1"/>
+                          <w:sz w:val="20"/>
+                          <w:szCs w:val="20"/>
+                        </w:rPr>
+                        <w:t xml:space="preserve">Ω ± </w:t>
+                      </w:r>
+                      <w:r>
+                        <w:rPr>
+                          <w:rFonts w:eastAsiaTheme="minorEastAsia" w:cstheme="minorHAnsi"/>
+                          <w:color w:val="000000" w:themeColor="text1"/>
+                          <w:sz w:val="20"/>
+                          <w:szCs w:val="20"/>
+                        </w:rPr>
+                        <w:t>1</w:t>
+                      </w:r>
+                      <w:r>
+                        <w:rPr>
+                          <w:rFonts w:eastAsiaTheme="minorEastAsia" w:cstheme="minorHAnsi"/>
+                          <w:color w:val="000000" w:themeColor="text1"/>
+                          <w:sz w:val="20"/>
+                          <w:szCs w:val="20"/>
+                        </w:rPr>
+                        <w:t>%</w:t>
+                      </w:r>
+                      <w:r>
+                        <w:rPr>
+                          <w:rFonts w:eastAsiaTheme="minorEastAsia" w:cstheme="minorHAnsi"/>
+                          <w:color w:val="000000" w:themeColor="text1"/>
+                          <w:sz w:val="20"/>
+                          <w:szCs w:val="20"/>
+                        </w:rPr>
+                        <w:t xml:space="preserve"> = 275 </w:t>
+                      </w:r>
+                      <w:r>
+                        <w:rPr>
+                          <w:rFonts w:eastAsiaTheme="minorEastAsia" w:cstheme="minorHAnsi"/>
+                          <w:color w:val="000000" w:themeColor="text1"/>
+                          <w:sz w:val="20"/>
+                          <w:szCs w:val="20"/>
+                        </w:rPr>
+                        <w:t>±</w:t>
+                      </w:r>
+                      <w:r>
+                        <w:rPr>
+                          <w:rFonts w:eastAsiaTheme="minorEastAsia" w:cstheme="minorHAnsi"/>
+                          <w:color w:val="000000" w:themeColor="text1"/>
+                          <w:sz w:val="20"/>
+                          <w:szCs w:val="20"/>
+                        </w:rPr>
+                        <w:t xml:space="preserve"> 2.75 </w:t>
+                      </w:r>
+                      <w:r>
+                        <w:rPr>
+                          <w:rFonts w:eastAsiaTheme="minorEastAsia" w:cstheme="minorHAnsi"/>
+                          <w:color w:val="000000" w:themeColor="text1"/>
+                          <w:sz w:val="20"/>
+                          <w:szCs w:val="20"/>
+                        </w:rPr>
+                        <w:t>Ω</w:t>
+                      </w:r>
+                    </w:p>
+                    <w:p>
+                      <w:pPr>
+                        <w:jc w:val="center"/>
+                        <w:rPr>
+                          <w:color w:val="000000" w:themeColor="text1"/>
+                          <w:sz w:val="20"/>
+                          <w:szCs w:val="20"/>
+                        </w:rPr>
+                      </w:pPr>
+                    </w:p>
+                  </w:txbxContent>
+                </v:textbox>
+              </v:shape>
+            </w:pict>
+          </mc:Fallback>
+        </mc:AlternateContent>
+      </w:r>
+      <w:r>
+        <w:rPr>
+          <w:rFonts w:ascii="Times New Roman" w:hAnsi="Times New Roman" w:cs="Times New Roman"/>
+          <w:noProof/>
+          <w:sz w:val="24"/>
+          <w:szCs w:val="24"/>
+        </w:rPr>
+        <mc:AlternateContent>
           <mc:Choice Requires="wpg">
             <w:drawing>
-              <wp:anchor distT="0" distB="0" distL="114300" distR="114300" simplePos="0" relativeHeight="251719680" behindDoc="0" locked="0" layoutInCell="1" allowOverlap="1">
+              <wp:anchor distT="0" distB="0" distL="114300" distR="114300" simplePos="0" relativeHeight="251719680" behindDoc="0" locked="0" layoutInCell="1" allowOverlap="1" wp14:anchorId="602E0287" wp14:editId="49F95B1D">
                 <wp:simplePos x="0" y="0"/>
                 <wp:positionH relativeFrom="column">
-                  <wp:posOffset>2526792</wp:posOffset>
+                  <wp:posOffset>2527300</wp:posOffset>
                 </wp:positionH>
                 <wp:positionV relativeFrom="paragraph">
-                  <wp:posOffset>2717800</wp:posOffset>
+                  <wp:posOffset>2718163</wp:posOffset>
                 </wp:positionV>
-                <wp:extent cx="808862" cy="274320"/>
-                <wp:effectExtent l="76200" t="0" r="10795" b="49530"/>
+                <wp:extent cx="821144" cy="274320"/>
+                <wp:effectExtent l="76200" t="0" r="17145" b="49530"/>
                 <wp:wrapNone/>
                 <wp:docPr id="51" name="Group 51"/>
                 <wp:cNvGraphicFramePr/>
@@ -3061,9 +3795,9 @@
                       <wpg:grpSpPr>
                         <a:xfrm>
                           <a:off x="0" y="0"/>
-                          <a:ext cx="808862" cy="274320"/>
+                          <a:ext cx="821144" cy="274320"/>
                           <a:chOff x="-10668" y="0"/>
-                          <a:chExt cx="808862" cy="365760"/>
+                          <a:chExt cx="821566" cy="365760"/>
                         </a:xfrm>
                       </wpg:grpSpPr>
                       <wps:wsp>
@@ -3151,7 +3885,7 @@
                         <wps:cNvSpPr/>
                         <wps:spPr>
                           <a:xfrm flipH="1">
-                            <a:off x="605027" y="0"/>
+                            <a:off x="617731" y="0"/>
                             <a:ext cx="193167" cy="365760"/>
                           </a:xfrm>
                           <a:custGeom>
@@ -3306,12 +4040,12 @@
           </mc:Choice>
           <mc:Fallback>
             <w:pict>
-              <v:group w14:anchorId="62A45A8C" id="Group 51" o:spid="_x0000_s1026" style="position:absolute;margin-left:198.95pt;margin-top:214pt;width:63.7pt;height:21.6pt;z-index:251719680;mso-width-relative:margin;mso-height-relative:margin" coordorigin="-106" coordsize="8088,3657" o:gfxdata="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">
+              <v:group w14:anchorId="336B3EAA" id="Group 51" o:spid="_x0000_s1026" style="position:absolute;margin-left:199pt;margin-top:214.05pt;width:64.65pt;height:21.6pt;z-index:251719680;mso-width-relative:margin;mso-height-relative:margin" coordorigin="-106" coordsize="8215,3657" o:gfxdata="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">
                 <v:shape id="Freeform 43" o:spid="_x0000_s1027" style="position:absolute;left:3489;width:1753;height:3657;flip:x;visibility:visible;mso-wrap-style:square;v-text-anchor:middle" coordsize="663575,342900" o:gfxdata="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" path="m,l,98425,663575,234950r,107950e" filled="f" strokecolor="black [3040]" strokeweight="1pt">
                   <v:stroke dashstyle="3 1" startarrowwidth="narrow" startarrowlength="short" endarrow="open" endarrowwidth="narrow" endarrowlength="short"/>
                   <v:path arrowok="t" o:connecttype="custom" o:connectlocs="0,0;0,104987;175259,250613;175259,365760" o:connectangles="0,0,0,0"/>
                 </v:shape>
-                <v:shape id="Freeform 45" o:spid="_x0000_s1028" style="position:absolute;left:6050;width:1931;height:3657;flip:x;visibility:visible;mso-wrap-style:square;v-text-anchor:middle" coordsize="663575,342900" o:gfxdata="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" path="m,l,98425,663575,234950r,107950e" filled="f" strokecolor="black [3040]" strokeweight="1pt">
+                <v:shape id="Freeform 45" o:spid="_x0000_s1028" style="position:absolute;left:6177;width:1931;height:3657;flip:x;visibility:visible;mso-wrap-style:square;v-text-anchor:middle" coordsize="663575,342900" o:gfxdata="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" path="m,l,98425,663575,234950r,107950e" filled="f" strokecolor="black [3040]" strokeweight="1pt">
                   <v:stroke dashstyle="3 1" startarrowwidth="narrow" startarrowlength="short" endarrow="open" endarrowwidth="narrow" endarrowlength="short"/>
                   <v:path arrowok="t" o:connecttype="custom" o:connectlocs="0,0;0,104987;193167,250613;193167,365760" o:connectangles="0,0,0,0"/>
                 </v:shape>
@@ -3336,18 +4070,18 @@
         <mc:AlternateContent>
           <mc:Choice Requires="wpg">
             <w:drawing>
-              <wp:anchor distT="0" distB="0" distL="114300" distR="114300" simplePos="0" relativeHeight="251710464" behindDoc="0" locked="0" layoutInCell="1" allowOverlap="1">
+              <wp:anchor distT="0" distB="0" distL="114300" distR="114300" simplePos="0" relativeHeight="251696128" behindDoc="0" locked="0" layoutInCell="1" allowOverlap="1" wp14:anchorId="6AAA0479" wp14:editId="725B3163">
                 <wp:simplePos x="0" y="0"/>
                 <wp:positionH relativeFrom="column">
-                  <wp:posOffset>1859280</wp:posOffset>
+                  <wp:posOffset>2394857</wp:posOffset>
                 </wp:positionH>
                 <wp:positionV relativeFrom="paragraph">
-                  <wp:posOffset>1856740</wp:posOffset>
+                  <wp:posOffset>2342606</wp:posOffset>
                 </wp:positionV>
-                <wp:extent cx="2868930" cy="457200"/>
-                <wp:effectExtent l="0" t="0" r="26670" b="57150"/>
+                <wp:extent cx="1089660" cy="365760"/>
+                <wp:effectExtent l="0" t="0" r="0" b="0"/>
                 <wp:wrapNone/>
-                <wp:docPr id="50" name="Group 50"/>
+                <wp:docPr id="36" name="5 band resistor"/>
                 <wp:cNvGraphicFramePr/>
                 <a:graphic xmlns:a="http://schemas.openxmlformats.org/drawingml/2006/main">
                   <a:graphicData uri="http://schemas.microsoft.com/office/word/2010/wordprocessingGroup">
@@ -3356,395 +4090,762 @@
                       <wpg:grpSpPr>
                         <a:xfrm>
                           <a:off x="0" y="0"/>
-                          <a:ext cx="2868930" cy="457200"/>
+                          <a:ext cx="1089660" cy="365760"/>
                           <a:chOff x="0" y="0"/>
-                          <a:chExt cx="2868930" cy="552450"/>
+                          <a:chExt cx="1089660" cy="365760"/>
                         </a:xfrm>
                       </wpg:grpSpPr>
-                      <wps:wsp>
-                        <wps:cNvPr id="35" name="Freeform 35"/>
-                        <wps:cNvSpPr/>
-                        <wps:spPr>
+                      <wpg:grpSp>
+                        <wpg:cNvPr id="20" name="Group 20"/>
+                        <wpg:cNvGrpSpPr/>
+                        <wpg:grpSpPr>
                           <a:xfrm>
                             <a:off x="0" y="0"/>
-                            <a:ext cx="663575" cy="552450"/>
+                            <a:ext cx="1089660" cy="365760"/>
+                            <a:chOff x="0" y="0"/>
+                            <a:chExt cx="1089660" cy="365760"/>
                           </a:xfrm>
-                          <a:custGeom>
-                            <a:avLst/>
-                            <a:gdLst>
-                              <a:gd name="connsiteX0" fmla="*/ 0 w 663575"/>
-                              <a:gd name="connsiteY0" fmla="*/ 0 h 342900"/>
-                              <a:gd name="connsiteX1" fmla="*/ 0 w 663575"/>
-                              <a:gd name="connsiteY1" fmla="*/ 98425 h 342900"/>
-                              <a:gd name="connsiteX2" fmla="*/ 663575 w 663575"/>
-                              <a:gd name="connsiteY2" fmla="*/ 234950 h 342900"/>
-                              <a:gd name="connsiteX3" fmla="*/ 663575 w 663575"/>
-                              <a:gd name="connsiteY3" fmla="*/ 342900 h 342900"/>
-                            </a:gdLst>
-                            <a:ahLst/>
-                            <a:cxnLst>
-                              <a:cxn ang="0">
-                                <a:pos x="connsiteX0" y="connsiteY0"/>
-                              </a:cxn>
-                              <a:cxn ang="0">
-                                <a:pos x="connsiteX1" y="connsiteY1"/>
-                              </a:cxn>
-                              <a:cxn ang="0">
-                                <a:pos x="connsiteX2" y="connsiteY2"/>
-                              </a:cxn>
-                              <a:cxn ang="0">
-                                <a:pos x="connsiteX3" y="connsiteY3"/>
-                              </a:cxn>
-                            </a:cxnLst>
-                            <a:rect l="l" t="t" r="r" b="b"/>
-                            <a:pathLst>
-                              <a:path w="663575" h="342900">
-                                <a:moveTo>
-                                  <a:pt x="0" y="0"/>
-                                </a:moveTo>
-                                <a:lnTo>
-                                  <a:pt x="0" y="98425"/>
-                                </a:lnTo>
-                                <a:lnTo>
-                                  <a:pt x="663575" y="234950"/>
-                                </a:lnTo>
-                                <a:lnTo>
-                                  <a:pt x="663575" y="342900"/>
-                                </a:lnTo>
-                              </a:path>
-                            </a:pathLst>
-                          </a:custGeom>
-                          <a:ln w="12700">
-                            <a:prstDash val="sysDash"/>
-                            <a:headEnd type="none" w="sm" len="sm"/>
-                            <a:tailEnd type="arrow" w="sm" len="sm"/>
-                          </a:ln>
-                        </wps:spPr>
-                        <wps:style>
-                          <a:lnRef idx="1">
-                            <a:schemeClr val="dk1"/>
-                          </a:lnRef>
-                          <a:fillRef idx="0">
-                            <a:schemeClr val="dk1"/>
-                          </a:fillRef>
-                          <a:effectRef idx="0">
-                            <a:schemeClr val="dk1"/>
-                          </a:effectRef>
-                          <a:fontRef idx="minor">
-                            <a:schemeClr val="tx1"/>
-                          </a:fontRef>
-                        </wps:style>
-                        <wps:bodyPr rot="0" spcFirstLastPara="0" vertOverflow="overflow" horzOverflow="overflow" vert="horz" wrap="square" lIns="91440" tIns="45720" rIns="91440" bIns="45720" numCol="1" spcCol="0" rtlCol="0" fromWordArt="0" anchor="ctr" anchorCtr="0" forceAA="0" compatLnSpc="1">
-                          <a:prstTxWarp prst="textNoShape">
-                            <a:avLst/>
-                          </a:prstTxWarp>
-                          <a:noAutofit/>
-                        </wps:bodyPr>
-                      </wps:wsp>
-                      <wps:wsp>
-                        <wps:cNvPr id="38" name="Freeform 38"/>
-                        <wps:cNvSpPr/>
-                        <wps:spPr>
+                        </wpg:grpSpPr>
+                        <wpg:grpSp>
+                          <wpg:cNvPr id="15" name="Group 11"/>
+                          <wpg:cNvGrpSpPr/>
+                          <wpg:grpSpPr>
+                            <a:xfrm>
+                              <a:off x="0" y="0"/>
+                              <a:ext cx="1089660" cy="365760"/>
+                              <a:chOff x="0" y="0"/>
+                              <a:chExt cx="1089660" cy="365760"/>
+                            </a:xfrm>
+                          </wpg:grpSpPr>
+                          <wps:wsp>
+                            <wps:cNvPr id="16" name="Rounded Rectangle 12"/>
+                            <wps:cNvSpPr/>
+                            <wps:spPr>
+                              <a:xfrm>
+                                <a:off x="0" y="0"/>
+                                <a:ext cx="274320" cy="365760"/>
+                              </a:xfrm>
+                              <a:prstGeom prst="roundRect">
+                                <a:avLst>
+                                  <a:gd name="adj" fmla="val 27012"/>
+                                </a:avLst>
+                              </a:prstGeom>
+                              <a:solidFill>
+                                <a:srgbClr val="00B0F0"/>
+                              </a:solidFill>
+                              <a:ln>
+                                <a:noFill/>
+                              </a:ln>
+                            </wps:spPr>
+                            <wps:style>
+                              <a:lnRef idx="2">
+                                <a:schemeClr val="accent1">
+                                  <a:shade val="50000"/>
+                                </a:schemeClr>
+                              </a:lnRef>
+                              <a:fillRef idx="1">
+                                <a:schemeClr val="accent1"/>
+                              </a:fillRef>
+                              <a:effectRef idx="0">
+                                <a:schemeClr val="accent1"/>
+                              </a:effectRef>
+                              <a:fontRef idx="minor">
+                                <a:schemeClr val="lt1"/>
+                              </a:fontRef>
+                            </wps:style>
+                            <wps:bodyPr rot="0" spcFirstLastPara="0" vertOverflow="overflow" horzOverflow="overflow" vert="horz" wrap="square" lIns="91440" tIns="45720" rIns="91440" bIns="45720" numCol="1" spcCol="0" rtlCol="0" fromWordArt="0" anchor="ctr" anchorCtr="0" forceAA="0" compatLnSpc="1">
+                              <a:prstTxWarp prst="textNoShape">
+                                <a:avLst/>
+                              </a:prstTxWarp>
+                              <a:noAutofit/>
+                            </wps:bodyPr>
+                          </wps:wsp>
+                          <wps:wsp>
+                            <wps:cNvPr id="17" name="Rounded Rectangle 13"/>
+                            <wps:cNvSpPr/>
+                            <wps:spPr>
+                              <a:xfrm>
+                                <a:off x="815340" y="0"/>
+                                <a:ext cx="274320" cy="365760"/>
+                              </a:xfrm>
+                              <a:prstGeom prst="roundRect">
+                                <a:avLst>
+                                  <a:gd name="adj" fmla="val 29885"/>
+                                </a:avLst>
+                              </a:prstGeom>
+                              <a:solidFill>
+                                <a:srgbClr val="00B0F0"/>
+                              </a:solidFill>
+                              <a:ln>
+                                <a:noFill/>
+                              </a:ln>
+                            </wps:spPr>
+                            <wps:style>
+                              <a:lnRef idx="2">
+                                <a:schemeClr val="accent1">
+                                  <a:shade val="50000"/>
+                                </a:schemeClr>
+                              </a:lnRef>
+                              <a:fillRef idx="1">
+                                <a:schemeClr val="accent1"/>
+                              </a:fillRef>
+                              <a:effectRef idx="0">
+                                <a:schemeClr val="accent1"/>
+                              </a:effectRef>
+                              <a:fontRef idx="minor">
+                                <a:schemeClr val="lt1"/>
+                              </a:fontRef>
+                            </wps:style>
+                            <wps:bodyPr rot="0" spcFirstLastPara="0" vertOverflow="overflow" horzOverflow="overflow" vert="horz" wrap="square" lIns="91440" tIns="45720" rIns="91440" bIns="45720" numCol="1" spcCol="0" rtlCol="0" fromWordArt="0" anchor="ctr" anchorCtr="0" forceAA="0" compatLnSpc="1">
+                              <a:prstTxWarp prst="textNoShape">
+                                <a:avLst/>
+                              </a:prstTxWarp>
+                              <a:noAutofit/>
+                            </wps:bodyPr>
+                          </wps:wsp>
+                          <wps:wsp>
+                            <wps:cNvPr id="18" name="Rectangle 14"/>
+                            <wps:cNvSpPr/>
+                            <wps:spPr>
+                              <a:xfrm>
+                                <a:off x="213360" y="22860"/>
+                                <a:ext cx="664780" cy="320040"/>
+                              </a:xfrm>
+                              <a:prstGeom prst="rect">
+                                <a:avLst/>
+                              </a:prstGeom>
+                              <a:solidFill>
+                                <a:srgbClr val="00B0F0"/>
+                              </a:solidFill>
+                              <a:ln>
+                                <a:noFill/>
+                              </a:ln>
+                            </wps:spPr>
+                            <wps:style>
+                              <a:lnRef idx="2">
+                                <a:schemeClr val="accent1">
+                                  <a:shade val="50000"/>
+                                </a:schemeClr>
+                              </a:lnRef>
+                              <a:fillRef idx="1">
+                                <a:schemeClr val="accent1"/>
+                              </a:fillRef>
+                              <a:effectRef idx="0">
+                                <a:schemeClr val="accent1"/>
+                              </a:effectRef>
+                              <a:fontRef idx="minor">
+                                <a:schemeClr val="lt1"/>
+                              </a:fontRef>
+                            </wps:style>
+                            <wps:bodyPr rot="0" spcFirstLastPara="0" vertOverflow="overflow" horzOverflow="overflow" vert="horz" wrap="square" lIns="91440" tIns="45720" rIns="91440" bIns="45720" numCol="1" spcCol="0" rtlCol="0" fromWordArt="0" anchor="ctr" anchorCtr="0" forceAA="0" compatLnSpc="1">
+                              <a:prstTxWarp prst="textNoShape">
+                                <a:avLst/>
+                              </a:prstTxWarp>
+                              <a:noAutofit/>
+                            </wps:bodyPr>
+                          </wps:wsp>
+                        </wpg:grpSp>
+                        <wps:wsp>
+                          <wps:cNvPr id="19" name="Rectangle 15"/>
+                          <wps:cNvSpPr/>
+                          <wps:spPr>
+                            <a:xfrm>
+                              <a:off x="90714" y="0"/>
+                              <a:ext cx="91440" cy="365760"/>
+                            </a:xfrm>
+                            <a:prstGeom prst="rect">
+                              <a:avLst/>
+                            </a:prstGeom>
+                            <a:solidFill>
+                              <a:srgbClr val="FF0000"/>
+                            </a:solidFill>
+                            <a:ln>
+                              <a:noFill/>
+                            </a:ln>
+                          </wps:spPr>
+                          <wps:style>
+                            <a:lnRef idx="2">
+                              <a:schemeClr val="accent1">
+                                <a:shade val="50000"/>
+                              </a:schemeClr>
+                            </a:lnRef>
+                            <a:fillRef idx="1">
+                              <a:schemeClr val="accent1"/>
+                            </a:fillRef>
+                            <a:effectRef idx="0">
+                              <a:schemeClr val="accent1"/>
+                            </a:effectRef>
+                            <a:fontRef idx="minor">
+                              <a:schemeClr val="lt1"/>
+                            </a:fontRef>
+                          </wps:style>
+                          <wps:bodyPr rot="0" spcFirstLastPara="0" vertOverflow="overflow" horzOverflow="overflow" vert="horz" wrap="square" lIns="91440" tIns="45720" rIns="91440" bIns="45720" numCol="1" spcCol="0" rtlCol="0" fromWordArt="0" anchor="ctr" anchorCtr="0" forceAA="0" compatLnSpc="1">
+                            <a:prstTxWarp prst="textNoShape">
+                              <a:avLst/>
+                            </a:prstTxWarp>
+                            <a:noAutofit/>
+                          </wps:bodyPr>
+                        </wps:wsp>
+                        <wps:wsp>
+                          <wps:cNvPr id="26" name="Rectangle 16"/>
+                          <wps:cNvSpPr/>
+                          <wps:spPr>
+                            <a:xfrm>
+                              <a:off x="624114" y="22352"/>
+                              <a:ext cx="91440" cy="320040"/>
+                            </a:xfrm>
+                            <a:prstGeom prst="rect">
+                              <a:avLst/>
+                            </a:prstGeom>
+                            <a:solidFill>
+                              <a:schemeClr val="tx1"/>
+                            </a:solidFill>
+                            <a:ln>
+                              <a:noFill/>
+                            </a:ln>
+                          </wps:spPr>
+                          <wps:style>
+                            <a:lnRef idx="2">
+                              <a:schemeClr val="accent1">
+                                <a:shade val="50000"/>
+                              </a:schemeClr>
+                            </a:lnRef>
+                            <a:fillRef idx="1">
+                              <a:schemeClr val="accent1"/>
+                            </a:fillRef>
+                            <a:effectRef idx="0">
+                              <a:schemeClr val="accent1"/>
+                            </a:effectRef>
+                            <a:fontRef idx="minor">
+                              <a:schemeClr val="lt1"/>
+                            </a:fontRef>
+                          </wps:style>
+                          <wps:bodyPr rot="0" spcFirstLastPara="0" vertOverflow="overflow" horzOverflow="overflow" vert="horz" wrap="square" lIns="91440" tIns="45720" rIns="91440" bIns="45720" numCol="1" spcCol="0" rtlCol="0" fromWordArt="0" anchor="ctr" anchorCtr="0" forceAA="0" compatLnSpc="1">
+                            <a:prstTxWarp prst="textNoShape">
+                              <a:avLst/>
+                            </a:prstTxWarp>
+                            <a:noAutofit/>
+                          </wps:bodyPr>
+                        </wps:wsp>
+                        <wps:wsp>
+                          <wps:cNvPr id="28" name="Rectangle 17"/>
+                          <wps:cNvSpPr/>
+                          <wps:spPr>
+                            <a:xfrm>
+                              <a:off x="268514" y="22352"/>
+                              <a:ext cx="91440" cy="320040"/>
+                            </a:xfrm>
+                            <a:prstGeom prst="rect">
+                              <a:avLst/>
+                            </a:prstGeom>
+                            <a:solidFill>
+                              <a:srgbClr val="7030A0"/>
+                            </a:solidFill>
+                            <a:ln>
+                              <a:noFill/>
+                            </a:ln>
+                          </wps:spPr>
+                          <wps:style>
+                            <a:lnRef idx="2">
+                              <a:schemeClr val="accent1">
+                                <a:shade val="50000"/>
+                              </a:schemeClr>
+                            </a:lnRef>
+                            <a:fillRef idx="1">
+                              <a:schemeClr val="accent1"/>
+                            </a:fillRef>
+                            <a:effectRef idx="0">
+                              <a:schemeClr val="accent1"/>
+                            </a:effectRef>
+                            <a:fontRef idx="minor">
+                              <a:schemeClr val="lt1"/>
+                            </a:fontRef>
+                          </wps:style>
+                          <wps:bodyPr rot="0" spcFirstLastPara="0" vertOverflow="overflow" horzOverflow="overflow" vert="horz" wrap="square" lIns="91440" tIns="45720" rIns="91440" bIns="45720" numCol="1" spcCol="0" rtlCol="0" fromWordArt="0" anchor="ctr" anchorCtr="0" forceAA="0" compatLnSpc="1">
+                            <a:prstTxWarp prst="textNoShape">
+                              <a:avLst/>
+                            </a:prstTxWarp>
+                            <a:noAutofit/>
+                          </wps:bodyPr>
+                        </wps:wsp>
+                        <wps:wsp>
+                          <wps:cNvPr id="29" name="Rectangle 18"/>
+                          <wps:cNvSpPr/>
+                          <wps:spPr>
+                            <a:xfrm>
+                              <a:off x="446314" y="22352"/>
+                              <a:ext cx="91440" cy="320040"/>
+                            </a:xfrm>
+                            <a:prstGeom prst="rect">
+                              <a:avLst/>
+                            </a:prstGeom>
+                            <a:solidFill>
+                              <a:srgbClr val="00B050"/>
+                            </a:solidFill>
+                            <a:ln>
+                              <a:noFill/>
+                            </a:ln>
+                          </wps:spPr>
+                          <wps:style>
+                            <a:lnRef idx="2">
+                              <a:schemeClr val="accent1">
+                                <a:shade val="50000"/>
+                              </a:schemeClr>
+                            </a:lnRef>
+                            <a:fillRef idx="1">
+                              <a:schemeClr val="accent1"/>
+                            </a:fillRef>
+                            <a:effectRef idx="0">
+                              <a:schemeClr val="accent1"/>
+                            </a:effectRef>
+                            <a:fontRef idx="minor">
+                              <a:schemeClr val="lt1"/>
+                            </a:fontRef>
+                          </wps:style>
+                          <wps:bodyPr rot="0" spcFirstLastPara="0" vertOverflow="overflow" horzOverflow="overflow" vert="horz" wrap="square" lIns="91440" tIns="45720" rIns="91440" bIns="45720" numCol="1" spcCol="0" rtlCol="0" fromWordArt="0" anchor="ctr" anchorCtr="0" forceAA="0" compatLnSpc="1">
+                            <a:prstTxWarp prst="textNoShape">
+                              <a:avLst/>
+                            </a:prstTxWarp>
+                            <a:noAutofit/>
+                          </wps:bodyPr>
+                        </wps:wsp>
+                        <wps:wsp>
+                          <wps:cNvPr id="30" name="Rectangle 19"/>
+                          <wps:cNvSpPr/>
+                          <wps:spPr>
+                            <a:xfrm>
+                              <a:off x="907140" y="0"/>
+                              <a:ext cx="91440" cy="365760"/>
+                            </a:xfrm>
+                            <a:prstGeom prst="rect">
+                              <a:avLst/>
+                            </a:prstGeom>
+                            <a:solidFill>
+                              <a:srgbClr val="984806"/>
+                            </a:solidFill>
+                            <a:ln>
+                              <a:noFill/>
+                            </a:ln>
+                          </wps:spPr>
+                          <wps:style>
+                            <a:lnRef idx="2">
+                              <a:schemeClr val="accent1">
+                                <a:shade val="50000"/>
+                              </a:schemeClr>
+                            </a:lnRef>
+                            <a:fillRef idx="1">
+                              <a:schemeClr val="accent1"/>
+                            </a:fillRef>
+                            <a:effectRef idx="0">
+                              <a:schemeClr val="accent1"/>
+                            </a:effectRef>
+                            <a:fontRef idx="minor">
+                              <a:schemeClr val="lt1"/>
+                            </a:fontRef>
+                          </wps:style>
+                          <wps:bodyPr rot="0" spcFirstLastPara="0" vertOverflow="overflow" horzOverflow="overflow" vert="horz" wrap="square" lIns="91440" tIns="45720" rIns="91440" bIns="45720" numCol="1" spcCol="0" rtlCol="0" fromWordArt="0" anchor="ctr" anchorCtr="0" forceAA="0" compatLnSpc="1">
+                            <a:prstTxWarp prst="textNoShape">
+                              <a:avLst/>
+                            </a:prstTxWarp>
+                            <a:noAutofit/>
+                          </wps:bodyPr>
+                        </wps:wsp>
+                      </wpg:grpSp>
+                      <wpg:grpSp>
+                        <wpg:cNvPr id="31" name="Group 31"/>
+                        <wpg:cNvGrpSpPr/>
+                        <wpg:grpSpPr>
                           <a:xfrm>
-                            <a:off x="510540" y="0"/>
-                            <a:ext cx="339725" cy="552450"/>
+                            <a:off x="6350" y="47625"/>
+                            <a:ext cx="911225" cy="304800"/>
+                            <a:chOff x="0" y="0"/>
+                            <a:chExt cx="911225" cy="304800"/>
                           </a:xfrm>
-                          <a:custGeom>
-                            <a:avLst/>
-                            <a:gdLst>
-                              <a:gd name="connsiteX0" fmla="*/ 0 w 663575"/>
-                              <a:gd name="connsiteY0" fmla="*/ 0 h 342900"/>
-                              <a:gd name="connsiteX1" fmla="*/ 0 w 663575"/>
-                              <a:gd name="connsiteY1" fmla="*/ 98425 h 342900"/>
-                              <a:gd name="connsiteX2" fmla="*/ 663575 w 663575"/>
-                              <a:gd name="connsiteY2" fmla="*/ 234950 h 342900"/>
-                              <a:gd name="connsiteX3" fmla="*/ 663575 w 663575"/>
-                              <a:gd name="connsiteY3" fmla="*/ 342900 h 342900"/>
-                            </a:gdLst>
-                            <a:ahLst/>
-                            <a:cxnLst>
-                              <a:cxn ang="0">
-                                <a:pos x="connsiteX0" y="connsiteY0"/>
-                              </a:cxn>
-                              <a:cxn ang="0">
-                                <a:pos x="connsiteX1" y="connsiteY1"/>
-                              </a:cxn>
-                              <a:cxn ang="0">
-                                <a:pos x="connsiteX2" y="connsiteY2"/>
-                              </a:cxn>
-                              <a:cxn ang="0">
-                                <a:pos x="connsiteX3" y="connsiteY3"/>
-                              </a:cxn>
-                            </a:cxnLst>
-                            <a:rect l="l" t="t" r="r" b="b"/>
-                            <a:pathLst>
-                              <a:path w="663575" h="342900">
-                                <a:moveTo>
-                                  <a:pt x="0" y="0"/>
-                                </a:moveTo>
-                                <a:lnTo>
-                                  <a:pt x="0" y="98425"/>
-                                </a:lnTo>
-                                <a:lnTo>
-                                  <a:pt x="663575" y="234950"/>
-                                </a:lnTo>
-                                <a:lnTo>
-                                  <a:pt x="663575" y="342900"/>
-                                </a:lnTo>
-                              </a:path>
-                            </a:pathLst>
-                          </a:custGeom>
-                          <a:ln w="12700">
-                            <a:prstDash val="sysDash"/>
-                            <a:headEnd type="none" w="sm" len="sm"/>
-                            <a:tailEnd type="arrow" w="sm" len="sm"/>
-                          </a:ln>
-                        </wps:spPr>
-                        <wps:style>
-                          <a:lnRef idx="1">
-                            <a:schemeClr val="dk1"/>
-                          </a:lnRef>
-                          <a:fillRef idx="0">
-                            <a:schemeClr val="dk1"/>
-                          </a:fillRef>
-                          <a:effectRef idx="0">
-                            <a:schemeClr val="dk1"/>
-                          </a:effectRef>
-                          <a:fontRef idx="minor">
-                            <a:schemeClr val="tx1"/>
-                          </a:fontRef>
-                        </wps:style>
-                        <wps:bodyPr rot="0" spcFirstLastPara="0" vertOverflow="overflow" horzOverflow="overflow" vert="horz" wrap="square" lIns="91440" tIns="45720" rIns="91440" bIns="45720" numCol="1" spcCol="0" rtlCol="0" fromWordArt="0" anchor="ctr" anchorCtr="0" forceAA="0" compatLnSpc="1">
-                          <a:prstTxWarp prst="textNoShape">
-                            <a:avLst/>
-                          </a:prstTxWarp>
-                          <a:noAutofit/>
-                        </wps:bodyPr>
-                      </wps:wsp>
-                      <wps:wsp>
-                        <wps:cNvPr id="39" name="Freeform 39"/>
-                        <wps:cNvSpPr/>
-                        <wps:spPr>
-                          <a:xfrm flipH="1">
-                            <a:off x="1211580" y="0"/>
-                            <a:ext cx="587375" cy="552450"/>
-                          </a:xfrm>
-                          <a:custGeom>
-                            <a:avLst/>
-                            <a:gdLst>
-                              <a:gd name="connsiteX0" fmla="*/ 0 w 663575"/>
-                              <a:gd name="connsiteY0" fmla="*/ 0 h 342900"/>
-                              <a:gd name="connsiteX1" fmla="*/ 0 w 663575"/>
-                              <a:gd name="connsiteY1" fmla="*/ 98425 h 342900"/>
-                              <a:gd name="connsiteX2" fmla="*/ 663575 w 663575"/>
-                              <a:gd name="connsiteY2" fmla="*/ 234950 h 342900"/>
-                              <a:gd name="connsiteX3" fmla="*/ 663575 w 663575"/>
-                              <a:gd name="connsiteY3" fmla="*/ 342900 h 342900"/>
-                            </a:gdLst>
-                            <a:ahLst/>
-                            <a:cxnLst>
-                              <a:cxn ang="0">
-                                <a:pos x="connsiteX0" y="connsiteY0"/>
-                              </a:cxn>
-                              <a:cxn ang="0">
-                                <a:pos x="connsiteX1" y="connsiteY1"/>
-                              </a:cxn>
-                              <a:cxn ang="0">
-                                <a:pos x="connsiteX2" y="connsiteY2"/>
-                              </a:cxn>
-                              <a:cxn ang="0">
-                                <a:pos x="connsiteX3" y="connsiteY3"/>
-                              </a:cxn>
-                            </a:cxnLst>
-                            <a:rect l="l" t="t" r="r" b="b"/>
-                            <a:pathLst>
-                              <a:path w="663575" h="342900">
-                                <a:moveTo>
-                                  <a:pt x="0" y="0"/>
-                                </a:moveTo>
-                                <a:lnTo>
-                                  <a:pt x="0" y="98425"/>
-                                </a:lnTo>
-                                <a:lnTo>
-                                  <a:pt x="663575" y="234950"/>
-                                </a:lnTo>
-                                <a:lnTo>
-                                  <a:pt x="663575" y="342900"/>
-                                </a:lnTo>
-                              </a:path>
-                            </a:pathLst>
-                          </a:custGeom>
-                          <a:ln w="12700">
-                            <a:prstDash val="sysDash"/>
-                            <a:headEnd type="none" w="sm" len="sm"/>
-                            <a:tailEnd type="arrow" w="sm" len="sm"/>
-                          </a:ln>
-                        </wps:spPr>
-                        <wps:style>
-                          <a:lnRef idx="1">
-                            <a:schemeClr val="dk1"/>
-                          </a:lnRef>
-                          <a:fillRef idx="0">
-                            <a:schemeClr val="dk1"/>
-                          </a:fillRef>
-                          <a:effectRef idx="0">
-                            <a:schemeClr val="dk1"/>
-                          </a:effectRef>
-                          <a:fontRef idx="minor">
-                            <a:schemeClr val="tx1"/>
-                          </a:fontRef>
-                        </wps:style>
-                        <wps:bodyPr rot="0" spcFirstLastPara="0" vertOverflow="overflow" horzOverflow="overflow" vert="horz" wrap="square" lIns="91440" tIns="45720" rIns="91440" bIns="45720" numCol="1" spcCol="0" rtlCol="0" fromWordArt="0" anchor="ctr" anchorCtr="0" forceAA="0" compatLnSpc="1">
-                          <a:prstTxWarp prst="textNoShape">
-                            <a:avLst/>
-                          </a:prstTxWarp>
-                          <a:noAutofit/>
-                        </wps:bodyPr>
-                      </wps:wsp>
-                      <wps:wsp>
-                        <wps:cNvPr id="40" name="Freeform 40"/>
-                        <wps:cNvSpPr/>
-                        <wps:spPr>
-                          <a:xfrm flipH="1">
-                            <a:off x="1478280" y="0"/>
-                            <a:ext cx="1390650" cy="552450"/>
-                          </a:xfrm>
-                          <a:custGeom>
-                            <a:avLst/>
-                            <a:gdLst>
-                              <a:gd name="connsiteX0" fmla="*/ 0 w 663575"/>
-                              <a:gd name="connsiteY0" fmla="*/ 0 h 342900"/>
-                              <a:gd name="connsiteX1" fmla="*/ 0 w 663575"/>
-                              <a:gd name="connsiteY1" fmla="*/ 98425 h 342900"/>
-                              <a:gd name="connsiteX2" fmla="*/ 663575 w 663575"/>
-                              <a:gd name="connsiteY2" fmla="*/ 234950 h 342900"/>
-                              <a:gd name="connsiteX3" fmla="*/ 663575 w 663575"/>
-                              <a:gd name="connsiteY3" fmla="*/ 342900 h 342900"/>
-                            </a:gdLst>
-                            <a:ahLst/>
-                            <a:cxnLst>
-                              <a:cxn ang="0">
-                                <a:pos x="connsiteX0" y="connsiteY0"/>
-                              </a:cxn>
-                              <a:cxn ang="0">
-                                <a:pos x="connsiteX1" y="connsiteY1"/>
-                              </a:cxn>
-                              <a:cxn ang="0">
-                                <a:pos x="connsiteX2" y="connsiteY2"/>
-                              </a:cxn>
-                              <a:cxn ang="0">
-                                <a:pos x="connsiteX3" y="connsiteY3"/>
-                              </a:cxn>
-                            </a:cxnLst>
-                            <a:rect l="l" t="t" r="r" b="b"/>
-                            <a:pathLst>
-                              <a:path w="663575" h="342900">
-                                <a:moveTo>
-                                  <a:pt x="0" y="0"/>
-                                </a:moveTo>
-                                <a:lnTo>
-                                  <a:pt x="0" y="98425"/>
-                                </a:lnTo>
-                                <a:lnTo>
-                                  <a:pt x="663575" y="234950"/>
-                                </a:lnTo>
-                                <a:lnTo>
-                                  <a:pt x="663575" y="342900"/>
-                                </a:lnTo>
-                              </a:path>
-                            </a:pathLst>
-                          </a:custGeom>
-                          <a:ln w="12700">
-                            <a:prstDash val="sysDash"/>
-                            <a:headEnd type="none" w="sm" len="sm"/>
-                            <a:tailEnd type="arrow" w="sm" len="sm"/>
-                          </a:ln>
-                        </wps:spPr>
-                        <wps:style>
-                          <a:lnRef idx="1">
-                            <a:schemeClr val="dk1"/>
-                          </a:lnRef>
-                          <a:fillRef idx="0">
-                            <a:schemeClr val="dk1"/>
-                          </a:fillRef>
-                          <a:effectRef idx="0">
-                            <a:schemeClr val="dk1"/>
-                          </a:effectRef>
-                          <a:fontRef idx="minor">
-                            <a:schemeClr val="tx1"/>
-                          </a:fontRef>
-                        </wps:style>
-                        <wps:bodyPr rot="0" spcFirstLastPara="0" vertOverflow="overflow" horzOverflow="overflow" vert="horz" wrap="square" lIns="91440" tIns="45720" rIns="91440" bIns="45720" numCol="1" spcCol="0" rtlCol="0" fromWordArt="0" anchor="ctr" anchorCtr="0" forceAA="0" compatLnSpc="1">
-                          <a:prstTxWarp prst="textNoShape">
-                            <a:avLst/>
-                          </a:prstTxWarp>
-                          <a:noAutofit/>
-                        </wps:bodyPr>
-                      </wps:wsp>
-                      <wps:wsp>
-                        <wps:cNvPr id="41" name="Straight Connector 41"/>
-                        <wps:cNvCnPr/>
-                        <wps:spPr>
-                          <a:xfrm>
-                            <a:off x="1026414" y="0"/>
-                            <a:ext cx="0" cy="548640"/>
-                          </a:xfrm>
-                          <a:prstGeom prst="line">
-                            <a:avLst/>
-                          </a:prstGeom>
-                          <a:ln w="12700">
-                            <a:prstDash val="sysDash"/>
-                            <a:headEnd type="none" w="sm" len="sm"/>
-                            <a:tailEnd type="arrow" w="sm" len="sm"/>
-                          </a:ln>
-                        </wps:spPr>
-                        <wps:style>
-                          <a:lnRef idx="1">
-                            <a:schemeClr val="dk1"/>
-                          </a:lnRef>
-                          <a:fillRef idx="0">
-                            <a:schemeClr val="dk1"/>
-                          </a:fillRef>
-                          <a:effectRef idx="0">
-                            <a:schemeClr val="dk1"/>
-                          </a:effectRef>
-                          <a:fontRef idx="minor">
-                            <a:schemeClr val="tx1"/>
-                          </a:fontRef>
-                        </wps:style>
-                        <wps:bodyPr/>
-                      </wps:wsp>
+                        </wpg:grpSpPr>
+                        <wps:wsp>
+                          <wps:cNvPr id="42" name="Text Box 26"/>
+                          <wps:cNvSpPr txBox="1"/>
+                          <wps:spPr>
+                            <a:xfrm>
+                              <a:off x="0" y="0"/>
+                              <a:ext cx="238125" cy="304800"/>
+                            </a:xfrm>
+                            <a:prstGeom prst="rect">
+                              <a:avLst/>
+                            </a:prstGeom>
+                            <a:noFill/>
+                            <a:ln w="6350">
+                              <a:noFill/>
+                            </a:ln>
+                          </wps:spPr>
+                          <wps:txbx>
+                            <w:txbxContent>
+                              <w:p>
+                                <w:pPr>
+                                  <w:rPr>
+                                    <w:color w:val="FFFFFF" w:themeColor="background1"/>
+                                    <w:sz w:val="20"/>
+                                    <w:szCs w:val="20"/>
+                                  </w:rPr>
+                                </w:pPr>
+                                <w:r>
+                                  <w:rPr>
+                                    <w:color w:val="FFFFFF" w:themeColor="background1"/>
+                                    <w:sz w:val="20"/>
+                                    <w:szCs w:val="20"/>
+                                  </w:rPr>
+                                  <w:t xml:space="preserve">2   </w:t>
+                                </w:r>
+                              </w:p>
+                            </w:txbxContent>
+                          </wps:txbx>
+                          <wps:bodyPr rot="0" spcFirstLastPara="0" vertOverflow="overflow" horzOverflow="overflow" vert="horz" wrap="square" lIns="91440" tIns="45720" rIns="91440" bIns="45720" numCol="1" spcCol="0" rtlCol="0" fromWordArt="0" anchor="b" anchorCtr="0" forceAA="0" compatLnSpc="1">
+                            <a:prstTxWarp prst="textNoShape">
+                              <a:avLst/>
+                            </a:prstTxWarp>
+                            <a:noAutofit/>
+                          </wps:bodyPr>
+                        </wps:wsp>
+                        <wps:wsp>
+                          <wps:cNvPr id="44" name="Text Box 28"/>
+                          <wps:cNvSpPr txBox="1"/>
+                          <wps:spPr>
+                            <a:xfrm>
+                              <a:off x="177800" y="0"/>
+                              <a:ext cx="260350" cy="304800"/>
+                            </a:xfrm>
+                            <a:prstGeom prst="rect">
+                              <a:avLst/>
+                            </a:prstGeom>
+                            <a:noFill/>
+                            <a:ln w="6350">
+                              <a:noFill/>
+                            </a:ln>
+                          </wps:spPr>
+                          <wps:txbx>
+                            <w:txbxContent>
+                              <w:p>
+                                <w:pPr>
+                                  <w:rPr>
+                                    <w:color w:val="FFFFFF" w:themeColor="background1"/>
+                                    <w:sz w:val="20"/>
+                                    <w:szCs w:val="20"/>
+                                  </w:rPr>
+                                </w:pPr>
+                                <w:r>
+                                  <w:rPr>
+                                    <w:color w:val="FFFFFF" w:themeColor="background1"/>
+                                    <w:sz w:val="20"/>
+                                    <w:szCs w:val="20"/>
+                                  </w:rPr>
+                                  <w:t>7</w:t>
+                                </w:r>
+                              </w:p>
+                            </w:txbxContent>
+                          </wps:txbx>
+                          <wps:bodyPr rot="0" spcFirstLastPara="0" vertOverflow="overflow" horzOverflow="overflow" vert="horz" wrap="square" lIns="91440" tIns="45720" rIns="91440" bIns="45720" numCol="1" spcCol="0" rtlCol="0" fromWordArt="0" anchor="ctr" anchorCtr="0" forceAA="0" compatLnSpc="1">
+                            <a:prstTxWarp prst="textNoShape">
+                              <a:avLst/>
+                            </a:prstTxWarp>
+                            <a:noAutofit/>
+                          </wps:bodyPr>
+                        </wps:wsp>
+                        <wps:wsp>
+                          <wps:cNvPr id="48" name="Text Box 29"/>
+                          <wps:cNvSpPr txBox="1"/>
+                          <wps:spPr>
+                            <a:xfrm>
+                              <a:off x="520700" y="0"/>
+                              <a:ext cx="390525" cy="304800"/>
+                            </a:xfrm>
+                            <a:prstGeom prst="rect">
+                              <a:avLst/>
+                            </a:prstGeom>
+                            <a:noFill/>
+                            <a:ln w="6350">
+                              <a:noFill/>
+                            </a:ln>
+                          </wps:spPr>
+                          <wps:txbx>
+                            <w:txbxContent>
+                              <w:p>
+                                <w:pPr>
+                                  <w:rPr>
+                                    <w:color w:val="FFFFFF" w:themeColor="background1"/>
+                                    <w:sz w:val="20"/>
+                                    <w:szCs w:val="20"/>
+                                  </w:rPr>
+                                </w:pPr>
+                                <m:oMath>
+                                  <m:r>
+                                    <w:rPr>
+                                      <w:rFonts w:ascii="Cambria Math" w:hAnsi="Cambria Math" w:cstheme="minorHAnsi"/>
+                                      <w:color w:val="FFFFFF" w:themeColor="background1"/>
+                                      <w:sz w:val="20"/>
+                                      <w:szCs w:val="20"/>
+                                    </w:rPr>
+                                    <m:t>×</m:t>
+                                  </m:r>
+                                </m:oMath>
+                                <w:r>
+                                  <w:rPr>
+                                    <w:rFonts w:eastAsiaTheme="minorEastAsia" w:cstheme="minorHAnsi"/>
+                                    <w:color w:val="FFFFFF" w:themeColor="background1"/>
+                                    <w:sz w:val="20"/>
+                                    <w:szCs w:val="20"/>
+                                  </w:rPr>
+                                  <w:t>1</w:t>
+                                </w:r>
+                              </w:p>
+                            </w:txbxContent>
+                          </wps:txbx>
+                          <wps:bodyPr rot="0" spcFirstLastPara="0" vertOverflow="overflow" horzOverflow="overflow" vert="horz" wrap="square" lIns="91440" tIns="45720" rIns="91440" bIns="45720" numCol="1" spcCol="0" rtlCol="0" fromWordArt="0" anchor="ctr" anchorCtr="0" forceAA="0" compatLnSpc="1">
+                            <a:prstTxWarp prst="textNoShape">
+                              <a:avLst/>
+                            </a:prstTxWarp>
+                            <a:noAutofit/>
+                          </wps:bodyPr>
+                        </wps:wsp>
+                        <wps:wsp>
+                          <wps:cNvPr id="49" name="Text Box 30"/>
+                          <wps:cNvSpPr txBox="1"/>
+                          <wps:spPr>
+                            <a:xfrm>
+                              <a:off x="358776" y="0"/>
+                              <a:ext cx="192024" cy="304800"/>
+                            </a:xfrm>
+                            <a:prstGeom prst="rect">
+                              <a:avLst/>
+                            </a:prstGeom>
+                            <a:noFill/>
+                            <a:ln w="6350">
+                              <a:noFill/>
+                            </a:ln>
+                          </wps:spPr>
+                          <wps:txbx>
+                            <w:txbxContent>
+                              <w:p>
+                                <w:pPr>
+                                  <w:rPr>
+                                    <w:color w:val="FFFFFF" w:themeColor="background1"/>
+                                    <w:sz w:val="20"/>
+                                    <w:szCs w:val="20"/>
+                                  </w:rPr>
+                                </w:pPr>
+                                <w:r>
+                                  <w:rPr>
+                                    <w:color w:val="FFFFFF" w:themeColor="background1"/>
+                                    <w:sz w:val="20"/>
+                                    <w:szCs w:val="20"/>
+                                  </w:rPr>
+                                  <w:t>5</w:t>
+                                </w:r>
+                                <w:sdt>
+                                  <w:sdtPr>
+                                    <w:rPr>
+                                      <w:rFonts w:ascii="Cambria Math" w:hAnsi="Cambria Math"/>
+                                      <w:i/>
+                                      <w:color w:val="FFFFFF" w:themeColor="background1"/>
+                                      <w:sz w:val="20"/>
+                                      <w:szCs w:val="20"/>
+                                    </w:rPr>
+                                    <w:id w:val="-1748876751"/>
+                                    <w:placeholder>
+                                      <w:docPart w:val="DefaultPlaceholder_2098659788"/>
+                                    </w:placeholder>
+                                    <w:temporary/>
+                                    <w:showingPlcHdr/>
+                                    <w:equation/>
+                                  </w:sdtPr>
+                                  <w:sdtContent>
+                                    <m:oMath>
+                                      <m:r>
+                                        <m:rPr>
+                                          <m:sty m:val="p"/>
+                                        </m:rPr>
+                                        <w:rPr>
+                                          <w:rStyle w:val="PlaceholderText"/>
+                                          <w:rFonts w:ascii="Cambria Math" w:hAnsi="Cambria Math"/>
+                                          <w:sz w:val="20"/>
+                                          <w:szCs w:val="20"/>
+                                        </w:rPr>
+                                        <m:t>Type equation here.</m:t>
+                                      </m:r>
+                                    </m:oMath>
+                                  </w:sdtContent>
+                                </w:sdt>
+                              </w:p>
+                            </w:txbxContent>
+                          </wps:txbx>
+                          <wps:bodyPr rot="0" spcFirstLastPara="0" vertOverflow="overflow" horzOverflow="overflow" vert="horz" wrap="square" lIns="91440" tIns="45720" rIns="91440" bIns="45720" numCol="1" spcCol="0" rtlCol="0" fromWordArt="0" anchor="ctr" anchorCtr="0" forceAA="0" compatLnSpc="1">
+                            <a:prstTxWarp prst="textNoShape">
+                              <a:avLst/>
+                            </a:prstTxWarp>
+                            <a:noAutofit/>
+                          </wps:bodyPr>
+                        </wps:wsp>
+                      </wpg:grpSp>
                     </wpg:wgp>
                   </a:graphicData>
                 </a:graphic>
-                <wp14:sizeRelV relativeFrom="margin">
-                  <wp14:pctHeight>0</wp14:pctHeight>
-                </wp14:sizeRelV>
               </wp:anchor>
             </w:drawing>
           </mc:Choice>
           <mc:Fallback>
             <w:pict>
-              <v:group w14:anchorId="2F493295" id="Group 50" o:spid="_x0000_s1026" style="position:absolute;margin-left:146.4pt;margin-top:146.2pt;width:225.9pt;height:36pt;z-index:251710464;mso-height-relative:margin" coordsize="28689,5524" o:gfxdata="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">
-                <v:shape id="Freeform 35" o:spid="_x0000_s1027" style="position:absolute;width:6635;height:5524;visibility:visible;mso-wrap-style:square;v-text-anchor:middle" coordsize="663575,342900" o:gfxdata="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" path="m,l,98425,663575,234950r,107950e" filled="f" strokecolor="black [3040]" strokeweight="1pt">
-                  <v:stroke dashstyle="3 1" startarrowwidth="narrow" startarrowlength="short" endarrow="open" endarrowwidth="narrow" endarrowlength="short"/>
-                  <v:path arrowok="t" o:connecttype="custom" o:connectlocs="0,0;0,158574;663575,378531;663575,552450" o:connectangles="0,0,0,0"/>
-                </v:shape>
-                <v:shape id="Freeform 38" o:spid="_x0000_s1028" style="position:absolute;left:5105;width:3397;height:5524;visibility:visible;mso-wrap-style:square;v-text-anchor:middle" coordsize="663575,342900" o:gfxdata="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" path="m,l,98425,663575,234950r,107950e" filled="f" strokecolor="black [3040]" strokeweight="1pt">
-                  <v:stroke dashstyle="3 1" startarrowwidth="narrow" startarrowlength="short" endarrow="open" endarrowwidth="narrow" endarrowlength="short"/>
-                  <v:path arrowok="t" o:connecttype="custom" o:connectlocs="0,0;0,158574;339725,378531;339725,552450" o:connectangles="0,0,0,0"/>
-                </v:shape>
-                <v:shape id="Freeform 39" o:spid="_x0000_s1029" style="position:absolute;left:12115;width:5874;height:5524;flip:x;visibility:visible;mso-wrap-style:square;v-text-anchor:middle" coordsize="663575,342900" o:gfxdata="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" path="m,l,98425,663575,234950r,107950e" filled="f" strokecolor="black [3040]" strokeweight="1pt">
-                  <v:stroke dashstyle="3 1" startarrowwidth="narrow" startarrowlength="short" endarrow="open" endarrowwidth="narrow" endarrowlength="short"/>
-                  <v:path arrowok="t" o:connecttype="custom" o:connectlocs="0,0;0,158574;587375,378531;587375,552450" o:connectangles="0,0,0,0"/>
-                </v:shape>
-                <v:shape id="Freeform 40" o:spid="_x0000_s1030" style="position:absolute;left:14782;width:13907;height:5524;flip:x;visibility:visible;mso-wrap-style:square;v-text-anchor:middle" coordsize="663575,342900" o:gfxdata="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" path="m,l,98425,663575,234950r,107950e" filled="f" strokecolor="black [3040]" strokeweight="1pt">
-                  <v:stroke dashstyle="3 1" startarrowwidth="narrow" startarrowlength="short" endarrow="open" endarrowwidth="narrow" endarrowlength="short"/>
-                  <v:path arrowok="t" o:connecttype="custom" o:connectlocs="0,0;0,158574;1390650,378531;1390650,552450" o:connectangles="0,0,0,0"/>
-                </v:shape>
-                <v:line id="Straight Connector 41" o:spid="_x0000_s1031" style="position:absolute;visibility:visible;mso-wrap-style:square" from="10264,0" to="10264,5486" o:connectortype="straight" o:gfxdata="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" strokecolor="black [3040]" strokeweight="1pt">
-                  <v:stroke dashstyle="3 1" startarrowwidth="narrow" startarrowlength="short" endarrow="open" endarrowwidth="narrow" endarrowlength="short"/>
-                </v:line>
+              <v:group w14:anchorId="6AAA0479" id="5 band resistor" o:spid="_x0000_s1028" style="position:absolute;margin-left:188.55pt;margin-top:184.45pt;width:85.8pt;height:28.8pt;z-index:251696128" coordsize="10896,3657" o:gfxdata="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">
+                <v:group id="Group 20" o:spid="_x0000_s1029" style="position:absolute;width:10896;height:3657" coordsize="10896,3657" o:gfxdata="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">
+                  <v:group id="Group 11" o:spid="_x0000_s1030" style="position:absolute;width:10896;height:3657" coordsize="10896,3657" o:gfxdata="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">
+                    <v:roundrect id="Rounded Rectangle 12" o:spid="_x0000_s1031" style="position:absolute;width:2743;height:3657;visibility:visible;mso-wrap-style:square;v-text-anchor:middle" arcsize="17704f" o:gfxdata="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" fillcolor="#00b0f0" stroked="f" strokeweight="2pt"/>
+                    <v:roundrect id="Rounded Rectangle 13" o:spid="_x0000_s1032" style="position:absolute;left:8153;width:2743;height:3657;visibility:visible;mso-wrap-style:square;v-text-anchor:middle" arcsize="19585f" o:gfxdata="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" fillcolor="#00b0f0" stroked="f" strokeweight="2pt"/>
+                    <v:rect id="Rectangle 14" o:spid="_x0000_s1033" style="position:absolute;left:2133;top:228;width:6648;height:3201;visibility:visible;mso-wrap-style:square;v-text-anchor:middle" o:gfxdata="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" fillcolor="#00b0f0" stroked="f" strokeweight="2pt"/>
+                  </v:group>
+                  <v:rect id="Rectangle 15" o:spid="_x0000_s1034" style="position:absolute;left:907;width:914;height:3657;visibility:visible;mso-wrap-style:square;v-text-anchor:middle" o:gfxdata="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" fillcolor="red" stroked="f" strokeweight="2pt"/>
+                  <v:rect id="Rectangle 16" o:spid="_x0000_s1035" style="position:absolute;left:6241;top:223;width:914;height:3200;visibility:visible;mso-wrap-style:square;v-text-anchor:middle" o:gfxdata="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" fillcolor="black [3213]" stroked="f" strokeweight="2pt"/>
+                  <v:rect id="Rectangle 17" o:spid="_x0000_s1036" style="position:absolute;left:2685;top:223;width:914;height:3200;visibility:visible;mso-wrap-style:square;v-text-anchor:middle" o:gfxdata="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" fillcolor="#7030a0" stroked="f" strokeweight="2pt"/>
+                  <v:rect id="Rectangle 18" o:spid="_x0000_s1037" style="position:absolute;left:4463;top:223;width:914;height:3200;visibility:visible;mso-wrap-style:square;v-text-anchor:middle" o:gfxdata="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" fillcolor="#00b050" stroked="f" strokeweight="2pt"/>
+                  <v:rect id="Rectangle 19" o:spid="_x0000_s1038" style="position:absolute;left:9071;width:914;height:3657;visibility:visible;mso-wrap-style:square;v-text-anchor:middle" o:gfxdata="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" fillcolor="#984806" stroked="f" strokeweight="2pt"/>
+                </v:group>
+                <v:group id="Group 31" o:spid="_x0000_s1039" style="position:absolute;left:63;top:476;width:9112;height:3048" coordsize="9112,3048" o:gfxdata="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">
+                  <v:shape id="Text Box 26" o:spid="_x0000_s1040" type="#_x0000_t202" style="position:absolute;width:2381;height:3048;visibility:visible;mso-wrap-style:square;v-text-anchor:bottom" o:gfxdata="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" filled="f" stroked="f" strokeweight=".5pt">
+                    <v:textbox>
+                      <w:txbxContent>
+                        <w:p>
+                          <w:pPr>
+                            <w:rPr>
+                              <w:color w:val="FFFFFF" w:themeColor="background1"/>
+                              <w:sz w:val="20"/>
+                              <w:szCs w:val="20"/>
+                            </w:rPr>
+                          </w:pPr>
+                          <w:r>
+                            <w:rPr>
+                              <w:color w:val="FFFFFF" w:themeColor="background1"/>
+                              <w:sz w:val="20"/>
+                              <w:szCs w:val="20"/>
+                            </w:rPr>
+                            <w:t xml:space="preserve">2   </w:t>
+                          </w:r>
+                        </w:p>
+                      </w:txbxContent>
+                    </v:textbox>
+                  </v:shape>
+                  <v:shape id="Text Box 28" o:spid="_x0000_s1041" type="#_x0000_t202" style="position:absolute;left:1778;width:2603;height:3048;visibility:visible;mso-wrap-style:square;v-text-anchor:middle" o:gfxdata="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" filled="f" stroked="f" strokeweight=".5pt">
+                    <v:textbox>
+                      <w:txbxContent>
+                        <w:p>
+                          <w:pPr>
+                            <w:rPr>
+                              <w:color w:val="FFFFFF" w:themeColor="background1"/>
+                              <w:sz w:val="20"/>
+                              <w:szCs w:val="20"/>
+                            </w:rPr>
+                          </w:pPr>
+                          <w:r>
+                            <w:rPr>
+                              <w:color w:val="FFFFFF" w:themeColor="background1"/>
+                              <w:sz w:val="20"/>
+                              <w:szCs w:val="20"/>
+                            </w:rPr>
+                            <w:t>7</w:t>
+                          </w:r>
+                        </w:p>
+                      </w:txbxContent>
+                    </v:textbox>
+                  </v:shape>
+                  <v:shape id="Text Box 29" o:spid="_x0000_s1042" type="#_x0000_t202" style="position:absolute;left:5207;width:3905;height:3048;visibility:visible;mso-wrap-style:square;v-text-anchor:middle" o:gfxdata="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" filled="f" stroked="f" strokeweight=".5pt">
+                    <v:textbox>
+                      <w:txbxContent>
+                        <w:p>
+                          <w:pPr>
+                            <w:rPr>
+                              <w:color w:val="FFFFFF" w:themeColor="background1"/>
+                              <w:sz w:val="20"/>
+                              <w:szCs w:val="20"/>
+                            </w:rPr>
+                          </w:pPr>
+                          <m:oMath>
+                            <m:r>
+                              <w:rPr>
+                                <w:rFonts w:ascii="Cambria Math" w:hAnsi="Cambria Math" w:cstheme="minorHAnsi"/>
+                                <w:color w:val="FFFFFF" w:themeColor="background1"/>
+                                <w:sz w:val="20"/>
+                                <w:szCs w:val="20"/>
+                              </w:rPr>
+                              <m:t>×</m:t>
+                            </m:r>
+                          </m:oMath>
+                          <w:r>
+                            <w:rPr>
+                              <w:rFonts w:eastAsiaTheme="minorEastAsia" w:cstheme="minorHAnsi"/>
+                              <w:color w:val="FFFFFF" w:themeColor="background1"/>
+                              <w:sz w:val="20"/>
+                              <w:szCs w:val="20"/>
+                            </w:rPr>
+                            <w:t>1</w:t>
+                          </w:r>
+                        </w:p>
+                      </w:txbxContent>
+                    </v:textbox>
+                  </v:shape>
+                  <v:shape id="Text Box 30" o:spid="_x0000_s1043" type="#_x0000_t202" style="position:absolute;left:3587;width:1921;height:3048;visibility:visible;mso-wrap-style:square;v-text-anchor:middle" o:gfxdata="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" filled="f" stroked="f" strokeweight=".5pt">
+                    <v:textbox>
+                      <w:txbxContent>
+                        <w:p>
+                          <w:pPr>
+                            <w:rPr>
+                              <w:color w:val="FFFFFF" w:themeColor="background1"/>
+                              <w:sz w:val="20"/>
+                              <w:szCs w:val="20"/>
+                            </w:rPr>
+                          </w:pPr>
+                          <w:r>
+                            <w:rPr>
+                              <w:color w:val="FFFFFF" w:themeColor="background1"/>
+                              <w:sz w:val="20"/>
+                              <w:szCs w:val="20"/>
+                            </w:rPr>
+                            <w:t>5</w:t>
+                          </w:r>
+                          <w:sdt>
+                            <w:sdtPr>
+                              <w:rPr>
+                                <w:rFonts w:ascii="Cambria Math" w:hAnsi="Cambria Math"/>
+                                <w:i/>
+                                <w:color w:val="FFFFFF" w:themeColor="background1"/>
+                                <w:sz w:val="20"/>
+                                <w:szCs w:val="20"/>
+                              </w:rPr>
+                              <w:id w:val="-1748876751"/>
+                              <w:placeholder>
+                                <w:docPart w:val="DefaultPlaceholder_2098659788"/>
+                              </w:placeholder>
+                              <w:temporary/>
+                              <w:showingPlcHdr/>
+                              <w:equation/>
+                            </w:sdtPr>
+                            <w:sdtContent>
+                              <m:oMath>
+                                <m:r>
+                                  <m:rPr>
+                                    <m:sty m:val="p"/>
+                                  </m:rPr>
+                                  <w:rPr>
+                                    <w:rStyle w:val="PlaceholderText"/>
+                                    <w:rFonts w:ascii="Cambria Math" w:hAnsi="Cambria Math"/>
+                                    <w:sz w:val="20"/>
+                                    <w:szCs w:val="20"/>
+                                  </w:rPr>
+                                  <m:t>Type equation here.</m:t>
+                                </m:r>
+                              </m:oMath>
+                            </w:sdtContent>
+                          </w:sdt>
+                        </w:p>
+                      </w:txbxContent>
+                    </v:textbox>
+                  </v:shape>
+                </v:group>
               </v:group>
             </w:pict>
           </mc:Fallback>
@@ -3760,13 +4861,13 @@
         <mc:AlternateContent>
           <mc:Choice Requires="wpg">
             <w:drawing>
-              <wp:anchor distT="0" distB="0" distL="114300" distR="114300" simplePos="0" relativeHeight="251701248" behindDoc="0" locked="0" layoutInCell="1" allowOverlap="1">
+              <wp:anchor distT="0" distB="0" distL="114300" distR="114300" simplePos="0" relativeHeight="251701248" behindDoc="0" locked="0" layoutInCell="1" allowOverlap="1" wp14:anchorId="0B459135" wp14:editId="57BBAFD9">
                 <wp:simplePos x="0" y="0"/>
                 <wp:positionH relativeFrom="column">
-                  <wp:posOffset>2393950</wp:posOffset>
+                  <wp:posOffset>2394857</wp:posOffset>
                 </wp:positionH>
                 <wp:positionV relativeFrom="paragraph">
-                  <wp:posOffset>3007995</wp:posOffset>
+                  <wp:posOffset>3006634</wp:posOffset>
                 </wp:positionV>
                 <wp:extent cx="1089660" cy="365125"/>
                 <wp:effectExtent l="0" t="0" r="0" b="0"/>
@@ -4063,7 +5164,7 @@
                           <wps:cNvSpPr/>
                           <wps:spPr>
                             <a:xfrm>
-                              <a:off x="700314" y="22345"/>
+                              <a:off x="719361" y="22345"/>
                               <a:ext cx="91440" cy="320040"/>
                             </a:xfrm>
                             <a:prstGeom prst="rect">
@@ -4162,7 +5263,6 @@
                                     <w:showingPlcHdr/>
                                     <w:equation/>
                                   </w:sdtPr>
-                                  <w:sdtEndPr/>
                                   <w:sdtContent>
                                     <m:oMath>
                                       <m:r>
@@ -4299,24 +5399,20 @@
           </mc:Choice>
           <mc:Fallback>
             <w:pict>
-              <v:group id="4 band resistor" o:spid="_x0000_s1026" style="position:absolute;margin-left:188.5pt;margin-top:236.85pt;width:85.8pt;height:28.75pt;z-index:251701248" coordsize="10896,3663" o:gfxdata="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">
-                <v:group id="Group 21" o:spid="_x0000_s1027" style="position:absolute;width:10896;height:3663" coordsize="10896,3663" o:gfxdata="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">
-                  <v:group id="Group 6" o:spid="_x0000_s1028" style="position:absolute;width:10896;height:3657" coordsize="10896,3657" o:gfxdata="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">
-                    <v:roundrect id="Rounded Rectangle 3" o:spid="_x0000_s1029" style="position:absolute;width:2743;height:3657;visibility:visible;mso-wrap-style:square;v-text-anchor:middle" arcsize="17704f" o:gfxdata="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" fillcolor="#e5b671" stroked="f" strokeweight="2pt"/>
-                    <v:roundrect id="Rounded Rectangle 4" o:spid="_x0000_s1030" style="position:absolute;left:8153;width:2743;height:3657;visibility:visible;mso-wrap-style:square;v-text-anchor:middle" arcsize="19585f" o:gfxdata="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" fillcolor="#e5b671" stroked="f" strokeweight="2pt"/>
-                    <v:rect id="Rectangle 5" o:spid="_x0000_s1031" style="position:absolute;left:2133;top:228;width:6648;height:3201;visibility:visible;mso-wrap-style:square;v-text-anchor:middle" o:gfxdata="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" fillcolor="#e5b671" stroked="f" strokeweight="2pt"/>
+              <v:group w14:anchorId="0B459135" id="4 band resistor" o:spid="_x0000_s1044" style="position:absolute;margin-left:188.55pt;margin-top:236.75pt;width:85.8pt;height:28.75pt;z-index:251701248" coordsize="10896,3663" o:gfxdata="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">
+                <v:group id="Group 21" o:spid="_x0000_s1045" style="position:absolute;width:10896;height:3663" coordsize="10896,3663" o:gfxdata="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">
+                  <v:group id="Group 6" o:spid="_x0000_s1046" style="position:absolute;width:10896;height:3657" coordsize="10896,3657" o:gfxdata="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">
+                    <v:roundrect id="Rounded Rectangle 3" o:spid="_x0000_s1047" style="position:absolute;width:2743;height:3657;visibility:visible;mso-wrap-style:square;v-text-anchor:middle" arcsize="17704f" o:gfxdata="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" fillcolor="#e5b671" stroked="f" strokeweight="2pt"/>
+                    <v:roundrect id="Rounded Rectangle 4" o:spid="_x0000_s1048" style="position:absolute;left:8153;width:2743;height:3657;visibility:visible;mso-wrap-style:square;v-text-anchor:middle" arcsize="19585f" o:gfxdata="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" fillcolor="#e5b671" stroked="f" strokeweight="2pt"/>
+                    <v:rect id="Rectangle 5" o:spid="_x0000_s1049" style="position:absolute;left:2133;top:228;width:6648;height:3201;visibility:visible;mso-wrap-style:square;v-text-anchor:middle" o:gfxdata="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" fillcolor="#e5b671" stroked="f" strokeweight="2pt"/>
                   </v:group>
-                  <v:rect id="Rectangle 7" o:spid="_x0000_s1032" style="position:absolute;left:870;top:5;width:915;height:3658;visibility:visible;mso-wrap-style:square;v-text-anchor:middle" o:gfxdata="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" fillcolor="#984806" stroked="f" strokeweight="2pt"/>
-                  <v:rect id="Rectangle 8" o:spid="_x0000_s1033" style="position:absolute;left:4426;top:223;width:915;height:3200;visibility:visible;mso-wrap-style:square;v-text-anchor:middle" o:gfxdata="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" fillcolor="red" stroked="f" strokeweight="2pt"/>
-                  <v:rect id="Rectangle 9" o:spid="_x0000_s1034" style="position:absolute;left:2721;top:223;width:914;height:3200;visibility:visible;mso-wrap-style:square;v-text-anchor:middle" o:gfxdata="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" fillcolor="black [3213]" stroked="f" strokeweight="2pt"/>
-                  <v:rect id="Rectangle 10" o:spid="_x0000_s1035" style="position:absolute;left:7003;top:223;width:914;height:3200;visibility:visible;mso-wrap-style:square;v-text-anchor:middle" o:gfxdata="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" fillcolor="#ffdc00" stroked="f" strokeweight="2pt"/>
+                  <v:rect id="Rectangle 7" o:spid="_x0000_s1050" style="position:absolute;left:870;top:5;width:915;height:3658;visibility:visible;mso-wrap-style:square;v-text-anchor:middle" o:gfxdata="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" fillcolor="#984806" stroked="f" strokeweight="2pt"/>
+                  <v:rect id="Rectangle 8" o:spid="_x0000_s1051" style="position:absolute;left:4426;top:223;width:915;height:3200;visibility:visible;mso-wrap-style:square;v-text-anchor:middle" o:gfxdata="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" fillcolor="red" stroked="f" strokeweight="2pt"/>
+                  <v:rect id="Rectangle 9" o:spid="_x0000_s1052" style="position:absolute;left:2721;top:223;width:914;height:3200;visibility:visible;mso-wrap-style:square;v-text-anchor:middle" o:gfxdata="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" fillcolor="black [3213]" stroked="f" strokeweight="2pt"/>
+                  <v:rect id="Rectangle 10" o:spid="_x0000_s1053" style="position:absolute;left:7193;top:223;width:915;height:3200;visibility:visible;mso-wrap-style:square;v-text-anchor:middle" o:gfxdata="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" fillcolor="#ffdc00" stroked="f" strokeweight="2pt"/>
                 </v:group>
-                <v:group id="Group 34" o:spid="_x0000_s1036" style="position:absolute;left:63;top:539;width:8435;height:3080" coordsize="8434,3079" o:gfxdata="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">
-                  <v:shapetype id="_x0000_t202" coordsize="21600,21600" o:spt="202" path="m,l,21600r21600,l21600,xe">
-                    <v:stroke joinstyle="miter"/>
-                    <v:path gradientshapeok="t" o:connecttype="rect"/>
-                  </v:shapetype>
-                  <v:shape id="Text Box 27" o:spid="_x0000_s1037" type="#_x0000_t202" style="position:absolute;top:31;width:2730;height:3048;visibility:visible;mso-wrap-style:square;v-text-anchor:top" o:gfxdata="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" filled="f" stroked="f" strokeweight=".5pt">
+                <v:group id="Group 34" o:spid="_x0000_s1054" style="position:absolute;left:63;top:539;width:8435;height:3080" coordsize="8434,3079" o:gfxdata="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">
+                  <v:shape id="Text Box 27" o:spid="_x0000_s1055" type="#_x0000_t202" style="position:absolute;top:31;width:2730;height:3048;visibility:visible;mso-wrap-style:square;v-text-anchor:top" o:gfxdata="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" filled="f" stroked="f" strokeweight=".5pt">
                     <v:textbox>
                       <w:txbxContent>
                         <w:p>
@@ -4352,7 +5448,6 @@
                               <w:showingPlcHdr/>
                               <w:equation/>
                             </w:sdtPr>
-                            <w:sdtEndPr/>
                             <w:sdtContent>
                               <m:oMath>
                                 <m:r>
@@ -4374,7 +5469,7 @@
                       </w:txbxContent>
                     </v:textbox>
                   </v:shape>
-                  <v:shape id="Text Box 32" o:spid="_x0000_s1038" type="#_x0000_t202" style="position:absolute;left:1852;top:31;width:2381;height:3048;visibility:visible;mso-wrap-style:square;v-text-anchor:top" o:gfxdata="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" filled="f" stroked="f" strokeweight=".5pt">
+                  <v:shape id="Text Box 32" o:spid="_x0000_s1056" type="#_x0000_t202" style="position:absolute;left:1852;top:31;width:2381;height:3048;visibility:visible;mso-wrap-style:square;v-text-anchor:top" o:gfxdata="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" filled="f" stroked="f" strokeweight=".5pt">
                     <v:textbox>
                       <w:txbxContent>
                         <w:p>
@@ -4397,7 +5492,7 @@
                       </w:txbxContent>
                     </v:textbox>
                   </v:shape>
-                  <v:shape id="Text Box 33" o:spid="_x0000_s1039" type="#_x0000_t202" style="position:absolute;left:3418;width:5016;height:3048;visibility:visible;mso-wrap-style:square;v-text-anchor:top" o:gfxdata="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" filled="f" stroked="f" strokeweight=".5pt">
+                  <v:shape id="Text Box 33" o:spid="_x0000_s1057" type="#_x0000_t202" style="position:absolute;left:3418;width:5016;height:3048;visibility:visible;mso-wrap-style:square;v-text-anchor:top" o:gfxdata="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" filled="f" stroked="f" strokeweight=".5pt">
                     <v:textbox>
                       <w:txbxContent>
                         <w:p>
@@ -4448,18 +5543,18 @@
         <mc:AlternateContent>
           <mc:Choice Requires="wps">
             <w:drawing>
-              <wp:anchor distT="0" distB="0" distL="114300" distR="114300" simplePos="0" relativeHeight="251685888" behindDoc="0" locked="0" layoutInCell="1" allowOverlap="1" wp14:anchorId="43FE820A" wp14:editId="15CF95DF">
+              <wp:anchor distT="0" distB="0" distL="114300" distR="114300" simplePos="0" relativeHeight="251683840" behindDoc="0" locked="0" layoutInCell="1" allowOverlap="1" wp14:anchorId="60C2C490" wp14:editId="0D27A6FD">
                 <wp:simplePos x="0" y="0"/>
                 <wp:positionH relativeFrom="column">
-                  <wp:posOffset>3486150</wp:posOffset>
+                  <wp:posOffset>922655</wp:posOffset>
                 </wp:positionH>
                 <wp:positionV relativeFrom="paragraph">
-                  <wp:posOffset>3058795</wp:posOffset>
+                  <wp:posOffset>2913380</wp:posOffset>
                 </wp:positionV>
-                <wp:extent cx="1162050" cy="274320"/>
+                <wp:extent cx="1388110" cy="557893"/>
                 <wp:effectExtent l="0" t="0" r="0" b="0"/>
                 <wp:wrapNone/>
-                <wp:docPr id="25" name="Text Box 25"/>
+                <wp:docPr id="24" name="Text Box 24"/>
                 <wp:cNvGraphicFramePr/>
                 <a:graphic xmlns:a="http://schemas.openxmlformats.org/drawingml/2006/main">
                   <a:graphicData uri="http://schemas.microsoft.com/office/word/2010/wordprocessingShape">
@@ -4468,7 +5563,7 @@
                       <wps:spPr>
                         <a:xfrm>
                           <a:off x="0" y="0"/>
-                          <a:ext cx="1162050" cy="274320"/>
+                          <a:ext cx="1388110" cy="557893"/>
                         </a:xfrm>
                         <a:prstGeom prst="rect">
                           <a:avLst/>
@@ -4483,63 +5578,130 @@
                           <w:p>
                             <w:pPr>
                               <w:spacing w:after="0" w:line="240" w:lineRule="auto"/>
+                              <w:jc w:val="right"/>
                               <w:rPr>
-                                <w:rFonts w:eastAsiaTheme="minorEastAsia" w:cstheme="minorHAnsi"/>
-                                <w:color w:val="000000" w:themeColor="text1"/>
+                                <w:b/>
+                                <w:bCs/>
                                 <w:sz w:val="20"/>
                                 <w:szCs w:val="20"/>
                               </w:rPr>
                             </w:pPr>
                             <w:r>
                               <w:rPr>
-                                <w:rFonts w:eastAsiaTheme="minorEastAsia" w:cstheme="minorHAnsi"/>
-                                <w:color w:val="000000" w:themeColor="text1"/>
+                                <w:b/>
+                                <w:bCs/>
                                 <w:sz w:val="20"/>
                                 <w:szCs w:val="20"/>
                               </w:rPr>
-                              <w:t>=</w:t>
+                              <w:t>F</w:t>
                             </w:r>
                             <w:r>
                               <w:rPr>
-                                <w:rFonts w:eastAsiaTheme="minorEastAsia" w:cstheme="minorHAnsi"/>
-                                <w:color w:val="000000" w:themeColor="text1"/>
+                                <w:b/>
+                                <w:bCs/>
+                                <w:sz w:val="20"/>
+                                <w:szCs w:val="20"/>
+                              </w:rPr>
+                              <w:t>our</w:t>
+                            </w:r>
+                            <w:r>
+                              <w:rPr>
+                                <w:b/>
+                                <w:bCs/>
+                                <w:sz w:val="20"/>
+                                <w:szCs w:val="20"/>
+                              </w:rPr>
+                              <w:t xml:space="preserve">-band resistors: </w:t>
+                            </w:r>
+                          </w:p>
+                          <w:p>
+                            <w:pPr>
+                              <w:spacing w:after="0" w:line="240" w:lineRule="auto"/>
+                              <w:jc w:val="right"/>
+                              <w:rPr>
+                                <w:sz w:val="20"/>
+                                <w:szCs w:val="20"/>
+                              </w:rPr>
+                            </w:pPr>
+                            <w:r>
+                              <w:rPr>
+                                <w:sz w:val="20"/>
+                                <w:szCs w:val="20"/>
+                              </w:rPr>
+                              <w:t>2</w:t>
+                            </w:r>
+                            <w:r>
+                              <w:rPr>
+                                <w:sz w:val="20"/>
+                                <w:szCs w:val="20"/>
+                              </w:rPr>
+                              <w:t xml:space="preserve"> digits</w:t>
+                            </w:r>
+                            <w:r>
+                              <w:rPr>
                                 <w:sz w:val="20"/>
                                 <w:szCs w:val="20"/>
                               </w:rPr>
                               <w:t xml:space="preserve"> </w:t>
                             </w:r>
+                            <m:oMath>
+                              <m:r>
+                                <w:rPr>
+                                  <w:rFonts w:ascii="Cambria Math" w:hAnsi="Cambria Math"/>
+                                  <w:sz w:val="20"/>
+                                  <w:szCs w:val="20"/>
+                                </w:rPr>
+                                <m:t>×</m:t>
+                              </m:r>
+                            </m:oMath>
                             <w:r>
                               <w:rPr>
-                                <w:rFonts w:eastAsiaTheme="minorEastAsia" w:cstheme="minorHAnsi"/>
-                                <w:color w:val="000000" w:themeColor="text1"/>
                                 <w:sz w:val="20"/>
                                 <w:szCs w:val="20"/>
                               </w:rPr>
-                              <w:t>1000 Ω ±</w:t>
-                            </w:r>
-                            <w:r>
-                              <w:rPr>
-                                <w:rFonts w:eastAsiaTheme="minorEastAsia" w:cstheme="minorHAnsi"/>
-                                <w:color w:val="000000" w:themeColor="text1"/>
-                                <w:sz w:val="20"/>
-                                <w:szCs w:val="20"/>
-                              </w:rPr>
-                              <w:t xml:space="preserve"> </w:t>
-                            </w:r>
-                            <w:r>
-                              <w:rPr>
-                                <w:rFonts w:eastAsiaTheme="minorEastAsia" w:cstheme="minorHAnsi"/>
-                                <w:color w:val="000000" w:themeColor="text1"/>
-                                <w:sz w:val="20"/>
-                                <w:szCs w:val="20"/>
-                              </w:rPr>
-                              <w:t xml:space="preserve">5% </w:t>
+                              <w:t xml:space="preserve"> multiplier</w:t>
                             </w:r>
                           </w:p>
                           <w:p>
                             <w:pPr>
+                              <w:spacing w:after="0" w:line="240" w:lineRule="auto"/>
+                              <w:jc w:val="right"/>
                               <w:rPr>
-                                <w:color w:val="000000" w:themeColor="text1"/>
+                                <w:sz w:val="20"/>
+                                <w:szCs w:val="20"/>
+                              </w:rPr>
+                            </w:pPr>
+                            <m:oMath>
+                              <m:r>
+                                <w:rPr>
+                                  <w:rFonts w:ascii="Cambria Math" w:hAnsi="Cambria Math"/>
+                                  <w:sz w:val="20"/>
+                                  <w:szCs w:val="20"/>
+                                </w:rPr>
+                                <m:t>±</m:t>
+                              </m:r>
+                              <m:r>
+                                <w:rPr>
+                                  <w:rFonts w:ascii="Cambria Math" w:hAnsi="Cambria Math"/>
+                                  <w:sz w:val="20"/>
+                                  <w:szCs w:val="20"/>
+                                </w:rPr>
+                                <m:t xml:space="preserve"> </m:t>
+                              </m:r>
+                            </m:oMath>
+                            <w:r>
+                              <w:rPr>
+                                <w:sz w:val="20"/>
+                                <w:szCs w:val="20"/>
+                              </w:rPr>
+                              <w:t>tolerance</w:t>
+                            </w:r>
+                          </w:p>
+                          <w:p>
+                            <w:pPr>
+                              <w:spacing w:after="0" w:line="240" w:lineRule="auto"/>
+                              <w:jc w:val="right"/>
+                              <w:rPr>
                                 <w:sz w:val="20"/>
                                 <w:szCs w:val="20"/>
                               </w:rPr>
@@ -4567,69 +5729,136 @@
           </mc:Choice>
           <mc:Fallback>
             <w:pict>
-              <v:shape w14:anchorId="43FE820A" id="Text Box 25" o:spid="_x0000_s1040" type="#_x0000_t202" style="position:absolute;margin-left:274.5pt;margin-top:240.85pt;width:91.5pt;height:21.6pt;z-index:251685888;visibility:visible;mso-wrap-style:square;mso-width-percent:0;mso-height-percent:0;mso-wrap-distance-left:9pt;mso-wrap-distance-top:0;mso-wrap-distance-right:9pt;mso-wrap-distance-bottom:0;mso-position-horizontal:absolute;mso-position-horizontal-relative:text;mso-position-vertical:absolute;mso-position-vertical-relative:text;mso-width-percent:0;mso-height-percent:0;mso-width-relative:margin;mso-height-relative:margin;v-text-anchor:top" o:gfxdata="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" filled="f" stroked="f" strokeweight=".5pt">
+              <v:shape w14:anchorId="60C2C490" id="Text Box 24" o:spid="_x0000_s1058" type="#_x0000_t202" style="position:absolute;margin-left:72.65pt;margin-top:229.4pt;width:109.3pt;height:43.95pt;z-index:251683840;visibility:visible;mso-wrap-style:square;mso-width-percent:0;mso-height-percent:0;mso-wrap-distance-left:9pt;mso-wrap-distance-top:0;mso-wrap-distance-right:9pt;mso-wrap-distance-bottom:0;mso-position-horizontal:absolute;mso-position-horizontal-relative:text;mso-position-vertical:absolute;mso-position-vertical-relative:text;mso-width-percent:0;mso-height-percent:0;mso-width-relative:margin;mso-height-relative:margin;v-text-anchor:top" o:gfxdata="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" filled="f" stroked="f" strokeweight=".5pt">
                 <v:textbox>
                   <w:txbxContent>
                     <w:p>
                       <w:pPr>
                         <w:spacing w:after="0" w:line="240" w:lineRule="auto"/>
+                        <w:jc w:val="right"/>
                         <w:rPr>
-                          <w:rFonts w:eastAsiaTheme="minorEastAsia" w:cstheme="minorHAnsi"/>
-                          <w:color w:val="000000" w:themeColor="text1"/>
+                          <w:b/>
+                          <w:bCs/>
                           <w:sz w:val="20"/>
                           <w:szCs w:val="20"/>
                         </w:rPr>
                       </w:pPr>
                       <w:r>
                         <w:rPr>
-                          <w:rFonts w:eastAsiaTheme="minorEastAsia" w:cstheme="minorHAnsi"/>
-                          <w:color w:val="000000" w:themeColor="text1"/>
+                          <w:b/>
+                          <w:bCs/>
                           <w:sz w:val="20"/>
                           <w:szCs w:val="20"/>
                         </w:rPr>
-                        <w:t>=</w:t>
+                        <w:t>F</w:t>
                       </w:r>
                       <w:r>
                         <w:rPr>
-                          <w:rFonts w:eastAsiaTheme="minorEastAsia" w:cstheme="minorHAnsi"/>
-                          <w:color w:val="000000" w:themeColor="text1"/>
+                          <w:b/>
+                          <w:bCs/>
+                          <w:sz w:val="20"/>
+                          <w:szCs w:val="20"/>
+                        </w:rPr>
+                        <w:t>our</w:t>
+                      </w:r>
+                      <w:r>
+                        <w:rPr>
+                          <w:b/>
+                          <w:bCs/>
+                          <w:sz w:val="20"/>
+                          <w:szCs w:val="20"/>
+                        </w:rPr>
+                        <w:t xml:space="preserve">-band resistors: </w:t>
+                      </w:r>
+                    </w:p>
+                    <w:p>
+                      <w:pPr>
+                        <w:spacing w:after="0" w:line="240" w:lineRule="auto"/>
+                        <w:jc w:val="right"/>
+                        <w:rPr>
+                          <w:sz w:val="20"/>
+                          <w:szCs w:val="20"/>
+                        </w:rPr>
+                      </w:pPr>
+                      <w:r>
+                        <w:rPr>
+                          <w:sz w:val="20"/>
+                          <w:szCs w:val="20"/>
+                        </w:rPr>
+                        <w:t>2</w:t>
+                      </w:r>
+                      <w:r>
+                        <w:rPr>
+                          <w:sz w:val="20"/>
+                          <w:szCs w:val="20"/>
+                        </w:rPr>
+                        <w:t xml:space="preserve"> digits</w:t>
+                      </w:r>
+                      <w:r>
+                        <w:rPr>
                           <w:sz w:val="20"/>
                           <w:szCs w:val="20"/>
                         </w:rPr>
                         <w:t xml:space="preserve"> </w:t>
                       </w:r>
+                      <m:oMath>
+                        <m:r>
+                          <w:rPr>
+                            <w:rFonts w:ascii="Cambria Math" w:hAnsi="Cambria Math"/>
+                            <w:sz w:val="20"/>
+                            <w:szCs w:val="20"/>
+                          </w:rPr>
+                          <m:t>×</m:t>
+                        </m:r>
+                      </m:oMath>
                       <w:r>
                         <w:rPr>
-                          <w:rFonts w:eastAsiaTheme="minorEastAsia" w:cstheme="minorHAnsi"/>
-                          <w:color w:val="000000" w:themeColor="text1"/>
                           <w:sz w:val="20"/>
                           <w:szCs w:val="20"/>
                         </w:rPr>
-                        <w:t>1000 Ω ±</w:t>
-                      </w:r>
-                      <w:r>
-                        <w:rPr>
-                          <w:rFonts w:eastAsiaTheme="minorEastAsia" w:cstheme="minorHAnsi"/>
-                          <w:color w:val="000000" w:themeColor="text1"/>
-                          <w:sz w:val="20"/>
-                          <w:szCs w:val="20"/>
-                        </w:rPr>
-                        <w:t xml:space="preserve"> </w:t>
-                      </w:r>
-                      <w:r>
-                        <w:rPr>
-                          <w:rFonts w:eastAsiaTheme="minorEastAsia" w:cstheme="minorHAnsi"/>
-                          <w:color w:val="000000" w:themeColor="text1"/>
-                          <w:sz w:val="20"/>
-                          <w:szCs w:val="20"/>
-                        </w:rPr>
-                        <w:t xml:space="preserve">5% </w:t>
+                        <w:t xml:space="preserve"> multiplier</w:t>
                       </w:r>
                     </w:p>
                     <w:p>
                       <w:pPr>
+                        <w:spacing w:after="0" w:line="240" w:lineRule="auto"/>
+                        <w:jc w:val="right"/>
                         <w:rPr>
-                          <w:color w:val="000000" w:themeColor="text1"/>
+                          <w:sz w:val="20"/>
+                          <w:szCs w:val="20"/>
+                        </w:rPr>
+                      </w:pPr>
+                      <m:oMath>
+                        <m:r>
+                          <w:rPr>
+                            <w:rFonts w:ascii="Cambria Math" w:hAnsi="Cambria Math"/>
+                            <w:sz w:val="20"/>
+                            <w:szCs w:val="20"/>
+                          </w:rPr>
+                          <m:t>±</m:t>
+                        </m:r>
+                        <m:r>
+                          <w:rPr>
+                            <w:rFonts w:ascii="Cambria Math" w:hAnsi="Cambria Math"/>
+                            <w:sz w:val="20"/>
+                            <w:szCs w:val="20"/>
+                          </w:rPr>
+                          <m:t xml:space="preserve"> </m:t>
+                        </m:r>
+                      </m:oMath>
+                      <w:r>
+                        <w:rPr>
+                          <w:sz w:val="20"/>
+                          <w:szCs w:val="20"/>
+                        </w:rPr>
+                        <w:t>tolerance</w:t>
+                      </w:r>
+                    </w:p>
+                    <w:p>
+                      <w:pPr>
+                        <w:spacing w:after="0" w:line="240" w:lineRule="auto"/>
+                        <w:jc w:val="right"/>
+                        <w:rPr>
                           <w:sz w:val="20"/>
                           <w:szCs w:val="20"/>
                         </w:rPr>
@@ -4652,18 +5881,18 @@
         <mc:AlternateContent>
           <mc:Choice Requires="wps">
             <w:drawing>
-              <wp:anchor distT="0" distB="0" distL="114300" distR="114300" simplePos="0" relativeHeight="251683840" behindDoc="0" locked="0" layoutInCell="1" allowOverlap="1" wp14:anchorId="24C3380E" wp14:editId="704A42C1">
+              <wp:anchor distT="0" distB="0" distL="114300" distR="114300" simplePos="0" relativeHeight="251679744" behindDoc="0" locked="0" layoutInCell="1" allowOverlap="1" wp14:anchorId="1787AA4B" wp14:editId="453DE1DF">
                 <wp:simplePos x="0" y="0"/>
                 <wp:positionH relativeFrom="column">
-                  <wp:posOffset>1002030</wp:posOffset>
+                  <wp:posOffset>963930</wp:posOffset>
                 </wp:positionH>
                 <wp:positionV relativeFrom="paragraph">
-                  <wp:posOffset>3058160</wp:posOffset>
+                  <wp:posOffset>2232025</wp:posOffset>
                 </wp:positionV>
-                <wp:extent cx="1388110" cy="274320"/>
-                <wp:effectExtent l="0" t="0" r="0" b="0"/>
+                <wp:extent cx="1347470" cy="603250"/>
+                <wp:effectExtent l="0" t="0" r="0" b="6350"/>
                 <wp:wrapNone/>
-                <wp:docPr id="24" name="Text Box 24"/>
+                <wp:docPr id="22" name="Text Box 22"/>
                 <wp:cNvGraphicFramePr/>
                 <a:graphic xmlns:a="http://schemas.openxmlformats.org/drawingml/2006/main">
                   <a:graphicData uri="http://schemas.microsoft.com/office/word/2010/wordprocessingShape">
@@ -4672,7 +5901,7 @@
                       <wps:spPr>
                         <a:xfrm>
                           <a:off x="0" y="0"/>
-                          <a:ext cx="1388110" cy="274320"/>
+                          <a:ext cx="1347470" cy="603250"/>
                         </a:xfrm>
                         <a:prstGeom prst="rect">
                           <a:avLst/>
@@ -4689,183 +5918,58 @@
                               <w:spacing w:after="0" w:line="240" w:lineRule="auto"/>
                               <w:jc w:val="right"/>
                               <w:rPr>
+                                <w:b/>
+                                <w:bCs/>
                                 <w:sz w:val="20"/>
                                 <w:szCs w:val="20"/>
                               </w:rPr>
                             </w:pPr>
                             <w:r>
                               <w:rPr>
+                                <w:b/>
+                                <w:bCs/>
                                 <w:sz w:val="20"/>
                                 <w:szCs w:val="20"/>
                               </w:rPr>
-                              <w:t>Four bands</w:t>
+                              <w:t>Five</w:t>
                             </w:r>
                             <w:r>
                               <w:rPr>
+                                <w:b/>
+                                <w:bCs/>
+                                <w:sz w:val="20"/>
+                                <w:szCs w:val="20"/>
+                              </w:rPr>
+                              <w:t>-</w:t>
+                            </w:r>
+                            <w:r>
+                              <w:rPr>
+                                <w:b/>
+                                <w:bCs/>
+                                <w:sz w:val="20"/>
+                                <w:szCs w:val="20"/>
+                              </w:rPr>
+                              <w:t>band</w:t>
+                            </w:r>
+                            <w:r>
+                              <w:rPr>
+                                <w:b/>
+                                <w:bCs/>
+                                <w:sz w:val="20"/>
+                                <w:szCs w:val="20"/>
+                              </w:rPr>
+                              <w:t xml:space="preserve"> resistors:</w:t>
+                            </w:r>
+                            <w:r>
+                              <w:rPr>
+                                <w:b/>
+                                <w:bCs/>
                                 <w:sz w:val="20"/>
                                 <w:szCs w:val="20"/>
                               </w:rPr>
                               <w:t xml:space="preserve"> </w:t>
                             </w:r>
-                            <w:r>
-                              <w:rPr>
-                                <w:sz w:val="20"/>
-                                <w:szCs w:val="20"/>
-                              </w:rPr>
-                              <w:t>(</w:t>
-                            </w:r>
-                            <w:proofErr w:type="gramStart"/>
-                            <w:r>
-                              <w:rPr>
-                                <w:sz w:val="20"/>
-                                <w:szCs w:val="20"/>
-                              </w:rPr>
-                              <w:t>2</w:t>
-                            </w:r>
-                            <w:proofErr w:type="gramEnd"/>
-                            <w:r>
-                              <w:rPr>
-                                <w:sz w:val="20"/>
-                                <w:szCs w:val="20"/>
-                              </w:rPr>
-                              <w:t xml:space="preserve"> digits)</w:t>
-                            </w:r>
-                            <w:r>
-                              <w:rPr>
-                                <w:sz w:val="20"/>
-                                <w:szCs w:val="20"/>
-                              </w:rPr>
-                              <w:t>:</w:t>
-                            </w:r>
                           </w:p>
-                        </w:txbxContent>
-                      </wps:txbx>
-                      <wps:bodyPr rot="0" spcFirstLastPara="0" vertOverflow="overflow" horzOverflow="overflow" vert="horz" wrap="square" lIns="91440" tIns="45720" rIns="91440" bIns="45720" numCol="1" spcCol="0" rtlCol="0" fromWordArt="0" anchor="t" anchorCtr="0" forceAA="0" compatLnSpc="1">
-                        <a:prstTxWarp prst="textNoShape">
-                          <a:avLst/>
-                        </a:prstTxWarp>
-                        <a:noAutofit/>
-                      </wps:bodyPr>
-                    </wps:wsp>
-                  </a:graphicData>
-                </a:graphic>
-                <wp14:sizeRelH relativeFrom="margin">
-                  <wp14:pctWidth>0</wp14:pctWidth>
-                </wp14:sizeRelH>
-                <wp14:sizeRelV relativeFrom="margin">
-                  <wp14:pctHeight>0</wp14:pctHeight>
-                </wp14:sizeRelV>
-              </wp:anchor>
-            </w:drawing>
-          </mc:Choice>
-          <mc:Fallback>
-            <w:pict>
-              <v:shape w14:anchorId="24C3380E" id="Text Box 24" o:spid="_x0000_s1041" type="#_x0000_t202" style="position:absolute;margin-left:78.9pt;margin-top:240.8pt;width:109.3pt;height:21.6pt;z-index:251683840;visibility:visible;mso-wrap-style:square;mso-width-percent:0;mso-height-percent:0;mso-wrap-distance-left:9pt;mso-wrap-distance-top:0;mso-wrap-distance-right:9pt;mso-wrap-distance-bottom:0;mso-position-horizontal:absolute;mso-position-horizontal-relative:text;mso-position-vertical:absolute;mso-position-vertical-relative:text;mso-width-percent:0;mso-height-percent:0;mso-width-relative:margin;mso-height-relative:margin;v-text-anchor:top" o:gfxdata="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" filled="f" stroked="f" strokeweight=".5pt">
-                <v:textbox>
-                  <w:txbxContent>
-                    <w:p>
-                      <w:pPr>
-                        <w:spacing w:after="0" w:line="240" w:lineRule="auto"/>
-                        <w:jc w:val="right"/>
-                        <w:rPr>
-                          <w:sz w:val="20"/>
-                          <w:szCs w:val="20"/>
-                        </w:rPr>
-                      </w:pPr>
-                      <w:r>
-                        <w:rPr>
-                          <w:sz w:val="20"/>
-                          <w:szCs w:val="20"/>
-                        </w:rPr>
-                        <w:t>Four bands</w:t>
-                      </w:r>
-                      <w:r>
-                        <w:rPr>
-                          <w:sz w:val="20"/>
-                          <w:szCs w:val="20"/>
-                        </w:rPr>
-                        <w:t xml:space="preserve"> </w:t>
-                      </w:r>
-                      <w:r>
-                        <w:rPr>
-                          <w:sz w:val="20"/>
-                          <w:szCs w:val="20"/>
-                        </w:rPr>
-                        <w:t>(</w:t>
-                      </w:r>
-                      <w:proofErr w:type="gramStart"/>
-                      <w:r>
-                        <w:rPr>
-                          <w:sz w:val="20"/>
-                          <w:szCs w:val="20"/>
-                        </w:rPr>
-                        <w:t>2</w:t>
-                      </w:r>
-                      <w:proofErr w:type="gramEnd"/>
-                      <w:r>
-                        <w:rPr>
-                          <w:sz w:val="20"/>
-                          <w:szCs w:val="20"/>
-                        </w:rPr>
-                        <w:t xml:space="preserve"> digits)</w:t>
-                      </w:r>
-                      <w:r>
-                        <w:rPr>
-                          <w:sz w:val="20"/>
-                          <w:szCs w:val="20"/>
-                        </w:rPr>
-                        <w:t>:</w:t>
-                      </w:r>
-                    </w:p>
-                  </w:txbxContent>
-                </v:textbox>
-              </v:shape>
-            </w:pict>
-          </mc:Fallback>
-        </mc:AlternateContent>
-      </w:r>
-      <w:r>
-        <w:rPr>
-          <w:rFonts w:ascii="Times New Roman" w:hAnsi="Times New Roman" w:cs="Times New Roman"/>
-          <w:noProof/>
-          <w:sz w:val="24"/>
-          <w:szCs w:val="24"/>
-        </w:rPr>
-        <mc:AlternateContent>
-          <mc:Choice Requires="wps">
-            <w:drawing>
-              <wp:anchor distT="0" distB="0" distL="114300" distR="114300" simplePos="0" relativeHeight="251679744" behindDoc="0" locked="0" layoutInCell="1" allowOverlap="1">
-                <wp:simplePos x="0" y="0"/>
-                <wp:positionH relativeFrom="column">
-                  <wp:posOffset>1032510</wp:posOffset>
-                </wp:positionH>
-                <wp:positionV relativeFrom="paragraph">
-                  <wp:posOffset>2381250</wp:posOffset>
-                </wp:positionV>
-                <wp:extent cx="1358900" cy="274320"/>
-                <wp:effectExtent l="0" t="0" r="0" b="0"/>
-                <wp:wrapNone/>
-                <wp:docPr id="22" name="Text Box 22"/>
-                <wp:cNvGraphicFramePr/>
-                <a:graphic xmlns:a="http://schemas.openxmlformats.org/drawingml/2006/main">
-                  <a:graphicData uri="http://schemas.microsoft.com/office/word/2010/wordprocessingShape">
-                    <wps:wsp>
-                      <wps:cNvSpPr txBox="1"/>
-                      <wps:spPr>
-                        <a:xfrm>
-                          <a:off x="0" y="0"/>
-                          <a:ext cx="1358900" cy="274320"/>
-                        </a:xfrm>
-                        <a:prstGeom prst="rect">
-                          <a:avLst/>
-                        </a:prstGeom>
-                        <a:noFill/>
-                        <a:ln w="6350">
-                          <a:noFill/>
-                        </a:ln>
-                      </wps:spPr>
-                      <wps:txbx>
-                        <w:txbxContent>
                           <w:p>
                             <w:pPr>
                               <w:spacing w:after="0" w:line="240" w:lineRule="auto"/>
@@ -4880,7 +5984,7 @@
                                 <w:sz w:val="20"/>
                                 <w:szCs w:val="20"/>
                               </w:rPr>
-                              <w:t>Five bands</w:t>
+                              <w:t>3 digits</w:t>
                             </w:r>
                             <w:r>
                               <w:rPr>
@@ -4889,35 +5993,57 @@
                               </w:rPr>
                               <w:t xml:space="preserve"> </w:t>
                             </w:r>
+                            <m:oMath>
+                              <m:r>
+                                <w:rPr>
+                                  <w:rFonts w:ascii="Cambria Math" w:hAnsi="Cambria Math"/>
+                                  <w:sz w:val="20"/>
+                                  <w:szCs w:val="20"/>
+                                </w:rPr>
+                                <m:t>×</m:t>
+                              </m:r>
+                            </m:oMath>
                             <w:r>
                               <w:rPr>
                                 <w:sz w:val="20"/>
                                 <w:szCs w:val="20"/>
                               </w:rPr>
-                              <w:t>(</w:t>
+                              <w:t xml:space="preserve"> multiplier</w:t>
                             </w:r>
-                            <w:proofErr w:type="gramStart"/>
+                          </w:p>
+                          <w:p>
+                            <w:pPr>
+                              <w:spacing w:after="0" w:line="240" w:lineRule="auto"/>
+                              <w:jc w:val="right"/>
+                              <w:rPr>
+                                <w:sz w:val="20"/>
+                                <w:szCs w:val="20"/>
+                              </w:rPr>
+                            </w:pPr>
+                            <m:oMath>
+                              <m:r>
+                                <w:rPr>
+                                  <w:rFonts w:ascii="Cambria Math" w:hAnsi="Cambria Math"/>
+                                  <w:sz w:val="20"/>
+                                  <w:szCs w:val="20"/>
+                                </w:rPr>
+                                <m:t>±</m:t>
+                              </m:r>
+                              <m:r>
+                                <w:rPr>
+                                  <w:rFonts w:ascii="Cambria Math" w:hAnsi="Cambria Math"/>
+                                  <w:sz w:val="20"/>
+                                  <w:szCs w:val="20"/>
+                                </w:rPr>
+                                <m:t xml:space="preserve"> </m:t>
+                              </m:r>
+                            </m:oMath>
                             <w:r>
                               <w:rPr>
                                 <w:sz w:val="20"/>
                                 <w:szCs w:val="20"/>
                               </w:rPr>
-                              <w:t>3</w:t>
-                            </w:r>
-                            <w:proofErr w:type="gramEnd"/>
-                            <w:r>
-                              <w:rPr>
-                                <w:sz w:val="20"/>
-                                <w:szCs w:val="20"/>
-                              </w:rPr>
-                              <w:t xml:space="preserve"> digits)</w:t>
-                            </w:r>
-                            <w:r>
-                              <w:rPr>
-                                <w:sz w:val="20"/>
-                                <w:szCs w:val="20"/>
-                              </w:rPr>
-                              <w:t>:</w:t>
+                              <w:t>tolerance</w:t>
                             </w:r>
                           </w:p>
                           <w:p>
@@ -4951,9 +6077,66 @@
           </mc:Choice>
           <mc:Fallback>
             <w:pict>
-              <v:shape id="Text Box 22" o:spid="_x0000_s1042" type="#_x0000_t202" style="position:absolute;margin-left:81.3pt;margin-top:187.5pt;width:107pt;height:21.6pt;z-index:251679744;visibility:visible;mso-wrap-style:square;mso-width-percent:0;mso-height-percent:0;mso-wrap-distance-left:9pt;mso-wrap-distance-top:0;mso-wrap-distance-right:9pt;mso-wrap-distance-bottom:0;mso-position-horizontal:absolute;mso-position-horizontal-relative:text;mso-position-vertical:absolute;mso-position-vertical-relative:text;mso-width-percent:0;mso-height-percent:0;mso-width-relative:margin;mso-height-relative:margin;v-text-anchor:top" o:gfxdata="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" filled="f" stroked="f" strokeweight=".5pt">
+              <v:shape w14:anchorId="1787AA4B" id="Text Box 22" o:spid="_x0000_s1059" type="#_x0000_t202" style="position:absolute;margin-left:75.9pt;margin-top:175.75pt;width:106.1pt;height:47.5pt;z-index:251679744;visibility:visible;mso-wrap-style:square;mso-width-percent:0;mso-height-percent:0;mso-wrap-distance-left:9pt;mso-wrap-distance-top:0;mso-wrap-distance-right:9pt;mso-wrap-distance-bottom:0;mso-position-horizontal:absolute;mso-position-horizontal-relative:text;mso-position-vertical:absolute;mso-position-vertical-relative:text;mso-width-percent:0;mso-height-percent:0;mso-width-relative:margin;mso-height-relative:margin;v-text-anchor:top" o:gfxdata="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" filled="f" stroked="f" strokeweight=".5pt">
                 <v:textbox>
                   <w:txbxContent>
+                    <w:p>
+                      <w:pPr>
+                        <w:spacing w:after="0" w:line="240" w:lineRule="auto"/>
+                        <w:jc w:val="right"/>
+                        <w:rPr>
+                          <w:b/>
+                          <w:bCs/>
+                          <w:sz w:val="20"/>
+                          <w:szCs w:val="20"/>
+                        </w:rPr>
+                      </w:pPr>
+                      <w:r>
+                        <w:rPr>
+                          <w:b/>
+                          <w:bCs/>
+                          <w:sz w:val="20"/>
+                          <w:szCs w:val="20"/>
+                        </w:rPr>
+                        <w:t>Five</w:t>
+                      </w:r>
+                      <w:r>
+                        <w:rPr>
+                          <w:b/>
+                          <w:bCs/>
+                          <w:sz w:val="20"/>
+                          <w:szCs w:val="20"/>
+                        </w:rPr>
+                        <w:t>-</w:t>
+                      </w:r>
+                      <w:r>
+                        <w:rPr>
+                          <w:b/>
+                          <w:bCs/>
+                          <w:sz w:val="20"/>
+                          <w:szCs w:val="20"/>
+                        </w:rPr>
+                        <w:t>band</w:t>
+                      </w:r>
+                      <w:r>
+                        <w:rPr>
+                          <w:b/>
+                          <w:bCs/>
+                          <w:sz w:val="20"/>
+                          <w:szCs w:val="20"/>
+                        </w:rPr>
+                        <w:t xml:space="preserve"> resistors:</w:t>
+                      </w:r>
+                      <w:r>
+                        <w:rPr>
+                          <w:b/>
+                          <w:bCs/>
+                          <w:sz w:val="20"/>
+                          <w:szCs w:val="20"/>
+                        </w:rPr>
+                        <w:t xml:space="preserve"> </w:t>
+                      </w:r>
+                    </w:p>
                     <w:p>
                       <w:pPr>
                         <w:spacing w:after="0" w:line="240" w:lineRule="auto"/>
@@ -4968,7 +6151,7 @@
                           <w:sz w:val="20"/>
                           <w:szCs w:val="20"/>
                         </w:rPr>
-                        <w:t>Five bands</w:t>
+                        <w:t>3 digits</w:t>
                       </w:r>
                       <w:r>
                         <w:rPr>
@@ -4977,35 +6160,57 @@
                         </w:rPr>
                         <w:t xml:space="preserve"> </w:t>
                       </w:r>
+                      <m:oMath>
+                        <m:r>
+                          <w:rPr>
+                            <w:rFonts w:ascii="Cambria Math" w:hAnsi="Cambria Math"/>
+                            <w:sz w:val="20"/>
+                            <w:szCs w:val="20"/>
+                          </w:rPr>
+                          <m:t>×</m:t>
+                        </m:r>
+                      </m:oMath>
                       <w:r>
                         <w:rPr>
                           <w:sz w:val="20"/>
                           <w:szCs w:val="20"/>
                         </w:rPr>
-                        <w:t>(</w:t>
+                        <w:t xml:space="preserve"> multiplier</w:t>
                       </w:r>
-                      <w:proofErr w:type="gramStart"/>
+                    </w:p>
+                    <w:p>
+                      <w:pPr>
+                        <w:spacing w:after="0" w:line="240" w:lineRule="auto"/>
+                        <w:jc w:val="right"/>
+                        <w:rPr>
+                          <w:sz w:val="20"/>
+                          <w:szCs w:val="20"/>
+                        </w:rPr>
+                      </w:pPr>
+                      <m:oMath>
+                        <m:r>
+                          <w:rPr>
+                            <w:rFonts w:ascii="Cambria Math" w:hAnsi="Cambria Math"/>
+                            <w:sz w:val="20"/>
+                            <w:szCs w:val="20"/>
+                          </w:rPr>
+                          <m:t>±</m:t>
+                        </m:r>
+                        <m:r>
+                          <w:rPr>
+                            <w:rFonts w:ascii="Cambria Math" w:hAnsi="Cambria Math"/>
+                            <w:sz w:val="20"/>
+                            <w:szCs w:val="20"/>
+                          </w:rPr>
+                          <m:t xml:space="preserve"> </m:t>
+                        </m:r>
+                      </m:oMath>
                       <w:r>
                         <w:rPr>
                           <w:sz w:val="20"/>
                           <w:szCs w:val="20"/>
                         </w:rPr>
-                        <w:t>3</w:t>
-                      </w:r>
-                      <w:proofErr w:type="gramEnd"/>
-                      <w:r>
-                        <w:rPr>
-                          <w:sz w:val="20"/>
-                          <w:szCs w:val="20"/>
-                        </w:rPr>
-                        <w:t xml:space="preserve"> digits)</w:t>
-                      </w:r>
-                      <w:r>
-                        <w:rPr>
-                          <w:sz w:val="20"/>
-                          <w:szCs w:val="20"/>
-                        </w:rPr>
-                        <w:t>:</w:t>
+                        <w:t>tolerance</w:t>
                       </w:r>
                     </w:p>
                     <w:p>
@@ -5032,103 +6237,387 @@
           <w:szCs w:val="24"/>
         </w:rPr>
         <mc:AlternateContent>
-          <mc:Choice Requires="wps">
+          <mc:Choice Requires="wpg">
             <w:drawing>
-              <wp:anchor distT="0" distB="0" distL="114300" distR="114300" simplePos="0" relativeHeight="251681792" behindDoc="0" locked="0" layoutInCell="1" allowOverlap="1" wp14:anchorId="38F02C21" wp14:editId="70D9C9D9">
+              <wp:anchor distT="0" distB="0" distL="114300" distR="114300" simplePos="0" relativeHeight="251710464" behindDoc="0" locked="0" layoutInCell="1" allowOverlap="1" wp14:anchorId="5B28CA3A" wp14:editId="71CD7FA9">
                 <wp:simplePos x="0" y="0"/>
                 <wp:positionH relativeFrom="column">
-                  <wp:posOffset>3489960</wp:posOffset>
+                  <wp:posOffset>1859280</wp:posOffset>
                 </wp:positionH>
                 <wp:positionV relativeFrom="paragraph">
-                  <wp:posOffset>2392680</wp:posOffset>
+                  <wp:posOffset>1857375</wp:posOffset>
                 </wp:positionV>
-                <wp:extent cx="1079500" cy="274320"/>
-                <wp:effectExtent l="0" t="0" r="0" b="0"/>
+                <wp:extent cx="2741295" cy="457200"/>
+                <wp:effectExtent l="0" t="0" r="20955" b="57150"/>
                 <wp:wrapNone/>
-                <wp:docPr id="23" name="Text Box 23"/>
+                <wp:docPr id="50" name="Group 50"/>
                 <wp:cNvGraphicFramePr/>
                 <a:graphic xmlns:a="http://schemas.openxmlformats.org/drawingml/2006/main">
-                  <a:graphicData uri="http://schemas.microsoft.com/office/word/2010/wordprocessingShape">
-                    <wps:wsp>
-                      <wps:cNvSpPr txBox="1"/>
-                      <wps:spPr>
+                  <a:graphicData uri="http://schemas.microsoft.com/office/word/2010/wordprocessingGroup">
+                    <wpg:wgp>
+                      <wpg:cNvGrpSpPr/>
+                      <wpg:grpSpPr>
                         <a:xfrm>
                           <a:off x="0" y="0"/>
-                          <a:ext cx="1079500" cy="274320"/>
+                          <a:ext cx="2741295" cy="457200"/>
+                          <a:chOff x="0" y="0"/>
+                          <a:chExt cx="2741295" cy="552450"/>
                         </a:xfrm>
-                        <a:prstGeom prst="rect">
-                          <a:avLst/>
-                        </a:prstGeom>
-                        <a:noFill/>
-                        <a:ln w="6350">
-                          <a:noFill/>
-                        </a:ln>
-                      </wps:spPr>
-                      <wps:txbx>
-                        <w:txbxContent>
-                          <w:p>
-                            <w:pPr>
-                              <w:rPr>
-                                <w:color w:val="000000" w:themeColor="text1"/>
-                                <w:sz w:val="20"/>
-                                <w:szCs w:val="20"/>
-                              </w:rPr>
-                            </w:pPr>
-                            <w:r>
-                              <w:rPr>
-                                <w:rFonts w:eastAsiaTheme="minorEastAsia" w:cstheme="minorHAnsi"/>
-                                <w:color w:val="000000" w:themeColor="text1"/>
-                                <w:sz w:val="20"/>
-                                <w:szCs w:val="20"/>
-                              </w:rPr>
-                              <w:t xml:space="preserve">= </w:t>
-                            </w:r>
-                            <w:r>
-                              <w:rPr>
-                                <w:rFonts w:eastAsiaTheme="minorEastAsia" w:cstheme="minorHAnsi"/>
-                                <w:color w:val="000000" w:themeColor="text1"/>
-                                <w:sz w:val="20"/>
-                                <w:szCs w:val="20"/>
-                              </w:rPr>
-                              <w:t>275</w:t>
-                            </w:r>
-                            <w:r>
-                              <w:rPr>
-                                <w:rFonts w:eastAsiaTheme="minorEastAsia" w:cstheme="minorHAnsi"/>
-                                <w:color w:val="000000" w:themeColor="text1"/>
-                                <w:sz w:val="20"/>
-                                <w:szCs w:val="20"/>
-                              </w:rPr>
-                              <w:t xml:space="preserve"> Ω ± </w:t>
-                            </w:r>
-                            <w:r>
-                              <w:rPr>
-                                <w:rFonts w:eastAsiaTheme="minorEastAsia" w:cstheme="minorHAnsi"/>
-                                <w:color w:val="000000" w:themeColor="text1"/>
-                                <w:sz w:val="20"/>
-                                <w:szCs w:val="20"/>
-                              </w:rPr>
-                              <w:t>1</w:t>
-                            </w:r>
-                            <w:r>
-                              <w:rPr>
-                                <w:rFonts w:eastAsiaTheme="minorEastAsia" w:cstheme="minorHAnsi"/>
-                                <w:color w:val="000000" w:themeColor="text1"/>
-                                <w:sz w:val="20"/>
-                                <w:szCs w:val="20"/>
-                              </w:rPr>
-                              <w:t>%</w:t>
-                            </w:r>
-                          </w:p>
-                        </w:txbxContent>
-                      </wps:txbx>
-                      <wps:bodyPr rot="0" spcFirstLastPara="0" vertOverflow="overflow" horzOverflow="overflow" vert="horz" wrap="square" lIns="91440" tIns="45720" rIns="91440" bIns="45720" numCol="1" spcCol="0" rtlCol="0" fromWordArt="0" anchor="t" anchorCtr="0" forceAA="0" compatLnSpc="1">
-                        <a:prstTxWarp prst="textNoShape">
-                          <a:avLst/>
-                        </a:prstTxWarp>
-                        <a:noAutofit/>
-                      </wps:bodyPr>
-                    </wps:wsp>
+                      </wpg:grpSpPr>
+                      <wps:wsp>
+                        <wps:cNvPr id="35" name="Freeform 35"/>
+                        <wps:cNvSpPr/>
+                        <wps:spPr>
+                          <a:xfrm>
+                            <a:off x="0" y="0"/>
+                            <a:ext cx="663575" cy="552450"/>
+                          </a:xfrm>
+                          <a:custGeom>
+                            <a:avLst/>
+                            <a:gdLst>
+                              <a:gd name="connsiteX0" fmla="*/ 0 w 663575"/>
+                              <a:gd name="connsiteY0" fmla="*/ 0 h 342900"/>
+                              <a:gd name="connsiteX1" fmla="*/ 0 w 663575"/>
+                              <a:gd name="connsiteY1" fmla="*/ 98425 h 342900"/>
+                              <a:gd name="connsiteX2" fmla="*/ 663575 w 663575"/>
+                              <a:gd name="connsiteY2" fmla="*/ 234950 h 342900"/>
+                              <a:gd name="connsiteX3" fmla="*/ 663575 w 663575"/>
+                              <a:gd name="connsiteY3" fmla="*/ 342900 h 342900"/>
+                            </a:gdLst>
+                            <a:ahLst/>
+                            <a:cxnLst>
+                              <a:cxn ang="0">
+                                <a:pos x="connsiteX0" y="connsiteY0"/>
+                              </a:cxn>
+                              <a:cxn ang="0">
+                                <a:pos x="connsiteX1" y="connsiteY1"/>
+                              </a:cxn>
+                              <a:cxn ang="0">
+                                <a:pos x="connsiteX2" y="connsiteY2"/>
+                              </a:cxn>
+                              <a:cxn ang="0">
+                                <a:pos x="connsiteX3" y="connsiteY3"/>
+                              </a:cxn>
+                            </a:cxnLst>
+                            <a:rect l="l" t="t" r="r" b="b"/>
+                            <a:pathLst>
+                              <a:path w="663575" h="342900">
+                                <a:moveTo>
+                                  <a:pt x="0" y="0"/>
+                                </a:moveTo>
+                                <a:lnTo>
+                                  <a:pt x="0" y="98425"/>
+                                </a:lnTo>
+                                <a:lnTo>
+                                  <a:pt x="663575" y="234950"/>
+                                </a:lnTo>
+                                <a:lnTo>
+                                  <a:pt x="663575" y="342900"/>
+                                </a:lnTo>
+                              </a:path>
+                            </a:pathLst>
+                          </a:custGeom>
+                          <a:ln w="12700">
+                            <a:prstDash val="sysDash"/>
+                            <a:headEnd type="none" w="sm" len="sm"/>
+                            <a:tailEnd type="arrow" w="sm" len="sm"/>
+                          </a:ln>
+                        </wps:spPr>
+                        <wps:style>
+                          <a:lnRef idx="1">
+                            <a:schemeClr val="dk1"/>
+                          </a:lnRef>
+                          <a:fillRef idx="0">
+                            <a:schemeClr val="dk1"/>
+                          </a:fillRef>
+                          <a:effectRef idx="0">
+                            <a:schemeClr val="dk1"/>
+                          </a:effectRef>
+                          <a:fontRef idx="minor">
+                            <a:schemeClr val="tx1"/>
+                          </a:fontRef>
+                        </wps:style>
+                        <wps:bodyPr rot="0" spcFirstLastPara="0" vertOverflow="overflow" horzOverflow="overflow" vert="horz" wrap="square" lIns="91440" tIns="45720" rIns="91440" bIns="45720" numCol="1" spcCol="0" rtlCol="0" fromWordArt="0" anchor="ctr" anchorCtr="0" forceAA="0" compatLnSpc="1">
+                          <a:prstTxWarp prst="textNoShape">
+                            <a:avLst/>
+                          </a:prstTxWarp>
+                          <a:noAutofit/>
+                        </wps:bodyPr>
+                      </wps:wsp>
+                      <wps:wsp>
+                        <wps:cNvPr id="38" name="Freeform 38"/>
+                        <wps:cNvSpPr/>
+                        <wps:spPr>
+                          <a:xfrm>
+                            <a:off x="510540" y="0"/>
+                            <a:ext cx="339725" cy="552450"/>
+                          </a:xfrm>
+                          <a:custGeom>
+                            <a:avLst/>
+                            <a:gdLst>
+                              <a:gd name="connsiteX0" fmla="*/ 0 w 663575"/>
+                              <a:gd name="connsiteY0" fmla="*/ 0 h 342900"/>
+                              <a:gd name="connsiteX1" fmla="*/ 0 w 663575"/>
+                              <a:gd name="connsiteY1" fmla="*/ 98425 h 342900"/>
+                              <a:gd name="connsiteX2" fmla="*/ 663575 w 663575"/>
+                              <a:gd name="connsiteY2" fmla="*/ 234950 h 342900"/>
+                              <a:gd name="connsiteX3" fmla="*/ 663575 w 663575"/>
+                              <a:gd name="connsiteY3" fmla="*/ 342900 h 342900"/>
+                            </a:gdLst>
+                            <a:ahLst/>
+                            <a:cxnLst>
+                              <a:cxn ang="0">
+                                <a:pos x="connsiteX0" y="connsiteY0"/>
+                              </a:cxn>
+                              <a:cxn ang="0">
+                                <a:pos x="connsiteX1" y="connsiteY1"/>
+                              </a:cxn>
+                              <a:cxn ang="0">
+                                <a:pos x="connsiteX2" y="connsiteY2"/>
+                              </a:cxn>
+                              <a:cxn ang="0">
+                                <a:pos x="connsiteX3" y="connsiteY3"/>
+                              </a:cxn>
+                            </a:cxnLst>
+                            <a:rect l="l" t="t" r="r" b="b"/>
+                            <a:pathLst>
+                              <a:path w="663575" h="342900">
+                                <a:moveTo>
+                                  <a:pt x="0" y="0"/>
+                                </a:moveTo>
+                                <a:lnTo>
+                                  <a:pt x="0" y="98425"/>
+                                </a:lnTo>
+                                <a:lnTo>
+                                  <a:pt x="663575" y="234950"/>
+                                </a:lnTo>
+                                <a:lnTo>
+                                  <a:pt x="663575" y="342900"/>
+                                </a:lnTo>
+                              </a:path>
+                            </a:pathLst>
+                          </a:custGeom>
+                          <a:ln w="12700">
+                            <a:prstDash val="sysDash"/>
+                            <a:headEnd type="none" w="sm" len="sm"/>
+                            <a:tailEnd type="arrow" w="sm" len="sm"/>
+                          </a:ln>
+                        </wps:spPr>
+                        <wps:style>
+                          <a:lnRef idx="1">
+                            <a:schemeClr val="dk1"/>
+                          </a:lnRef>
+                          <a:fillRef idx="0">
+                            <a:schemeClr val="dk1"/>
+                          </a:fillRef>
+                          <a:effectRef idx="0">
+                            <a:schemeClr val="dk1"/>
+                          </a:effectRef>
+                          <a:fontRef idx="minor">
+                            <a:schemeClr val="tx1"/>
+                          </a:fontRef>
+                        </wps:style>
+                        <wps:bodyPr rot="0" spcFirstLastPara="0" vertOverflow="overflow" horzOverflow="overflow" vert="horz" wrap="square" lIns="91440" tIns="45720" rIns="91440" bIns="45720" numCol="1" spcCol="0" rtlCol="0" fromWordArt="0" anchor="ctr" anchorCtr="0" forceAA="0" compatLnSpc="1">
+                          <a:prstTxWarp prst="textNoShape">
+                            <a:avLst/>
+                          </a:prstTxWarp>
+                          <a:noAutofit/>
+                        </wps:bodyPr>
+                      </wps:wsp>
+                      <wps:wsp>
+                        <wps:cNvPr id="39" name="Freeform 39"/>
+                        <wps:cNvSpPr/>
+                        <wps:spPr>
+                          <a:xfrm flipH="1">
+                            <a:off x="1211579" y="0"/>
+                            <a:ext cx="641985" cy="552450"/>
+                          </a:xfrm>
+                          <a:custGeom>
+                            <a:avLst/>
+                            <a:gdLst>
+                              <a:gd name="connsiteX0" fmla="*/ 0 w 663575"/>
+                              <a:gd name="connsiteY0" fmla="*/ 0 h 342900"/>
+                              <a:gd name="connsiteX1" fmla="*/ 0 w 663575"/>
+                              <a:gd name="connsiteY1" fmla="*/ 98425 h 342900"/>
+                              <a:gd name="connsiteX2" fmla="*/ 663575 w 663575"/>
+                              <a:gd name="connsiteY2" fmla="*/ 234950 h 342900"/>
+                              <a:gd name="connsiteX3" fmla="*/ 663575 w 663575"/>
+                              <a:gd name="connsiteY3" fmla="*/ 342900 h 342900"/>
+                            </a:gdLst>
+                            <a:ahLst/>
+                            <a:cxnLst>
+                              <a:cxn ang="0">
+                                <a:pos x="connsiteX0" y="connsiteY0"/>
+                              </a:cxn>
+                              <a:cxn ang="0">
+                                <a:pos x="connsiteX1" y="connsiteY1"/>
+                              </a:cxn>
+                              <a:cxn ang="0">
+                                <a:pos x="connsiteX2" y="connsiteY2"/>
+                              </a:cxn>
+                              <a:cxn ang="0">
+                                <a:pos x="connsiteX3" y="connsiteY3"/>
+                              </a:cxn>
+                            </a:cxnLst>
+                            <a:rect l="l" t="t" r="r" b="b"/>
+                            <a:pathLst>
+                              <a:path w="663575" h="342900">
+                                <a:moveTo>
+                                  <a:pt x="0" y="0"/>
+                                </a:moveTo>
+                                <a:lnTo>
+                                  <a:pt x="0" y="98425"/>
+                                </a:lnTo>
+                                <a:lnTo>
+                                  <a:pt x="663575" y="234950"/>
+                                </a:lnTo>
+                                <a:lnTo>
+                                  <a:pt x="663575" y="342900"/>
+                                </a:lnTo>
+                              </a:path>
+                            </a:pathLst>
+                          </a:custGeom>
+                          <a:ln w="12700">
+                            <a:prstDash val="sysDash"/>
+                            <a:headEnd type="none" w="sm" len="sm"/>
+                            <a:tailEnd type="arrow" w="sm" len="sm"/>
+                          </a:ln>
+                        </wps:spPr>
+                        <wps:style>
+                          <a:lnRef idx="1">
+                            <a:schemeClr val="dk1"/>
+                          </a:lnRef>
+                          <a:fillRef idx="0">
+                            <a:schemeClr val="dk1"/>
+                          </a:fillRef>
+                          <a:effectRef idx="0">
+                            <a:schemeClr val="dk1"/>
+                          </a:effectRef>
+                          <a:fontRef idx="minor">
+                            <a:schemeClr val="tx1"/>
+                          </a:fontRef>
+                        </wps:style>
+                        <wps:bodyPr rot="0" spcFirstLastPara="0" vertOverflow="overflow" horzOverflow="overflow" vert="horz" wrap="square" lIns="91440" tIns="45720" rIns="91440" bIns="45720" numCol="1" spcCol="0" rtlCol="0" fromWordArt="0" anchor="ctr" anchorCtr="0" forceAA="0" compatLnSpc="1">
+                          <a:prstTxWarp prst="textNoShape">
+                            <a:avLst/>
+                          </a:prstTxWarp>
+                          <a:noAutofit/>
+                        </wps:bodyPr>
+                      </wps:wsp>
+                      <wps:wsp>
+                        <wps:cNvPr id="40" name="Freeform 40"/>
+                        <wps:cNvSpPr/>
+                        <wps:spPr>
+                          <a:xfrm flipH="1">
+                            <a:off x="1478280" y="0"/>
+                            <a:ext cx="1263015" cy="552450"/>
+                          </a:xfrm>
+                          <a:custGeom>
+                            <a:avLst/>
+                            <a:gdLst>
+                              <a:gd name="connsiteX0" fmla="*/ 0 w 663575"/>
+                              <a:gd name="connsiteY0" fmla="*/ 0 h 342900"/>
+                              <a:gd name="connsiteX1" fmla="*/ 0 w 663575"/>
+                              <a:gd name="connsiteY1" fmla="*/ 98425 h 342900"/>
+                              <a:gd name="connsiteX2" fmla="*/ 663575 w 663575"/>
+                              <a:gd name="connsiteY2" fmla="*/ 234950 h 342900"/>
+                              <a:gd name="connsiteX3" fmla="*/ 663575 w 663575"/>
+                              <a:gd name="connsiteY3" fmla="*/ 342900 h 342900"/>
+                            </a:gdLst>
+                            <a:ahLst/>
+                            <a:cxnLst>
+                              <a:cxn ang="0">
+                                <a:pos x="connsiteX0" y="connsiteY0"/>
+                              </a:cxn>
+                              <a:cxn ang="0">
+                                <a:pos x="connsiteX1" y="connsiteY1"/>
+                              </a:cxn>
+                              <a:cxn ang="0">
+                                <a:pos x="connsiteX2" y="connsiteY2"/>
+                              </a:cxn>
+                              <a:cxn ang="0">
+                                <a:pos x="connsiteX3" y="connsiteY3"/>
+                              </a:cxn>
+                            </a:cxnLst>
+                            <a:rect l="l" t="t" r="r" b="b"/>
+                            <a:pathLst>
+                              <a:path w="663575" h="342900">
+                                <a:moveTo>
+                                  <a:pt x="0" y="0"/>
+                                </a:moveTo>
+                                <a:lnTo>
+                                  <a:pt x="0" y="98425"/>
+                                </a:lnTo>
+                                <a:lnTo>
+                                  <a:pt x="663575" y="234950"/>
+                                </a:lnTo>
+                                <a:lnTo>
+                                  <a:pt x="663575" y="342900"/>
+                                </a:lnTo>
+                              </a:path>
+                            </a:pathLst>
+                          </a:custGeom>
+                          <a:ln w="12700">
+                            <a:prstDash val="sysDash"/>
+                            <a:headEnd type="none" w="sm" len="sm"/>
+                            <a:tailEnd type="arrow" w="sm" len="sm"/>
+                          </a:ln>
+                        </wps:spPr>
+                        <wps:style>
+                          <a:lnRef idx="1">
+                            <a:schemeClr val="dk1"/>
+                          </a:lnRef>
+                          <a:fillRef idx="0">
+                            <a:schemeClr val="dk1"/>
+                          </a:fillRef>
+                          <a:effectRef idx="0">
+                            <a:schemeClr val="dk1"/>
+                          </a:effectRef>
+                          <a:fontRef idx="minor">
+                            <a:schemeClr val="tx1"/>
+                          </a:fontRef>
+                        </wps:style>
+                        <wps:bodyPr rot="0" spcFirstLastPara="0" vertOverflow="overflow" horzOverflow="overflow" vert="horz" wrap="square" lIns="91440" tIns="45720" rIns="91440" bIns="45720" numCol="1" spcCol="0" rtlCol="0" fromWordArt="0" anchor="ctr" anchorCtr="0" forceAA="0" compatLnSpc="1">
+                          <a:prstTxWarp prst="textNoShape">
+                            <a:avLst/>
+                          </a:prstTxWarp>
+                          <a:noAutofit/>
+                        </wps:bodyPr>
+                      </wps:wsp>
+                      <wps:wsp>
+                        <wps:cNvPr id="41" name="Straight Connector 41"/>
+                        <wps:cNvCnPr/>
+                        <wps:spPr>
+                          <a:xfrm>
+                            <a:off x="1026414" y="0"/>
+                            <a:ext cx="0" cy="548640"/>
+                          </a:xfrm>
+                          <a:prstGeom prst="line">
+                            <a:avLst/>
+                          </a:prstGeom>
+                          <a:ln w="12700">
+                            <a:prstDash val="sysDash"/>
+                            <a:headEnd type="none" w="sm" len="sm"/>
+                            <a:tailEnd type="arrow" w="sm" len="sm"/>
+                          </a:ln>
+                        </wps:spPr>
+                        <wps:style>
+                          <a:lnRef idx="1">
+                            <a:schemeClr val="dk1"/>
+                          </a:lnRef>
+                          <a:fillRef idx="0">
+                            <a:schemeClr val="dk1"/>
+                          </a:fillRef>
+                          <a:effectRef idx="0">
+                            <a:schemeClr val="dk1"/>
+                          </a:effectRef>
+                          <a:fontRef idx="minor">
+                            <a:schemeClr val="tx1"/>
+                          </a:fontRef>
+                        </wps:style>
+                        <wps:bodyPr/>
+                      </wps:wsp>
+                    </wpg:wgp>
                   </a:graphicData>
                 </a:graphic>
                 <wp14:sizeRelH relativeFrom="margin">
@@ -5142,858 +6631,26 @@
           </mc:Choice>
           <mc:Fallback>
             <w:pict>
-              <v:shape w14:anchorId="38F02C21" id="Text Box 23" o:spid="_x0000_s1043" type="#_x0000_t202" style="position:absolute;margin-left:274.8pt;margin-top:188.4pt;width:85pt;height:21.6pt;z-index:251681792;visibility:visible;mso-wrap-style:square;mso-width-percent:0;mso-height-percent:0;mso-wrap-distance-left:9pt;mso-wrap-distance-top:0;mso-wrap-distance-right:9pt;mso-wrap-distance-bottom:0;mso-position-horizontal:absolute;mso-position-horizontal-relative:text;mso-position-vertical:absolute;mso-position-vertical-relative:text;mso-width-percent:0;mso-height-percent:0;mso-width-relative:margin;mso-height-relative:margin;v-text-anchor:top" o:gfxdata="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" filled="f" stroked="f" strokeweight=".5pt">
-                <v:textbox>
-                  <w:txbxContent>
-                    <w:p>
-                      <w:pPr>
-                        <w:rPr>
-                          <w:color w:val="000000" w:themeColor="text1"/>
-                          <w:sz w:val="20"/>
-                          <w:szCs w:val="20"/>
-                        </w:rPr>
-                      </w:pPr>
-                      <w:r>
-                        <w:rPr>
-                          <w:rFonts w:eastAsiaTheme="minorEastAsia" w:cstheme="minorHAnsi"/>
-                          <w:color w:val="000000" w:themeColor="text1"/>
-                          <w:sz w:val="20"/>
-                          <w:szCs w:val="20"/>
-                        </w:rPr>
-                        <w:t xml:space="preserve">= </w:t>
-                      </w:r>
-                      <w:r>
-                        <w:rPr>
-                          <w:rFonts w:eastAsiaTheme="minorEastAsia" w:cstheme="minorHAnsi"/>
-                          <w:color w:val="000000" w:themeColor="text1"/>
-                          <w:sz w:val="20"/>
-                          <w:szCs w:val="20"/>
-                        </w:rPr>
-                        <w:t>275</w:t>
-                      </w:r>
-                      <w:r>
-                        <w:rPr>
-                          <w:rFonts w:eastAsiaTheme="minorEastAsia" w:cstheme="minorHAnsi"/>
-                          <w:color w:val="000000" w:themeColor="text1"/>
-                          <w:sz w:val="20"/>
-                          <w:szCs w:val="20"/>
-                        </w:rPr>
-                        <w:t xml:space="preserve"> Ω ± </w:t>
-                      </w:r>
-                      <w:r>
-                        <w:rPr>
-                          <w:rFonts w:eastAsiaTheme="minorEastAsia" w:cstheme="minorHAnsi"/>
-                          <w:color w:val="000000" w:themeColor="text1"/>
-                          <w:sz w:val="20"/>
-                          <w:szCs w:val="20"/>
-                        </w:rPr>
-                        <w:t>1</w:t>
-                      </w:r>
-                      <w:r>
-                        <w:rPr>
-                          <w:rFonts w:eastAsiaTheme="minorEastAsia" w:cstheme="minorHAnsi"/>
-                          <w:color w:val="000000" w:themeColor="text1"/>
-                          <w:sz w:val="20"/>
-                          <w:szCs w:val="20"/>
-                        </w:rPr>
-                        <w:t>%</w:t>
-                      </w:r>
-                    </w:p>
-                  </w:txbxContent>
-                </v:textbox>
-              </v:shape>
-            </w:pict>
-          </mc:Fallback>
-        </mc:AlternateContent>
-      </w:r>
-      <w:r>
-        <w:rPr>
-          <w:rFonts w:ascii="Times New Roman" w:hAnsi="Times New Roman" w:cs="Times New Roman"/>
-          <w:noProof/>
-          <w:sz w:val="24"/>
-          <w:szCs w:val="24"/>
-        </w:rPr>
-        <mc:AlternateContent>
-          <mc:Choice Requires="wpg">
-            <w:drawing>
-              <wp:anchor distT="0" distB="0" distL="114300" distR="114300" simplePos="0" relativeHeight="251696128" behindDoc="0" locked="0" layoutInCell="1" allowOverlap="1">
-                <wp:simplePos x="0" y="0"/>
-                <wp:positionH relativeFrom="column">
-                  <wp:posOffset>2393950</wp:posOffset>
-                </wp:positionH>
-                <wp:positionV relativeFrom="paragraph">
-                  <wp:posOffset>2341880</wp:posOffset>
-                </wp:positionV>
-                <wp:extent cx="1089660" cy="365760"/>
-                <wp:effectExtent l="0" t="0" r="0" b="0"/>
-                <wp:wrapNone/>
-                <wp:docPr id="36" name="5 band resistor"/>
-                <wp:cNvGraphicFramePr/>
-                <a:graphic xmlns:a="http://schemas.openxmlformats.org/drawingml/2006/main">
-                  <a:graphicData uri="http://schemas.microsoft.com/office/word/2010/wordprocessingGroup">
-                    <wpg:wgp>
-                      <wpg:cNvGrpSpPr/>
-                      <wpg:grpSpPr>
-                        <a:xfrm>
-                          <a:off x="0" y="0"/>
-                          <a:ext cx="1089660" cy="365760"/>
-                          <a:chOff x="0" y="0"/>
-                          <a:chExt cx="1089660" cy="365760"/>
-                        </a:xfrm>
-                      </wpg:grpSpPr>
-                      <wpg:grpSp>
-                        <wpg:cNvPr id="20" name="Group 20"/>
-                        <wpg:cNvGrpSpPr/>
-                        <wpg:grpSpPr>
-                          <a:xfrm>
-                            <a:off x="0" y="0"/>
-                            <a:ext cx="1089660" cy="365760"/>
-                            <a:chOff x="0" y="0"/>
-                            <a:chExt cx="1089660" cy="365760"/>
-                          </a:xfrm>
-                        </wpg:grpSpPr>
-                        <wpg:grpSp>
-                          <wpg:cNvPr id="15" name="Group 11"/>
-                          <wpg:cNvGrpSpPr/>
-                          <wpg:grpSpPr>
-                            <a:xfrm>
-                              <a:off x="0" y="0"/>
-                              <a:ext cx="1089660" cy="365760"/>
-                              <a:chOff x="0" y="0"/>
-                              <a:chExt cx="1089660" cy="365760"/>
-                            </a:xfrm>
-                          </wpg:grpSpPr>
-                          <wps:wsp>
-                            <wps:cNvPr id="16" name="Rounded Rectangle 12"/>
-                            <wps:cNvSpPr/>
-                            <wps:spPr>
-                              <a:xfrm>
-                                <a:off x="0" y="0"/>
-                                <a:ext cx="274320" cy="365760"/>
-                              </a:xfrm>
-                              <a:prstGeom prst="roundRect">
-                                <a:avLst>
-                                  <a:gd name="adj" fmla="val 27012"/>
-                                </a:avLst>
-                              </a:prstGeom>
-                              <a:solidFill>
-                                <a:srgbClr val="E5B671"/>
-                              </a:solidFill>
-                              <a:ln>
-                                <a:noFill/>
-                              </a:ln>
-                            </wps:spPr>
-                            <wps:style>
-                              <a:lnRef idx="2">
-                                <a:schemeClr val="accent1">
-                                  <a:shade val="50000"/>
-                                </a:schemeClr>
-                              </a:lnRef>
-                              <a:fillRef idx="1">
-                                <a:schemeClr val="accent1"/>
-                              </a:fillRef>
-                              <a:effectRef idx="0">
-                                <a:schemeClr val="accent1"/>
-                              </a:effectRef>
-                              <a:fontRef idx="minor">
-                                <a:schemeClr val="lt1"/>
-                              </a:fontRef>
-                            </wps:style>
-                            <wps:bodyPr rot="0" spcFirstLastPara="0" vertOverflow="overflow" horzOverflow="overflow" vert="horz" wrap="square" lIns="91440" tIns="45720" rIns="91440" bIns="45720" numCol="1" spcCol="0" rtlCol="0" fromWordArt="0" anchor="ctr" anchorCtr="0" forceAA="0" compatLnSpc="1">
-                              <a:prstTxWarp prst="textNoShape">
-                                <a:avLst/>
-                              </a:prstTxWarp>
-                              <a:noAutofit/>
-                            </wps:bodyPr>
-                          </wps:wsp>
-                          <wps:wsp>
-                            <wps:cNvPr id="17" name="Rounded Rectangle 13"/>
-                            <wps:cNvSpPr/>
-                            <wps:spPr>
-                              <a:xfrm>
-                                <a:off x="815340" y="0"/>
-                                <a:ext cx="274320" cy="365760"/>
-                              </a:xfrm>
-                              <a:prstGeom prst="roundRect">
-                                <a:avLst>
-                                  <a:gd name="adj" fmla="val 29885"/>
-                                </a:avLst>
-                              </a:prstGeom>
-                              <a:solidFill>
-                                <a:srgbClr val="E5B671"/>
-                              </a:solidFill>
-                              <a:ln>
-                                <a:noFill/>
-                              </a:ln>
-                            </wps:spPr>
-                            <wps:style>
-                              <a:lnRef idx="2">
-                                <a:schemeClr val="accent1">
-                                  <a:shade val="50000"/>
-                                </a:schemeClr>
-                              </a:lnRef>
-                              <a:fillRef idx="1">
-                                <a:schemeClr val="accent1"/>
-                              </a:fillRef>
-                              <a:effectRef idx="0">
-                                <a:schemeClr val="accent1"/>
-                              </a:effectRef>
-                              <a:fontRef idx="minor">
-                                <a:schemeClr val="lt1"/>
-                              </a:fontRef>
-                            </wps:style>
-                            <wps:bodyPr rot="0" spcFirstLastPara="0" vertOverflow="overflow" horzOverflow="overflow" vert="horz" wrap="square" lIns="91440" tIns="45720" rIns="91440" bIns="45720" numCol="1" spcCol="0" rtlCol="0" fromWordArt="0" anchor="ctr" anchorCtr="0" forceAA="0" compatLnSpc="1">
-                              <a:prstTxWarp prst="textNoShape">
-                                <a:avLst/>
-                              </a:prstTxWarp>
-                              <a:noAutofit/>
-                            </wps:bodyPr>
-                          </wps:wsp>
-                          <wps:wsp>
-                            <wps:cNvPr id="18" name="Rectangle 14"/>
-                            <wps:cNvSpPr/>
-                            <wps:spPr>
-                              <a:xfrm>
-                                <a:off x="213360" y="22860"/>
-                                <a:ext cx="664780" cy="320040"/>
-                              </a:xfrm>
-                              <a:prstGeom prst="rect">
-                                <a:avLst/>
-                              </a:prstGeom>
-                              <a:solidFill>
-                                <a:srgbClr val="E5B671"/>
-                              </a:solidFill>
-                              <a:ln>
-                                <a:noFill/>
-                              </a:ln>
-                            </wps:spPr>
-                            <wps:style>
-                              <a:lnRef idx="2">
-                                <a:schemeClr val="accent1">
-                                  <a:shade val="50000"/>
-                                </a:schemeClr>
-                              </a:lnRef>
-                              <a:fillRef idx="1">
-                                <a:schemeClr val="accent1"/>
-                              </a:fillRef>
-                              <a:effectRef idx="0">
-                                <a:schemeClr val="accent1"/>
-                              </a:effectRef>
-                              <a:fontRef idx="minor">
-                                <a:schemeClr val="lt1"/>
-                              </a:fontRef>
-                            </wps:style>
-                            <wps:bodyPr rot="0" spcFirstLastPara="0" vertOverflow="overflow" horzOverflow="overflow" vert="horz" wrap="square" lIns="91440" tIns="45720" rIns="91440" bIns="45720" numCol="1" spcCol="0" rtlCol="0" fromWordArt="0" anchor="ctr" anchorCtr="0" forceAA="0" compatLnSpc="1">
-                              <a:prstTxWarp prst="textNoShape">
-                                <a:avLst/>
-                              </a:prstTxWarp>
-                              <a:noAutofit/>
-                            </wps:bodyPr>
-                          </wps:wsp>
-                        </wpg:grpSp>
-                        <wps:wsp>
-                          <wps:cNvPr id="19" name="Rectangle 15"/>
-                          <wps:cNvSpPr/>
-                          <wps:spPr>
-                            <a:xfrm>
-                              <a:off x="90714" y="0"/>
-                              <a:ext cx="91440" cy="365760"/>
-                            </a:xfrm>
-                            <a:prstGeom prst="rect">
-                              <a:avLst/>
-                            </a:prstGeom>
-                            <a:solidFill>
-                              <a:srgbClr val="FF0000"/>
-                            </a:solidFill>
-                            <a:ln>
-                              <a:noFill/>
-                            </a:ln>
-                          </wps:spPr>
-                          <wps:style>
-                            <a:lnRef idx="2">
-                              <a:schemeClr val="accent1">
-                                <a:shade val="50000"/>
-                              </a:schemeClr>
-                            </a:lnRef>
-                            <a:fillRef idx="1">
-                              <a:schemeClr val="accent1"/>
-                            </a:fillRef>
-                            <a:effectRef idx="0">
-                              <a:schemeClr val="accent1"/>
-                            </a:effectRef>
-                            <a:fontRef idx="minor">
-                              <a:schemeClr val="lt1"/>
-                            </a:fontRef>
-                          </wps:style>
-                          <wps:bodyPr rot="0" spcFirstLastPara="0" vertOverflow="overflow" horzOverflow="overflow" vert="horz" wrap="square" lIns="91440" tIns="45720" rIns="91440" bIns="45720" numCol="1" spcCol="0" rtlCol="0" fromWordArt="0" anchor="ctr" anchorCtr="0" forceAA="0" compatLnSpc="1">
-                            <a:prstTxWarp prst="textNoShape">
-                              <a:avLst/>
-                            </a:prstTxWarp>
-                            <a:noAutofit/>
-                          </wps:bodyPr>
-                        </wps:wsp>
-                        <wps:wsp>
-                          <wps:cNvPr id="26" name="Rectangle 16"/>
-                          <wps:cNvSpPr/>
-                          <wps:spPr>
-                            <a:xfrm>
-                              <a:off x="624114" y="22352"/>
-                              <a:ext cx="91440" cy="320040"/>
-                            </a:xfrm>
-                            <a:prstGeom prst="rect">
-                              <a:avLst/>
-                            </a:prstGeom>
-                            <a:solidFill>
-                              <a:schemeClr val="tx1"/>
-                            </a:solidFill>
-                            <a:ln>
-                              <a:noFill/>
-                            </a:ln>
-                          </wps:spPr>
-                          <wps:style>
-                            <a:lnRef idx="2">
-                              <a:schemeClr val="accent1">
-                                <a:shade val="50000"/>
-                              </a:schemeClr>
-                            </a:lnRef>
-                            <a:fillRef idx="1">
-                              <a:schemeClr val="accent1"/>
-                            </a:fillRef>
-                            <a:effectRef idx="0">
-                              <a:schemeClr val="accent1"/>
-                            </a:effectRef>
-                            <a:fontRef idx="minor">
-                              <a:schemeClr val="lt1"/>
-                            </a:fontRef>
-                          </wps:style>
-                          <wps:bodyPr rot="0" spcFirstLastPara="0" vertOverflow="overflow" horzOverflow="overflow" vert="horz" wrap="square" lIns="91440" tIns="45720" rIns="91440" bIns="45720" numCol="1" spcCol="0" rtlCol="0" fromWordArt="0" anchor="ctr" anchorCtr="0" forceAA="0" compatLnSpc="1">
-                            <a:prstTxWarp prst="textNoShape">
-                              <a:avLst/>
-                            </a:prstTxWarp>
-                            <a:noAutofit/>
-                          </wps:bodyPr>
-                        </wps:wsp>
-                        <wps:wsp>
-                          <wps:cNvPr id="28" name="Rectangle 17"/>
-                          <wps:cNvSpPr/>
-                          <wps:spPr>
-                            <a:xfrm>
-                              <a:off x="268514" y="22352"/>
-                              <a:ext cx="91440" cy="320040"/>
-                            </a:xfrm>
-                            <a:prstGeom prst="rect">
-                              <a:avLst/>
-                            </a:prstGeom>
-                            <a:solidFill>
-                              <a:srgbClr val="7030A0"/>
-                            </a:solidFill>
-                            <a:ln>
-                              <a:noFill/>
-                            </a:ln>
-                          </wps:spPr>
-                          <wps:style>
-                            <a:lnRef idx="2">
-                              <a:schemeClr val="accent1">
-                                <a:shade val="50000"/>
-                              </a:schemeClr>
-                            </a:lnRef>
-                            <a:fillRef idx="1">
-                              <a:schemeClr val="accent1"/>
-                            </a:fillRef>
-                            <a:effectRef idx="0">
-                              <a:schemeClr val="accent1"/>
-                            </a:effectRef>
-                            <a:fontRef idx="minor">
-                              <a:schemeClr val="lt1"/>
-                            </a:fontRef>
-                          </wps:style>
-                          <wps:bodyPr rot="0" spcFirstLastPara="0" vertOverflow="overflow" horzOverflow="overflow" vert="horz" wrap="square" lIns="91440" tIns="45720" rIns="91440" bIns="45720" numCol="1" spcCol="0" rtlCol="0" fromWordArt="0" anchor="ctr" anchorCtr="0" forceAA="0" compatLnSpc="1">
-                            <a:prstTxWarp prst="textNoShape">
-                              <a:avLst/>
-                            </a:prstTxWarp>
-                            <a:noAutofit/>
-                          </wps:bodyPr>
-                        </wps:wsp>
-                        <wps:wsp>
-                          <wps:cNvPr id="29" name="Rectangle 18"/>
-                          <wps:cNvSpPr/>
-                          <wps:spPr>
-                            <a:xfrm>
-                              <a:off x="446314" y="22352"/>
-                              <a:ext cx="91440" cy="320040"/>
-                            </a:xfrm>
-                            <a:prstGeom prst="rect">
-                              <a:avLst/>
-                            </a:prstGeom>
-                            <a:solidFill>
-                              <a:srgbClr val="00B050"/>
-                            </a:solidFill>
-                            <a:ln>
-                              <a:noFill/>
-                            </a:ln>
-                          </wps:spPr>
-                          <wps:style>
-                            <a:lnRef idx="2">
-                              <a:schemeClr val="accent1">
-                                <a:shade val="50000"/>
-                              </a:schemeClr>
-                            </a:lnRef>
-                            <a:fillRef idx="1">
-                              <a:schemeClr val="accent1"/>
-                            </a:fillRef>
-                            <a:effectRef idx="0">
-                              <a:schemeClr val="accent1"/>
-                            </a:effectRef>
-                            <a:fontRef idx="minor">
-                              <a:schemeClr val="lt1"/>
-                            </a:fontRef>
-                          </wps:style>
-                          <wps:bodyPr rot="0" spcFirstLastPara="0" vertOverflow="overflow" horzOverflow="overflow" vert="horz" wrap="square" lIns="91440" tIns="45720" rIns="91440" bIns="45720" numCol="1" spcCol="0" rtlCol="0" fromWordArt="0" anchor="ctr" anchorCtr="0" forceAA="0" compatLnSpc="1">
-                            <a:prstTxWarp prst="textNoShape">
-                              <a:avLst/>
-                            </a:prstTxWarp>
-                            <a:noAutofit/>
-                          </wps:bodyPr>
-                        </wps:wsp>
-                        <wps:wsp>
-                          <wps:cNvPr id="30" name="Rectangle 19"/>
-                          <wps:cNvSpPr/>
-                          <wps:spPr>
-                            <a:xfrm>
-                              <a:off x="892628" y="0"/>
-                              <a:ext cx="91440" cy="365760"/>
-                            </a:xfrm>
-                            <a:prstGeom prst="rect">
-                              <a:avLst/>
-                            </a:prstGeom>
-                            <a:solidFill>
-                              <a:srgbClr val="984806"/>
-                            </a:solidFill>
-                            <a:ln>
-                              <a:noFill/>
-                            </a:ln>
-                          </wps:spPr>
-                          <wps:style>
-                            <a:lnRef idx="2">
-                              <a:schemeClr val="accent1">
-                                <a:shade val="50000"/>
-                              </a:schemeClr>
-                            </a:lnRef>
-                            <a:fillRef idx="1">
-                              <a:schemeClr val="accent1"/>
-                            </a:fillRef>
-                            <a:effectRef idx="0">
-                              <a:schemeClr val="accent1"/>
-                            </a:effectRef>
-                            <a:fontRef idx="minor">
-                              <a:schemeClr val="lt1"/>
-                            </a:fontRef>
-                          </wps:style>
-                          <wps:bodyPr rot="0" spcFirstLastPara="0" vertOverflow="overflow" horzOverflow="overflow" vert="horz" wrap="square" lIns="91440" tIns="45720" rIns="91440" bIns="45720" numCol="1" spcCol="0" rtlCol="0" fromWordArt="0" anchor="ctr" anchorCtr="0" forceAA="0" compatLnSpc="1">
-                            <a:prstTxWarp prst="textNoShape">
-                              <a:avLst/>
-                            </a:prstTxWarp>
-                            <a:noAutofit/>
-                          </wps:bodyPr>
-                        </wps:wsp>
-                      </wpg:grpSp>
-                      <wpg:grpSp>
-                        <wpg:cNvPr id="31" name="Group 31"/>
-                        <wpg:cNvGrpSpPr/>
-                        <wpg:grpSpPr>
-                          <a:xfrm>
-                            <a:off x="6350" y="47625"/>
-                            <a:ext cx="911225" cy="304800"/>
-                            <a:chOff x="0" y="0"/>
-                            <a:chExt cx="911225" cy="304800"/>
-                          </a:xfrm>
-                        </wpg:grpSpPr>
-                        <wps:wsp>
-                          <wps:cNvPr id="42" name="Text Box 26"/>
-                          <wps:cNvSpPr txBox="1"/>
-                          <wps:spPr>
-                            <a:xfrm>
-                              <a:off x="0" y="0"/>
-                              <a:ext cx="238125" cy="304800"/>
-                            </a:xfrm>
-                            <a:prstGeom prst="rect">
-                              <a:avLst/>
-                            </a:prstGeom>
-                            <a:noFill/>
-                            <a:ln w="6350">
-                              <a:noFill/>
-                            </a:ln>
-                          </wps:spPr>
-                          <wps:txbx>
-                            <w:txbxContent>
-                              <w:p>
-                                <w:pPr>
-                                  <w:rPr>
-                                    <w:color w:val="FFFFFF" w:themeColor="background1"/>
-                                    <w:sz w:val="20"/>
-                                    <w:szCs w:val="20"/>
-                                  </w:rPr>
-                                </w:pPr>
-                                <w:r>
-                                  <w:rPr>
-                                    <w:color w:val="FFFFFF" w:themeColor="background1"/>
-                                    <w:sz w:val="20"/>
-                                    <w:szCs w:val="20"/>
-                                  </w:rPr>
-                                  <w:t xml:space="preserve">2   </w:t>
-                                </w:r>
-                              </w:p>
-                            </w:txbxContent>
-                          </wps:txbx>
-                          <wps:bodyPr rot="0" spcFirstLastPara="0" vertOverflow="overflow" horzOverflow="overflow" vert="horz" wrap="square" lIns="91440" tIns="45720" rIns="91440" bIns="45720" numCol="1" spcCol="0" rtlCol="0" fromWordArt="0" anchor="b" anchorCtr="0" forceAA="0" compatLnSpc="1">
-                            <a:prstTxWarp prst="textNoShape">
-                              <a:avLst/>
-                            </a:prstTxWarp>
-                            <a:noAutofit/>
-                          </wps:bodyPr>
-                        </wps:wsp>
-                        <wps:wsp>
-                          <wps:cNvPr id="44" name="Text Box 28"/>
-                          <wps:cNvSpPr txBox="1"/>
-                          <wps:spPr>
-                            <a:xfrm>
-                              <a:off x="177800" y="0"/>
-                              <a:ext cx="260350" cy="304800"/>
-                            </a:xfrm>
-                            <a:prstGeom prst="rect">
-                              <a:avLst/>
-                            </a:prstGeom>
-                            <a:noFill/>
-                            <a:ln w="6350">
-                              <a:noFill/>
-                            </a:ln>
-                          </wps:spPr>
-                          <wps:txbx>
-                            <w:txbxContent>
-                              <w:p>
-                                <w:pPr>
-                                  <w:rPr>
-                                    <w:color w:val="FFFFFF" w:themeColor="background1"/>
-                                    <w:sz w:val="20"/>
-                                    <w:szCs w:val="20"/>
-                                  </w:rPr>
-                                </w:pPr>
-                                <w:r>
-                                  <w:rPr>
-                                    <w:color w:val="FFFFFF" w:themeColor="background1"/>
-                                    <w:sz w:val="20"/>
-                                    <w:szCs w:val="20"/>
-                                  </w:rPr>
-                                  <w:t>7</w:t>
-                                </w:r>
-                              </w:p>
-                            </w:txbxContent>
-                          </wps:txbx>
-                          <wps:bodyPr rot="0" spcFirstLastPara="0" vertOverflow="overflow" horzOverflow="overflow" vert="horz" wrap="square" lIns="91440" tIns="45720" rIns="91440" bIns="45720" numCol="1" spcCol="0" rtlCol="0" fromWordArt="0" anchor="ctr" anchorCtr="0" forceAA="0" compatLnSpc="1">
-                            <a:prstTxWarp prst="textNoShape">
-                              <a:avLst/>
-                            </a:prstTxWarp>
-                            <a:noAutofit/>
-                          </wps:bodyPr>
-                        </wps:wsp>
-                        <wps:wsp>
-                          <wps:cNvPr id="48" name="Text Box 29"/>
-                          <wps:cNvSpPr txBox="1"/>
-                          <wps:spPr>
-                            <a:xfrm>
-                              <a:off x="520700" y="0"/>
-                              <a:ext cx="390525" cy="304800"/>
-                            </a:xfrm>
-                            <a:prstGeom prst="rect">
-                              <a:avLst/>
-                            </a:prstGeom>
-                            <a:noFill/>
-                            <a:ln w="6350">
-                              <a:noFill/>
-                            </a:ln>
-                          </wps:spPr>
-                          <wps:txbx>
-                            <w:txbxContent>
-                              <w:p>
-                                <w:pPr>
-                                  <w:rPr>
-                                    <w:color w:val="FFFFFF" w:themeColor="background1"/>
-                                    <w:sz w:val="20"/>
-                                    <w:szCs w:val="20"/>
-                                  </w:rPr>
-                                </w:pPr>
-                                <m:oMath>
-                                  <m:r>
-                                    <w:rPr>
-                                      <w:rFonts w:ascii="Cambria Math" w:hAnsi="Cambria Math" w:cstheme="minorHAnsi"/>
-                                      <w:color w:val="FFFFFF" w:themeColor="background1"/>
-                                      <w:sz w:val="20"/>
-                                      <w:szCs w:val="20"/>
-                                    </w:rPr>
-                                    <m:t>×</m:t>
-                                  </m:r>
-                                </m:oMath>
-                                <w:r>
-                                  <w:rPr>
-                                    <w:rFonts w:eastAsiaTheme="minorEastAsia" w:cstheme="minorHAnsi"/>
-                                    <w:color w:val="FFFFFF" w:themeColor="background1"/>
-                                    <w:sz w:val="20"/>
-                                    <w:szCs w:val="20"/>
-                                  </w:rPr>
-                                  <w:t>1</w:t>
-                                </w:r>
-                              </w:p>
-                            </w:txbxContent>
-                          </wps:txbx>
-                          <wps:bodyPr rot="0" spcFirstLastPara="0" vertOverflow="overflow" horzOverflow="overflow" vert="horz" wrap="square" lIns="91440" tIns="45720" rIns="91440" bIns="45720" numCol="1" spcCol="0" rtlCol="0" fromWordArt="0" anchor="ctr" anchorCtr="0" forceAA="0" compatLnSpc="1">
-                            <a:prstTxWarp prst="textNoShape">
-                              <a:avLst/>
-                            </a:prstTxWarp>
-                            <a:noAutofit/>
-                          </wps:bodyPr>
-                        </wps:wsp>
-                        <wps:wsp>
-                          <wps:cNvPr id="49" name="Text Box 30"/>
-                          <wps:cNvSpPr txBox="1"/>
-                          <wps:spPr>
-                            <a:xfrm>
-                              <a:off x="358776" y="0"/>
-                              <a:ext cx="192024" cy="304800"/>
-                            </a:xfrm>
-                            <a:prstGeom prst="rect">
-                              <a:avLst/>
-                            </a:prstGeom>
-                            <a:noFill/>
-                            <a:ln w="6350">
-                              <a:noFill/>
-                            </a:ln>
-                          </wps:spPr>
-                          <wps:txbx>
-                            <w:txbxContent>
-                              <w:p>
-                                <w:pPr>
-                                  <w:rPr>
-                                    <w:color w:val="FFFFFF" w:themeColor="background1"/>
-                                    <w:sz w:val="20"/>
-                                    <w:szCs w:val="20"/>
-                                  </w:rPr>
-                                </w:pPr>
-                                <w:r>
-                                  <w:rPr>
-                                    <w:color w:val="FFFFFF" w:themeColor="background1"/>
-                                    <w:sz w:val="20"/>
-                                    <w:szCs w:val="20"/>
-                                  </w:rPr>
-                                  <w:t>5</w:t>
-                                </w:r>
-                                <w:sdt>
-                                  <w:sdtPr>
-                                    <w:rPr>
-                                      <w:rFonts w:ascii="Cambria Math" w:hAnsi="Cambria Math"/>
-                                      <w:i/>
-                                      <w:color w:val="FFFFFF" w:themeColor="background1"/>
-                                      <w:sz w:val="20"/>
-                                      <w:szCs w:val="20"/>
-                                    </w:rPr>
-                                    <w:id w:val="-1748876751"/>
-                                    <w:placeholder>
-                                      <w:docPart w:val="DefaultPlaceholder_2098659788"/>
-                                    </w:placeholder>
-                                    <w:temporary/>
-                                    <w:showingPlcHdr/>
-                                    <w:equation/>
-                                  </w:sdtPr>
-                                  <w:sdtEndPr/>
-                                  <w:sdtContent>
-                                    <m:oMath>
-                                      <m:r>
-                                        <m:rPr>
-                                          <m:sty m:val="p"/>
-                                        </m:rPr>
-                                        <w:rPr>
-                                          <w:rStyle w:val="PlaceholderText"/>
-                                          <w:rFonts w:ascii="Cambria Math" w:hAnsi="Cambria Math"/>
-                                          <w:sz w:val="20"/>
-                                          <w:szCs w:val="20"/>
-                                        </w:rPr>
-                                        <m:t>Type equation here.</m:t>
-                                      </m:r>
-                                    </m:oMath>
-                                  </w:sdtContent>
-                                </w:sdt>
-                              </w:p>
-                            </w:txbxContent>
-                          </wps:txbx>
-                          <wps:bodyPr rot="0" spcFirstLastPara="0" vertOverflow="overflow" horzOverflow="overflow" vert="horz" wrap="square" lIns="91440" tIns="45720" rIns="91440" bIns="45720" numCol="1" spcCol="0" rtlCol="0" fromWordArt="0" anchor="ctr" anchorCtr="0" forceAA="0" compatLnSpc="1">
-                            <a:prstTxWarp prst="textNoShape">
-                              <a:avLst/>
-                            </a:prstTxWarp>
-                            <a:noAutofit/>
-                          </wps:bodyPr>
-                        </wps:wsp>
-                      </wpg:grpSp>
-                    </wpg:wgp>
-                  </a:graphicData>
-                </a:graphic>
-              </wp:anchor>
-            </w:drawing>
-          </mc:Choice>
-          <mc:Fallback>
-            <w:pict>
-              <v:group id="5 band resistor" o:spid="_x0000_s1044" style="position:absolute;margin-left:188.5pt;margin-top:184.4pt;width:85.8pt;height:28.8pt;z-index:251696128" coordsize="10896,3657" o:gfxdata="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">
-                <v:group id="Group 20" o:spid="_x0000_s1045" style="position:absolute;width:10896;height:3657" coordsize="10896,3657" o:gfxdata="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">
-                  <v:group id="Group 11" o:spid="_x0000_s1046" style="position:absolute;width:10896;height:3657" coordsize="10896,3657" o:gfxdata="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">
-                    <v:roundrect id="Rounded Rectangle 12" o:spid="_x0000_s1047" style="position:absolute;width:2743;height:3657;visibility:visible;mso-wrap-style:square;v-text-anchor:middle" arcsize="17704f" o:gfxdata="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" fillcolor="#e5b671" stroked="f" strokeweight="2pt"/>
-                    <v:roundrect id="Rounded Rectangle 13" o:spid="_x0000_s1048" style="position:absolute;left:8153;width:2743;height:3657;visibility:visible;mso-wrap-style:square;v-text-anchor:middle" arcsize="19585f" o:gfxdata="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" fillcolor="#e5b671" stroked="f" strokeweight="2pt"/>
-                    <v:rect id="Rectangle 14" o:spid="_x0000_s1049" style="position:absolute;left:2133;top:228;width:6648;height:3201;visibility:visible;mso-wrap-style:square;v-text-anchor:middle" o:gfxdata="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" fillcolor="#e5b671" stroked="f" strokeweight="2pt"/>
-                  </v:group>
-                  <v:rect id="Rectangle 15" o:spid="_x0000_s1050" style="position:absolute;left:907;width:914;height:3657;visibility:visible;mso-wrap-style:square;v-text-anchor:middle" o:gfxdata="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" fillcolor="red" stroked="f" strokeweight="2pt"/>
-                  <v:rect id="Rectangle 16" o:spid="_x0000_s1051" style="position:absolute;left:6241;top:223;width:914;height:3200;visibility:visible;mso-wrap-style:square;v-text-anchor:middle" o:gfxdata="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" fillcolor="black [3213]" stroked="f" strokeweight="2pt"/>
-                  <v:rect id="Rectangle 17" o:spid="_x0000_s1052" style="position:absolute;left:2685;top:223;width:914;height:3200;visibility:visible;mso-wrap-style:square;v-text-anchor:middle" o:gfxdata="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" fillcolor="#7030a0" stroked="f" strokeweight="2pt"/>
-                  <v:rect id="Rectangle 18" o:spid="_x0000_s1053" style="position:absolute;left:4463;top:223;width:914;height:3200;visibility:visible;mso-wrap-style:square;v-text-anchor:middle" o:gfxdata="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" fillcolor="#00b050" stroked="f" strokeweight="2pt"/>
-                  <v:rect id="Rectangle 19" o:spid="_x0000_s1054" style="position:absolute;left:8926;width:914;height:3657;visibility:visible;mso-wrap-style:square;v-text-anchor:middle" o:gfxdata="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" fillcolor="#984806" stroked="f" strokeweight="2pt"/>
-                </v:group>
-                <v:group id="Group 31" o:spid="_x0000_s1055" style="position:absolute;left:63;top:476;width:9112;height:3048" coordsize="9112,3048" o:gfxdata="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">
-                  <v:shape id="Text Box 26" o:spid="_x0000_s1056" type="#_x0000_t202" style="position:absolute;width:2381;height:3048;visibility:visible;mso-wrap-style:square;v-text-anchor:bottom" o:gfxdata="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" filled="f" stroked="f" strokeweight=".5pt">
-                    <v:textbox>
-                      <w:txbxContent>
-                        <w:p>
-                          <w:pPr>
-                            <w:rPr>
-                              <w:color w:val="FFFFFF" w:themeColor="background1"/>
-                              <w:sz w:val="20"/>
-                              <w:szCs w:val="20"/>
-                            </w:rPr>
-                          </w:pPr>
-                          <w:r>
-                            <w:rPr>
-                              <w:color w:val="FFFFFF" w:themeColor="background1"/>
-                              <w:sz w:val="20"/>
-                              <w:szCs w:val="20"/>
-                            </w:rPr>
-                            <w:t xml:space="preserve">2   </w:t>
-                          </w:r>
-                        </w:p>
-                      </w:txbxContent>
-                    </v:textbox>
-                  </v:shape>
-                  <v:shape id="Text Box 28" o:spid="_x0000_s1057" type="#_x0000_t202" style="position:absolute;left:1778;width:2603;height:3048;visibility:visible;mso-wrap-style:square;v-text-anchor:middle" o:gfxdata="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" filled="f" stroked="f" strokeweight=".5pt">
-                    <v:textbox>
-                      <w:txbxContent>
-                        <w:p>
-                          <w:pPr>
-                            <w:rPr>
-                              <w:color w:val="FFFFFF" w:themeColor="background1"/>
-                              <w:sz w:val="20"/>
-                              <w:szCs w:val="20"/>
-                            </w:rPr>
-                          </w:pPr>
-                          <w:r>
-                            <w:rPr>
-                              <w:color w:val="FFFFFF" w:themeColor="background1"/>
-                              <w:sz w:val="20"/>
-                              <w:szCs w:val="20"/>
-                            </w:rPr>
-                            <w:t>7</w:t>
-                          </w:r>
-                        </w:p>
-                      </w:txbxContent>
-                    </v:textbox>
-                  </v:shape>
-                  <v:shape id="Text Box 29" o:spid="_x0000_s1058" type="#_x0000_t202" style="position:absolute;left:5207;width:3905;height:3048;visibility:visible;mso-wrap-style:square;v-text-anchor:middle" o:gfxdata="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" filled="f" stroked="f" strokeweight=".5pt">
-                    <v:textbox>
-                      <w:txbxContent>
-                        <w:p>
-                          <w:pPr>
-                            <w:rPr>
-                              <w:color w:val="FFFFFF" w:themeColor="background1"/>
-                              <w:sz w:val="20"/>
-                              <w:szCs w:val="20"/>
-                            </w:rPr>
-                          </w:pPr>
-                          <m:oMath>
-                            <m:r>
-                              <w:rPr>
-                                <w:rFonts w:ascii="Cambria Math" w:hAnsi="Cambria Math" w:cstheme="minorHAnsi"/>
-                                <w:color w:val="FFFFFF" w:themeColor="background1"/>
-                                <w:sz w:val="20"/>
-                                <w:szCs w:val="20"/>
-                              </w:rPr>
-                              <m:t>×</m:t>
-                            </m:r>
-                          </m:oMath>
-                          <w:r>
-                            <w:rPr>
-                              <w:rFonts w:eastAsiaTheme="minorEastAsia" w:cstheme="minorHAnsi"/>
-                              <w:color w:val="FFFFFF" w:themeColor="background1"/>
-                              <w:sz w:val="20"/>
-                              <w:szCs w:val="20"/>
-                            </w:rPr>
-                            <w:t>1</w:t>
-                          </w:r>
-                        </w:p>
-                      </w:txbxContent>
-                    </v:textbox>
-                  </v:shape>
-                  <v:shape id="Text Box 30" o:spid="_x0000_s1059" type="#_x0000_t202" style="position:absolute;left:3587;width:1921;height:3048;visibility:visible;mso-wrap-style:square;v-text-anchor:middle" o:gfxdata="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" filled="f" stroked="f" strokeweight=".5pt">
-                    <v:textbox>
-                      <w:txbxContent>
-                        <w:p>
-                          <w:pPr>
-                            <w:rPr>
-                              <w:color w:val="FFFFFF" w:themeColor="background1"/>
-                              <w:sz w:val="20"/>
-                              <w:szCs w:val="20"/>
-                            </w:rPr>
-                          </w:pPr>
-                          <w:r>
-                            <w:rPr>
-                              <w:color w:val="FFFFFF" w:themeColor="background1"/>
-                              <w:sz w:val="20"/>
-                              <w:szCs w:val="20"/>
-                            </w:rPr>
-                            <w:t>5</w:t>
-                          </w:r>
-                          <w:sdt>
-                            <w:sdtPr>
-                              <w:rPr>
-                                <w:rFonts w:ascii="Cambria Math" w:hAnsi="Cambria Math"/>
-                                <w:i/>
-                                <w:color w:val="FFFFFF" w:themeColor="background1"/>
-                                <w:sz w:val="20"/>
-                                <w:szCs w:val="20"/>
-                              </w:rPr>
-                              <w:id w:val="-1748876751"/>
-                              <w:placeholder>
-                                <w:docPart w:val="DefaultPlaceholder_2098659788"/>
-                              </w:placeholder>
-                              <w:temporary/>
-                              <w:showingPlcHdr/>
-                              <w:equation/>
-                            </w:sdtPr>
-                            <w:sdtEndPr/>
-                            <w:sdtContent>
-                              <m:oMath>
-                                <m:r>
-                                  <m:rPr>
-                                    <m:sty m:val="p"/>
-                                  </m:rPr>
-                                  <w:rPr>
-                                    <w:rStyle w:val="PlaceholderText"/>
-                                    <w:rFonts w:ascii="Cambria Math" w:hAnsi="Cambria Math"/>
-                                    <w:sz w:val="20"/>
-                                    <w:szCs w:val="20"/>
-                                  </w:rPr>
-                                  <m:t>Type equation here.</m:t>
-                                </m:r>
-                              </m:oMath>
-                            </w:sdtContent>
-                          </w:sdt>
-                        </w:p>
-                      </w:txbxContent>
-                    </v:textbox>
-                  </v:shape>
-                </v:group>
+              <v:group w14:anchorId="7FC6DE39" id="Group 50" o:spid="_x0000_s1026" style="position:absolute;margin-left:146.4pt;margin-top:146.25pt;width:215.85pt;height:36pt;z-index:251710464;mso-width-relative:margin;mso-height-relative:margin" coordsize="27412,5524" o:gfxdata="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">
+                <v:shape id="Freeform 35" o:spid="_x0000_s1027" style="position:absolute;width:6635;height:5524;visibility:visible;mso-wrap-style:square;v-text-anchor:middle" coordsize="663575,342900" o:gfxdata="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" path="m,l,98425,663575,234950r,107950e" filled="f" strokecolor="black [3040]" strokeweight="1pt">
+                  <v:stroke dashstyle="3 1" startarrowwidth="narrow" startarrowlength="short" endarrow="open" endarrowwidth="narrow" endarrowlength="short"/>
+                  <v:path arrowok="t" o:connecttype="custom" o:connectlocs="0,0;0,158574;663575,378531;663575,552450" o:connectangles="0,0,0,0"/>
+                </v:shape>
+                <v:shape id="Freeform 38" o:spid="_x0000_s1028" style="position:absolute;left:5105;width:3397;height:5524;visibility:visible;mso-wrap-style:square;v-text-anchor:middle" coordsize="663575,342900" o:gfxdata="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" path="m,l,98425,663575,234950r,107950e" filled="f" strokecolor="black [3040]" strokeweight="1pt">
+                  <v:stroke dashstyle="3 1" startarrowwidth="narrow" startarrowlength="short" endarrow="open" endarrowwidth="narrow" endarrowlength="short"/>
+                  <v:path arrowok="t" o:connecttype="custom" o:connectlocs="0,0;0,158574;339725,378531;339725,552450" o:connectangles="0,0,0,0"/>
+                </v:shape>
+                <v:shape id="Freeform 39" o:spid="_x0000_s1029" style="position:absolute;left:12115;width:6420;height:5524;flip:x;visibility:visible;mso-wrap-style:square;v-text-anchor:middle" coordsize="663575,342900" o:gfxdata="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" path="m,l,98425,663575,234950r,107950e" filled="f" strokecolor="black [3040]" strokeweight="1pt">
+                  <v:stroke dashstyle="3 1" startarrowwidth="narrow" startarrowlength="short" endarrow="open" endarrowwidth="narrow" endarrowlength="short"/>
+                  <v:path arrowok="t" o:connecttype="custom" o:connectlocs="0,0;0,158574;641985,378531;641985,552450" o:connectangles="0,0,0,0"/>
+                </v:shape>
+                <v:shape id="Freeform 40" o:spid="_x0000_s1030" style="position:absolute;left:14782;width:12630;height:5524;flip:x;visibility:visible;mso-wrap-style:square;v-text-anchor:middle" coordsize="663575,342900" o:gfxdata="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" path="m,l,98425,663575,234950r,107950e" filled="f" strokecolor="black [3040]" strokeweight="1pt">
+                  <v:stroke dashstyle="3 1" startarrowwidth="narrow" startarrowlength="short" endarrow="open" endarrowwidth="narrow" endarrowlength="short"/>
+                  <v:path arrowok="t" o:connecttype="custom" o:connectlocs="0,0;0,158574;1263015,378531;1263015,552450" o:connectangles="0,0,0,0"/>
+                </v:shape>
+                <v:line id="Straight Connector 41" o:spid="_x0000_s1031" style="position:absolute;visibility:visible;mso-wrap-style:square" from="10264,0" to="10264,5486" o:connectortype="straight" o:gfxdata="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" strokecolor="black [3040]" strokeweight="1pt">
+                  <v:stroke dashstyle="3 1" startarrowwidth="narrow" startarrowlength="short" endarrow="open" endarrowwidth="narrow" endarrowlength="short"/>
+                </v:line>
               </v:group>
             </w:pict>
           </mc:Fallback>
@@ -6010,8 +6667,58 @@
 </w:document>
 </file>
 
+<file path=word/endnotes.xml><?xml version="1.0" encoding="utf-8"?>
+<w:endnotes xmlns:wpc="http://schemas.microsoft.com/office/word/2010/wordprocessingCanvas" xmlns:cx="http://schemas.microsoft.com/office/drawing/2014/chartex" xmlns:cx1="http://schemas.microsoft.com/office/drawing/2015/9/8/chartex" xmlns:cx2="http://schemas.microsoft.com/office/drawing/2015/10/21/chartex" xmlns:cx3="http://schemas.microsoft.com/office/drawing/2016/5/9/chartex" xmlns:cx4="http://schemas.microsoft.com/office/drawing/2016/5/10/chartex" xmlns:cx5="http://schemas.microsoft.com/office/drawing/2016/5/11/chartex" xmlns:cx6="http://schemas.microsoft.com/office/drawing/2016/5/12/chartex" xmlns:cx7="http://schemas.microsoft.com/office/drawing/2016/5/13/chartex" xmlns:cx8="http://schemas.microsoft.com/office/drawing/2016/5/14/chartex" xmlns:mc="http://schemas.openxmlformats.org/markup-compatibility/2006" xmlns:aink="http://schemas.microsoft.com/office/drawing/2016/ink" xmlns:am3d="http://schemas.microsoft.com/office/drawing/2017/model3d" xmlns:o="urn:schemas-microsoft-com:office:office" xmlns:oel="http://schemas.microsoft.com/office/2019/extlst" xmlns:r="http://schemas.openxmlformats.org/officeDocument/2006/relationships" xmlns:m="http://schemas.openxmlformats.org/officeDocument/2006/math" xmlns:v="urn:schemas-microsoft-com:vml" xmlns:wp14="http://schemas.microsoft.com/office/word/2010/wordprocessingDrawing" xmlns:wp="http://schemas.openxmlformats.org/drawingml/2006/wordprocessingDrawing" xmlns:w10="urn:schemas-microsoft-com:office:word" xmlns:w="http://schemas.openxmlformats.org/wordprocessingml/2006/main" xmlns:w14="http://schemas.microsoft.com/office/word/2010/wordml" xmlns:w15="http://schemas.microsoft.com/office/word/2012/wordml" xmlns:w16cex="http://schemas.microsoft.com/office/word/2018/wordml/cex" xmlns:w16cid="http://schemas.microsoft.com/office/word/2016/wordml/cid" xmlns:w16="http://schemas.microsoft.com/office/word/2018/wordml" xmlns:w16du="http://schemas.microsoft.com/office/word/2023/wordml/word16du" xmlns:w16sdtdh="http://schemas.microsoft.com/office/word/2020/wordml/sdtdatahash" xmlns:w16sdtfl="http://schemas.microsoft.com/office/word/2024/wordml/sdtformatlock" xmlns:w16se="http://schemas.microsoft.com/office/word/2015/wordml/symex" xmlns:wpg="http://schemas.microsoft.com/office/word/2010/wordprocessingGroup" xmlns:wpi="http://schemas.microsoft.com/office/word/2010/wordprocessingInk" xmlns:wne="http://schemas.microsoft.com/office/word/2006/wordml" xmlns:wps="http://schemas.microsoft.com/office/word/2010/wordprocessingShape" mc:Ignorable="w14 w15 w16se w16cid w16 w16cex w16sdtdh w16sdtfl w16du wp14">
+  <w:endnote w:type="separator" w:id="-1">
+    <w:p>
+      <w:pPr>
+        <w:spacing w:after="0" w:line="240" w:lineRule="auto"/>
+      </w:pPr>
+      <w:r>
+        <w:separator/>
+      </w:r>
+    </w:p>
+  </w:endnote>
+  <w:endnote w:type="continuationSeparator" w:id="0">
+    <w:p>
+      <w:pPr>
+        <w:spacing w:after="0" w:line="240" w:lineRule="auto"/>
+      </w:pPr>
+      <w:r>
+        <w:continuationSeparator/>
+      </w:r>
+    </w:p>
+  </w:endnote>
+</w:endnotes>
+</file>
+
+<file path=word/footnotes.xml><?xml version="1.0" encoding="utf-8"?>
+<w:footnotes xmlns:wpc="http://schemas.microsoft.com/office/word/2010/wordprocessingCanvas" xmlns:cx="http://schemas.microsoft.com/office/drawing/2014/chartex" xmlns:cx1="http://schemas.microsoft.com/office/drawing/2015/9/8/chartex" xmlns:cx2="http://schemas.microsoft.com/office/drawing/2015/10/21/chartex" xmlns:cx3="http://schemas.microsoft.com/office/drawing/2016/5/9/chartex" xmlns:cx4="http://schemas.microsoft.com/office/drawing/2016/5/10/chartex" xmlns:cx5="http://schemas.microsoft.com/office/drawing/2016/5/11/chartex" xmlns:cx6="http://schemas.microsoft.com/office/drawing/2016/5/12/chartex" xmlns:cx7="http://schemas.microsoft.com/office/drawing/2016/5/13/chartex" xmlns:cx8="http://schemas.microsoft.com/office/drawing/2016/5/14/chartex" xmlns:mc="http://schemas.openxmlformats.org/markup-compatibility/2006" xmlns:aink="http://schemas.microsoft.com/office/drawing/2016/ink" xmlns:am3d="http://schemas.microsoft.com/office/drawing/2017/model3d" xmlns:o="urn:schemas-microsoft-com:office:office" xmlns:oel="http://schemas.microsoft.com/office/2019/extlst" xmlns:r="http://schemas.openxmlformats.org/officeDocument/2006/relationships" xmlns:m="http://schemas.openxmlformats.org/officeDocument/2006/math" xmlns:v="urn:schemas-microsoft-com:vml" xmlns:wp14="http://schemas.microsoft.com/office/word/2010/wordprocessingDrawing" xmlns:wp="http://schemas.openxmlformats.org/drawingml/2006/wordprocessingDrawing" xmlns:w10="urn:schemas-microsoft-com:office:word" xmlns:w="http://schemas.openxmlformats.org/wordprocessingml/2006/main" xmlns:w14="http://schemas.microsoft.com/office/word/2010/wordml" xmlns:w15="http://schemas.microsoft.com/office/word/2012/wordml" xmlns:w16cex="http://schemas.microsoft.com/office/word/2018/wordml/cex" xmlns:w16cid="http://schemas.microsoft.com/office/word/2016/wordml/cid" xmlns:w16="http://schemas.microsoft.com/office/word/2018/wordml" xmlns:w16du="http://schemas.microsoft.com/office/word/2023/wordml/word16du" xmlns:w16sdtdh="http://schemas.microsoft.com/office/word/2020/wordml/sdtdatahash" xmlns:w16sdtfl="http://schemas.microsoft.com/office/word/2024/wordml/sdtformatlock" xmlns:w16se="http://schemas.microsoft.com/office/word/2015/wordml/symex" xmlns:wpg="http://schemas.microsoft.com/office/word/2010/wordprocessingGroup" xmlns:wpi="http://schemas.microsoft.com/office/word/2010/wordprocessingInk" xmlns:wne="http://schemas.microsoft.com/office/word/2006/wordml" xmlns:wps="http://schemas.microsoft.com/office/word/2010/wordprocessingShape" mc:Ignorable="w14 w15 w16se w16cid w16 w16cex w16sdtdh w16sdtfl w16du wp14">
+  <w:footnote w:type="separator" w:id="-1">
+    <w:p>
+      <w:pPr>
+        <w:spacing w:after="0" w:line="240" w:lineRule="auto"/>
+      </w:pPr>
+      <w:r>
+        <w:separator/>
+      </w:r>
+    </w:p>
+  </w:footnote>
+  <w:footnote w:type="continuationSeparator" w:id="0">
+    <w:p>
+      <w:pPr>
+        <w:spacing w:after="0" w:line="240" w:lineRule="auto"/>
+      </w:pPr>
+      <w:r>
+        <w:continuationSeparator/>
+      </w:r>
+    </w:p>
+  </w:footnote>
+</w:footnotes>
+</file>
+
 <file path=word/styles.xml><?xml version="1.0" encoding="utf-8"?>
-<w:styles xmlns:mc="http://schemas.openxmlformats.org/markup-compatibility/2006" xmlns:r="http://schemas.openxmlformats.org/officeDocument/2006/relationships" xmlns:w="http://schemas.openxmlformats.org/wordprocessingml/2006/main" xmlns:w14="http://schemas.microsoft.com/office/word/2010/wordml" xmlns:w15="http://schemas.microsoft.com/office/word/2012/wordml" xmlns:w16se="http://schemas.microsoft.com/office/word/2015/wordml/symex" mc:Ignorable="w14 w15 w16se">
+<w:styles xmlns:mc="http://schemas.openxmlformats.org/markup-compatibility/2006" xmlns:r="http://schemas.openxmlformats.org/officeDocument/2006/relationships" xmlns:w="http://schemas.openxmlformats.org/wordprocessingml/2006/main" xmlns:w14="http://schemas.microsoft.com/office/word/2010/wordml" xmlns:w15="http://schemas.microsoft.com/office/word/2012/wordml" xmlns:w16cex="http://schemas.microsoft.com/office/word/2018/wordml/cex" xmlns:w16cid="http://schemas.microsoft.com/office/word/2016/wordml/cid" xmlns:w16="http://schemas.microsoft.com/office/word/2018/wordml" xmlns:w16du="http://schemas.microsoft.com/office/word/2023/wordml/word16du" xmlns:w16sdtdh="http://schemas.microsoft.com/office/word/2020/wordml/sdtdatahash" xmlns:w16sdtfl="http://schemas.microsoft.com/office/word/2024/wordml/sdtformatlock" xmlns:w16se="http://schemas.microsoft.com/office/word/2015/wordml/symex" mc:Ignorable="w14 w15 w16se w16cid w16 w16cex w16sdtdh w16sdtfl w16du">
   <w:docDefaults>
     <w:rPrDefault>
       <w:rPr>
@@ -6027,7 +6734,7 @@
       </w:pPr>
     </w:pPrDefault>
   </w:docDefaults>
-  <w:latentStyles w:defLockedState="0" w:defUIPriority="99" w:defSemiHidden="0" w:defUnhideWhenUsed="0" w:defQFormat="0" w:count="371">
+  <w:latentStyles w:defLockedState="0" w:defUIPriority="99" w:defSemiHidden="0" w:defUnhideWhenUsed="0" w:defQFormat="0" w:count="376">
     <w:lsdException w:name="Normal" w:uiPriority="0" w:qFormat="1"/>
     <w:lsdException w:name="heading 1" w:uiPriority="9" w:qFormat="1"/>
     <w:lsdException w:name="heading 2" w:semiHidden="1" w:uiPriority="9" w:unhideWhenUsed="1" w:qFormat="1"/>
@@ -6399,6 +7106,11 @@
     <w:lsdException w:name="List Table 5 Dark Accent 6" w:uiPriority="50"/>
     <w:lsdException w:name="List Table 6 Colorful Accent 6" w:uiPriority="51"/>
     <w:lsdException w:name="List Table 7 Colorful Accent 6" w:uiPriority="52"/>
+    <w:lsdException w:name="Mention" w:semiHidden="1" w:unhideWhenUsed="1"/>
+    <w:lsdException w:name="Smart Hyperlink" w:semiHidden="1" w:unhideWhenUsed="1"/>
+    <w:lsdException w:name="Hashtag" w:semiHidden="1" w:unhideWhenUsed="1"/>
+    <w:lsdException w:name="Unresolved Mention" w:semiHidden="1" w:unhideWhenUsed="1"/>
+    <w:lsdException w:name="Smart Link" w:semiHidden="1" w:unhideWhenUsed="1"/>
   </w:latentStyles>
   <w:style w:type="paragraph" w:default="1" w:styleId="Normal">
     <w:name w:val="Normal"/>
@@ -6460,11 +7172,55 @@
       <w:color w:val="808080"/>
     </w:rPr>
   </w:style>
+  <w:style w:type="paragraph" w:styleId="Header">
+    <w:name w:val="header"/>
+    <w:basedOn w:val="Normal"/>
+    <w:link w:val="HeaderChar"/>
+    <w:uiPriority w:val="99"/>
+    <w:unhideWhenUsed/>
+    <w:rsid w:val="00E10B59"/>
+    <w:pPr>
+      <w:tabs>
+        <w:tab w:val="center" w:pos="4680"/>
+        <w:tab w:val="right" w:pos="9360"/>
+      </w:tabs>
+      <w:spacing w:after="0" w:line="240" w:lineRule="auto"/>
+    </w:pPr>
+  </w:style>
+  <w:style w:type="character" w:customStyle="1" w:styleId="HeaderChar">
+    <w:name w:val="Header Char"/>
+    <w:basedOn w:val="DefaultParagraphFont"/>
+    <w:link w:val="Header"/>
+    <w:uiPriority w:val="99"/>
+    <w:rsid w:val="00E10B59"/>
+  </w:style>
+  <w:style w:type="paragraph" w:styleId="Footer">
+    <w:name w:val="footer"/>
+    <w:basedOn w:val="Normal"/>
+    <w:link w:val="FooterChar"/>
+    <w:uiPriority w:val="99"/>
+    <w:unhideWhenUsed/>
+    <w:rsid w:val="00E10B59"/>
+    <w:pPr>
+      <w:tabs>
+        <w:tab w:val="center" w:pos="4680"/>
+        <w:tab w:val="right" w:pos="9360"/>
+      </w:tabs>
+      <w:spacing w:after="0" w:line="240" w:lineRule="auto"/>
+    </w:pPr>
+  </w:style>
+  <w:style w:type="character" w:customStyle="1" w:styleId="FooterChar">
+    <w:name w:val="Footer Char"/>
+    <w:basedOn w:val="DefaultParagraphFont"/>
+    <w:link w:val="Footer"/>
+    <w:uiPriority w:val="99"/>
+    <w:rsid w:val="00E10B59"/>
+  </w:style>
 </w:styles>
 </file>
 
 <file path=word/glossary/document.xml><?xml version="1.0" encoding="utf-8"?>
-<w:glossaryDocument xmlns:wpc="http://schemas.microsoft.com/office/word/2010/wordprocessingCanvas" xmlns:cx="http://schemas.microsoft.com/office/drawing/2014/chartex" xmlns:cx1="http://schemas.microsoft.com/office/drawing/2015/9/8/chartex" xmlns:mc="http://schemas.openxmlformats.org/markup-compatibility/2006" xmlns:o="urn:schemas-microsoft-com:office:office" xmlns:r="http://schemas.openxmlformats.org/officeDocument/2006/relationships" xmlns:m="http://schemas.openxmlformats.org/officeDocument/2006/math" xmlns:v="urn:schemas-microsoft-com:vml" xmlns:wp14="http://schemas.microsoft.com/office/word/2010/wordprocessingDrawing" xmlns:wp="http://schemas.openxmlformats.org/drawingml/2006/wordprocessingDrawing" xmlns:w10="urn:schemas-microsoft-com:office:word" xmlns:w="http://schemas.openxmlformats.org/wordprocessingml/2006/main" xmlns:w14="http://schemas.microsoft.com/office/word/2010/wordml" xmlns:w15="http://schemas.microsoft.com/office/word/2012/wordml" xmlns:w16se="http://schemas.microsoft.com/office/word/2015/wordml/symex" xmlns:wpg="http://schemas.microsoft.com/office/word/2010/wordprocessingGroup" xmlns:wpi="http://schemas.microsoft.com/office/word/2010/wordprocessingInk" xmlns:wne="http://schemas.microsoft.com/office/word/2006/wordml" xmlns:wps="http://schemas.microsoft.com/office/word/2010/wordprocessingShape" mc:Ignorable="w14 w15 w16se wp14">
+<w:glossaryDocument xmlns:wpc="http://schemas.microsoft.com/office/word/2010/wordprocessingCanvas" xmlns:cx="http://schemas.microsoft.com/office/drawing/2014/chartex" xmlns:cx1="http://schemas.microsoft.com/office/drawing/2015/9/8/chartex" xmlns:cx2="http://schemas.microsoft.com/office/drawing/2015/10/21/chartex" xmlns:cx3="http://schemas.microsoft.com/office/drawing/2016/5/9/chartex" xmlns:cx4="http://schemas.microsoft.com/office/drawing/2016/5/10/chartex" xmlns:cx5="http://schemas.microsoft.com/office/drawing/2016/5/11/chartex" xmlns:cx6="http://schemas.microsoft.com/office/drawing/2016/5/12/chartex" xmlns:cx7="http://schemas.microsoft.com/office/drawing/2016/5/13/chartex" xmlns:cx8="http://schemas.microsoft.com/office/drawing/2016/5/14/chartex" xmlns:mc="http://schemas.openxmlformats.org/markup-compatibility/2006" xmlns:aink="http://schemas.microsoft.com/office/drawing/2016/ink" xmlns:am3d="http://schemas.microsoft.com/office/drawing/2017/model3d" xmlns:o="urn:schemas-microsoft-com:office:office" xmlns:oel="http://schemas.microsoft.com/office/2019/extlst" xmlns:r="http://schemas.openxmlformats.org/officeDocument/2006/relationships" xmlns:m="http://schemas.openxmlformats.org/officeDocument/2006/math" xmlns:v="urn:schemas-microsoft-com:vml" xmlns:wp14="http://schemas.microsoft.com/office/word/2010/wordprocessingDrawing" xmlns:wp="http://schemas.openxmlformats.org/drawingml/2006/wordprocessingDrawing" xmlns:w10="urn:schemas-microsoft-com:office:word" xmlns:w="http://schemas.openxmlformats.org/wordprocessingml/2006/main" xmlns:w14="http://schemas.microsoft.com/office/word/2010/wordml" xmlns:w15="http://schemas.microsoft.com/office/word/2012/wordml" xmlns:w16cex="http://schemas.microsoft.com/office/word/2018/wordml/cex" xmlns:w16cid="http://schemas.microsoft.com/office/word/2016/wordml/cid" xmlns:w16="http://schemas.microsoft.com/office/word/2018/wordml" xmlns:w16du="http://schemas.microsoft.com/office/word/2023/wordml/word16du" xmlns:w16sdtdh="http://schemas.microsoft.com/office/word/2020/wordml/sdtdatahash" xmlns:w16sdtfl="http://schemas.microsoft.com/office/word/2024/wordml/sdtformatlock" xmlns:w16se="http://schemas.microsoft.com/office/word/2015/wordml/symex" xmlns:wpg="http://schemas.microsoft.com/office/word/2010/wordprocessingGroup" xmlns:wpi="http://schemas.microsoft.com/office/word/2010/wordprocessingInk" xmlns:wne="http://schemas.microsoft.com/office/word/2006/wordml" xmlns:wps="http://schemas.microsoft.com/office/word/2010/wordprocessingShape" mc:Ignorable="w14 w15 w16se w16cid w16 w16cex w16sdtdh w16sdtfl w16du wp14">
   <w:docParts>
     <w:docPart>
       <w:docPartPr>
@@ -6497,13 +7253,20 @@
 </file>
 
 <file path=word/glossary/fontTable.xml><?xml version="1.0" encoding="utf-8"?>
-<w:fonts xmlns:mc="http://schemas.openxmlformats.org/markup-compatibility/2006" xmlns:r="http://schemas.openxmlformats.org/officeDocument/2006/relationships" xmlns:w="http://schemas.openxmlformats.org/wordprocessingml/2006/main" xmlns:w14="http://schemas.microsoft.com/office/word/2010/wordml" xmlns:w15="http://schemas.microsoft.com/office/word/2012/wordml" xmlns:w16se="http://schemas.microsoft.com/office/word/2015/wordml/symex" mc:Ignorable="w14 w15 w16se">
+<w:fonts xmlns:mc="http://schemas.openxmlformats.org/markup-compatibility/2006" xmlns:r="http://schemas.openxmlformats.org/officeDocument/2006/relationships" xmlns:w="http://schemas.openxmlformats.org/wordprocessingml/2006/main" xmlns:w14="http://schemas.microsoft.com/office/word/2010/wordml" xmlns:w15="http://schemas.microsoft.com/office/word/2012/wordml" xmlns:w16cex="http://schemas.microsoft.com/office/word/2018/wordml/cex" xmlns:w16cid="http://schemas.microsoft.com/office/word/2016/wordml/cid" xmlns:w16="http://schemas.microsoft.com/office/word/2018/wordml" xmlns:w16du="http://schemas.microsoft.com/office/word/2023/wordml/word16du" xmlns:w16sdtdh="http://schemas.microsoft.com/office/word/2020/wordml/sdtdatahash" xmlns:w16sdtfl="http://schemas.microsoft.com/office/word/2024/wordml/sdtformatlock" xmlns:w16se="http://schemas.microsoft.com/office/word/2015/wordml/symex" mc:Ignorable="w14 w15 w16se w16cid w16 w16cex w16sdtdh w16sdtfl w16du">
   <w:font w:name="Calibri">
     <w:panose1 w:val="020F0502020204030204"/>
     <w:charset w:val="00"/>
     <w:family w:val="swiss"/>
     <w:pitch w:val="variable"/>
-    <w:sig w:usb0="E0002AFF" w:usb1="C000247B" w:usb2="00000009" w:usb3="00000000" w:csb0="000001FF" w:csb1="00000000"/>
+    <w:sig w:usb0="E4002EFF" w:usb1="C200247B" w:usb2="00000009" w:usb3="00000000" w:csb0="000001FF" w:csb1="00000000"/>
+  </w:font>
+  <w:font w:name="Arial">
+    <w:panose1 w:val="020B0604020202020204"/>
+    <w:charset w:val="00"/>
+    <w:family w:val="swiss"/>
+    <w:pitch w:val="variable"/>
+    <w:sig w:usb0="E0002EFF" w:usb1="C000785B" w:usb2="00000009" w:usb3="00000000" w:csb0="000001FF" w:csb1="00000000"/>
   </w:font>
   <w:font w:name="Times New Roman">
     <w:panose1 w:val="02020603050405020304"/>
@@ -6519,25 +7282,54 @@
     <w:pitch w:val="variable"/>
     <w:sig w:usb0="E00006FF" w:usb1="420024FF" w:usb2="02000000" w:usb3="00000000" w:csb0="0000019F" w:csb1="00000000"/>
   </w:font>
+  <w:font w:name="SimSun">
+    <w:altName w:val="宋体"/>
+    <w:panose1 w:val="02010600030101010101"/>
+    <w:charset w:val="86"/>
+    <w:family w:val="auto"/>
+    <w:pitch w:val="variable"/>
+    <w:sig w:usb0="00000203" w:usb1="288F0000" w:usb2="00000016" w:usb3="00000000" w:csb0="00040001" w:csb1="00000000"/>
+  </w:font>
   <w:font w:name="Cambria">
     <w:panose1 w:val="02040503050406030204"/>
     <w:charset w:val="00"/>
     <w:family w:val="roman"/>
     <w:pitch w:val="variable"/>
-    <w:sig w:usb0="E00006FF" w:usb1="400004FF" w:usb2="00000000" w:usb3="00000000" w:csb0="0000019F" w:csb1="00000000"/>
+    <w:sig w:usb0="E00006FF" w:usb1="420024FF" w:usb2="02000000" w:usb3="00000000" w:csb0="0000019F" w:csb1="00000000"/>
   </w:font>
-  <w:font w:name="Calibri Light">
-    <w:panose1 w:val="020F0302020204030204"/>
+  <w:font w:name="Aptos">
     <w:charset w:val="00"/>
     <w:family w:val="swiss"/>
     <w:pitch w:val="variable"/>
-    <w:sig w:usb0="E0002AFF" w:usb1="C000247B" w:usb2="00000009" w:usb3="00000000" w:csb0="000001FF" w:csb1="00000000"/>
+    <w:sig w:usb0="20000287" w:usb1="00000003" w:usb2="00000000" w:usb3="00000000" w:csb0="0000019F" w:csb1="00000000"/>
+  </w:font>
+  <w:font w:name="DengXian">
+    <w:altName w:val="等线"/>
+    <w:panose1 w:val="02010600030101010101"/>
+    <w:charset w:val="86"/>
+    <w:family w:val="auto"/>
+    <w:pitch w:val="variable"/>
+    <w:sig w:usb0="A00002BF" w:usb1="38CF7CFA" w:usb2="00000016" w:usb3="00000000" w:csb0="0004000F" w:csb1="00000000"/>
+  </w:font>
+  <w:font w:name="DengXian Light">
+    <w:altName w:val="等线 Light"/>
+    <w:panose1 w:val="02010600030101010101"/>
+    <w:charset w:val="86"/>
+    <w:family w:val="auto"/>
+    <w:pitch w:val="variable"/>
+    <w:sig w:usb0="A00002BF" w:usb1="38CF7CFA" w:usb2="00000016" w:usb3="00000000" w:csb0="0004000F" w:csb1="00000000"/>
+  </w:font>
+  <w:font w:name="Aptos Display">
+    <w:charset w:val="00"/>
+    <w:family w:val="swiss"/>
+    <w:pitch w:val="variable"/>
+    <w:sig w:usb0="20000287" w:usb1="00000003" w:usb2="00000000" w:usb3="00000000" w:csb0="0000019F" w:csb1="00000000"/>
   </w:font>
 </w:fonts>
 </file>
 
 <file path=word/glossary/settings.xml><?xml version="1.0" encoding="utf-8"?>
-<w:settings xmlns:mc="http://schemas.openxmlformats.org/markup-compatibility/2006" xmlns:o="urn:schemas-microsoft-com:office:office" xmlns:r="http://schemas.openxmlformats.org/officeDocument/2006/relationships" xmlns:m="http://schemas.openxmlformats.org/officeDocument/2006/math" xmlns:v="urn:schemas-microsoft-com:vml" xmlns:w10="urn:schemas-microsoft-com:office:word" xmlns:w="http://schemas.openxmlformats.org/wordprocessingml/2006/main" xmlns:w14="http://schemas.microsoft.com/office/word/2010/wordml" xmlns:w15="http://schemas.microsoft.com/office/word/2012/wordml" xmlns:w16se="http://schemas.microsoft.com/office/word/2015/wordml/symex" xmlns:sl="http://schemas.openxmlformats.org/schemaLibrary/2006/main" mc:Ignorable="w14 w15 w16se">
+<w:settings xmlns:mc="http://schemas.openxmlformats.org/markup-compatibility/2006" xmlns:o="urn:schemas-microsoft-com:office:office" xmlns:r="http://schemas.openxmlformats.org/officeDocument/2006/relationships" xmlns:m="http://schemas.openxmlformats.org/officeDocument/2006/math" xmlns:v="urn:schemas-microsoft-com:vml" xmlns:w10="urn:schemas-microsoft-com:office:word" xmlns:w="http://schemas.openxmlformats.org/wordprocessingml/2006/main" xmlns:w14="http://schemas.microsoft.com/office/word/2010/wordml" xmlns:w15="http://schemas.microsoft.com/office/word/2012/wordml" xmlns:w16cex="http://schemas.microsoft.com/office/word/2018/wordml/cex" xmlns:w16cid="http://schemas.microsoft.com/office/word/2016/wordml/cid" xmlns:w16="http://schemas.microsoft.com/office/word/2018/wordml" xmlns:w16du="http://schemas.microsoft.com/office/word/2023/wordml/word16du" xmlns:w16sdtdh="http://schemas.microsoft.com/office/word/2020/wordml/sdtdatahash" xmlns:w16sdtfl="http://schemas.microsoft.com/office/word/2024/wordml/sdtformatlock" xmlns:w16se="http://schemas.microsoft.com/office/word/2015/wordml/symex" xmlns:sl="http://schemas.openxmlformats.org/schemaLibrary/2006/main" mc:Ignorable="w14 w15 w16se w16cid w16 w16cex w16sdtdh w16sdtfl w16du">
   <w:view w:val="normal"/>
   <w:defaultTabStop w:val="720"/>
   <w:characterSpacingControl w:val="doNotCompress"/>
@@ -6548,10 +7340,13 @@
     <w:compatSetting w:name="enableOpenTypeFeatures" w:uri="http://schemas.microsoft.com/office/word" w:val="1"/>
     <w:compatSetting w:name="doNotFlipMirrorIndents" w:uri="http://schemas.microsoft.com/office/word" w:val="1"/>
     <w:compatSetting w:name="differentiateMultirowTableHeaders" w:uri="http://schemas.microsoft.com/office/word" w:val="1"/>
+    <w:compatSetting w:name="useWord2013TrackBottomHyphenation" w:uri="http://schemas.microsoft.com/office/word" w:val="1"/>
   </w:compat>
   <w:rsids>
     <w:rsidRoot w:val="007976E5"/>
+    <w:rsid w:val="00215666"/>
     <w:rsid w:val="002D2E4F"/>
+    <w:rsid w:val="00341DC1"/>
     <w:rsid w:val="004101C9"/>
     <w:rsid w:val="004D26B7"/>
     <w:rsid w:val="00517FF2"/>
@@ -6559,8 +7354,11 @@
     <w:rsid w:val="00580B86"/>
     <w:rsid w:val="00621DA4"/>
     <w:rsid w:val="007976E5"/>
+    <w:rsid w:val="008E05F9"/>
+    <w:rsid w:val="00A81782"/>
     <w:rsid w:val="00CD193D"/>
     <w:rsid w:val="00E25128"/>
+    <w:rsid w:val="00F91ED3"/>
   </w:rsids>
   <m:mathPr>
     <m:mathFont m:val="Cambria Math"/>
@@ -6575,7 +7373,7 @@
     <m:intLim m:val="subSup"/>
     <m:naryLim m:val="undOvr"/>
   </m:mathPr>
-  <w:themeFontLang w:val="en-US"/>
+  <w:themeFontLang w:val="en-US" w:eastAsia="zh-CN" w:bidi="ar-SA"/>
   <w:clrSchemeMapping w:bg1="light1" w:t1="dark1" w:bg2="light2" w:t2="dark2" w:accent1="accent1" w:accent2="accent2" w:accent3="accent3" w:accent4="accent4" w:accent5="accent5" w:accent6="accent6" w:hyperlink="hyperlink" w:followedHyperlink="followedHyperlink"/>
   <w:decimalSymbol w:val="."/>
   <w:listSeparator w:val=","/>
@@ -6584,7 +7382,7 @@
 </file>
 
 <file path=word/glossary/styles.xml><?xml version="1.0" encoding="utf-8"?>
-<w:styles xmlns:mc="http://schemas.openxmlformats.org/markup-compatibility/2006" xmlns:r="http://schemas.openxmlformats.org/officeDocument/2006/relationships" xmlns:w="http://schemas.openxmlformats.org/wordprocessingml/2006/main" xmlns:w14="http://schemas.microsoft.com/office/word/2010/wordml" xmlns:w15="http://schemas.microsoft.com/office/word/2012/wordml" xmlns:w16se="http://schemas.microsoft.com/office/word/2015/wordml/symex" mc:Ignorable="w14 w15 w16se">
+<w:styles xmlns:mc="http://schemas.openxmlformats.org/markup-compatibility/2006" xmlns:r="http://schemas.openxmlformats.org/officeDocument/2006/relationships" xmlns:w="http://schemas.openxmlformats.org/wordprocessingml/2006/main" xmlns:w14="http://schemas.microsoft.com/office/word/2010/wordml" xmlns:w15="http://schemas.microsoft.com/office/word/2012/wordml" xmlns:w16cex="http://schemas.microsoft.com/office/word/2018/wordml/cex" xmlns:w16cid="http://schemas.microsoft.com/office/word/2016/wordml/cid" xmlns:w16="http://schemas.microsoft.com/office/word/2018/wordml" xmlns:w16du="http://schemas.microsoft.com/office/word/2023/wordml/word16du" xmlns:w16sdtdh="http://schemas.microsoft.com/office/word/2020/wordml/sdtdatahash" xmlns:w16sdtfl="http://schemas.microsoft.com/office/word/2024/wordml/sdtformatlock" xmlns:w16se="http://schemas.microsoft.com/office/word/2015/wordml/symex" mc:Ignorable="w14 w15 w16se w16cid w16 w16cex w16sdtdh w16sdtfl w16du">
   <w:docDefaults>
     <w:rPrDefault>
       <w:rPr>
@@ -6600,7 +7398,7 @@
       </w:pPr>
     </w:pPrDefault>
   </w:docDefaults>
-  <w:latentStyles w:defLockedState="0" w:defUIPriority="99" w:defSemiHidden="0" w:defUnhideWhenUsed="0" w:defQFormat="0" w:count="371">
+  <w:latentStyles w:defLockedState="0" w:defUIPriority="99" w:defSemiHidden="0" w:defUnhideWhenUsed="0" w:defQFormat="0" w:count="376">
     <w:lsdException w:name="Normal" w:uiPriority="0" w:qFormat="1"/>
     <w:lsdException w:name="heading 1" w:uiPriority="9" w:qFormat="1"/>
     <w:lsdException w:name="heading 2" w:semiHidden="1" w:uiPriority="9" w:unhideWhenUsed="1" w:qFormat="1"/>
@@ -6972,6 +7770,11 @@
     <w:lsdException w:name="List Table 5 Dark Accent 6" w:uiPriority="50"/>
     <w:lsdException w:name="List Table 6 Colorful Accent 6" w:uiPriority="51"/>
     <w:lsdException w:name="List Table 7 Colorful Accent 6" w:uiPriority="52"/>
+    <w:lsdException w:name="Mention" w:semiHidden="1" w:unhideWhenUsed="1"/>
+    <w:lsdException w:name="Smart Hyperlink" w:semiHidden="1" w:unhideWhenUsed="1"/>
+    <w:lsdException w:name="Hashtag" w:semiHidden="1" w:unhideWhenUsed="1"/>
+    <w:lsdException w:name="Unresolved Mention" w:semiHidden="1" w:unhideWhenUsed="1"/>
+    <w:lsdException w:name="Smart Link" w:semiHidden="1" w:unhideWhenUsed="1"/>
   </w:latentStyles>
   <w:style w:type="paragraph" w:default="1" w:styleId="Normal">
     <w:name w:val="Normal"/>
@@ -7009,7 +7812,7 @@
     <w:basedOn w:val="DefaultParagraphFont"/>
     <w:uiPriority w:val="99"/>
     <w:semiHidden/>
-    <w:rsid w:val="007976E5"/>
+    <w:rsid w:val="008E05F9"/>
     <w:rPr>
       <w:color w:val="808080"/>
     </w:rPr>
@@ -7018,7 +7821,7 @@
 </file>
 
 <file path=word/glossary/webSettings.xml><?xml version="1.0" encoding="utf-8"?>
-<w:webSettings xmlns:mc="http://schemas.openxmlformats.org/markup-compatibility/2006" xmlns:r="http://schemas.openxmlformats.org/officeDocument/2006/relationships" xmlns:w="http://schemas.openxmlformats.org/wordprocessingml/2006/main" xmlns:w14="http://schemas.microsoft.com/office/word/2010/wordml" xmlns:w15="http://schemas.microsoft.com/office/word/2012/wordml" xmlns:w16se="http://schemas.microsoft.com/office/word/2015/wordml/symex" mc:Ignorable="w14 w15 w16se">
+<w:webSettings xmlns:mc="http://schemas.openxmlformats.org/markup-compatibility/2006" xmlns:r="http://schemas.openxmlformats.org/officeDocument/2006/relationships" xmlns:w="http://schemas.openxmlformats.org/wordprocessingml/2006/main" xmlns:w14="http://schemas.microsoft.com/office/word/2010/wordml" xmlns:w15="http://schemas.microsoft.com/office/word/2012/wordml" xmlns:w16cex="http://schemas.microsoft.com/office/word/2018/wordml/cex" xmlns:w16cid="http://schemas.microsoft.com/office/word/2016/wordml/cid" xmlns:w16="http://schemas.microsoft.com/office/word/2018/wordml" xmlns:w16du="http://schemas.microsoft.com/office/word/2023/wordml/word16du" xmlns:w16sdtdh="http://schemas.microsoft.com/office/word/2020/wordml/sdtdatahash" xmlns:w16sdtfl="http://schemas.microsoft.com/office/word/2024/wordml/sdtformatlock" xmlns:w16se="http://schemas.microsoft.com/office/word/2015/wordml/symex" mc:Ignorable="w14 w15 w16se w16cid w16 w16cex w16sdtdh w16sdtfl w16du">
   <w:optimizeForBrowser/>
   <w:allowPNG/>
 </w:webSettings>

</xml_diff>